<commit_message>
UPDATE: отчет и блоксхема DATE: 2026-09-17 18:21:39
</commit_message>
<xml_diff>
--- a/Учеба 4 семестр/ОСИ/1 ЛАБ/Отчет.docx
+++ b/Учеба 4 семестр/ОСИ/1 ЛАБ/Отчет.docx
@@ -1103,6 +1103,33 @@
           <w:szCs w:val="32"/>
         </w:rPr>
         <w:t xml:space="preserve">Ход работы </w:t>
+      </w:r>
+    </w:p>
+    <w:p>
+      <w:pPr>
+        <w:pStyle w:val="ac"/>
+        <w:numPr>
+          <w:ilvl w:val="1"/>
+          <w:numId w:val="2"/>
+        </w:numPr>
+        <w:spacing w:before="183" w:line="309" w:lineRule="auto"/>
+        <w:ind w:right="163"/>
+        <w:jc w:val="both"/>
+        <w:rPr>
+          <w:b/>
+          <w:bCs/>
+          <w:sz w:val="32"/>
+          <w:szCs w:val="32"/>
+        </w:rPr>
+      </w:pPr>
+      <w:r>
+        <w:rPr>
+          <w:b/>
+          <w:bCs/>
+          <w:sz w:val="32"/>
+          <w:szCs w:val="32"/>
+        </w:rPr>
+        <w:t xml:space="preserve"> Загрузчик</w:t>
       </w:r>
     </w:p>
     <w:p>
@@ -1264,124 +1291,1135 @@
         <w:jc w:val="center"/>
       </w:pPr>
       <w:r>
+        <w:lastRenderedPageBreak/>
         <w:t>Рисунок 1. Успешная сборка минимального загрузчика</w:t>
       </w:r>
     </w:p>
+    <w:tbl>
+      <w:tblPr>
+        <w:tblW w:w="9026" w:type="dxa"/>
+        <w:tblBorders>
+          <w:top w:val="single" w:sz="4" w:space="0" w:color="auto"/>
+          <w:left w:val="single" w:sz="4" w:space="0" w:color="auto"/>
+          <w:bottom w:val="single" w:sz="4" w:space="0" w:color="auto"/>
+          <w:right w:val="single" w:sz="4" w:space="0" w:color="auto"/>
+          <w:insideH w:val="single" w:sz="4" w:space="0" w:color="auto"/>
+          <w:insideV w:val="single" w:sz="4" w:space="0" w:color="auto"/>
+        </w:tblBorders>
+        <w:tblCellMar>
+          <w:left w:w="10" w:type="dxa"/>
+          <w:right w:w="10" w:type="dxa"/>
+        </w:tblCellMar>
+        <w:tblLook w:val="04A0" w:firstRow="1" w:lastRow="0" w:firstColumn="1" w:lastColumn="0" w:noHBand="0" w:noVBand="1"/>
+      </w:tblPr>
+      <w:tblGrid>
+        <w:gridCol w:w="3225"/>
+        <w:gridCol w:w="5801"/>
+      </w:tblGrid>
+      <w:tr>
+        <w:trPr>
+          <w:tblHeader/>
+        </w:trPr>
+        <w:tc>
+          <w:tcPr>
+            <w:tcW w:w="3225" w:type="dxa"/>
+            <w:tcBorders>
+              <w:top w:val="single" w:sz="4" w:space="0" w:color="999999"/>
+              <w:left w:val="single" w:sz="4" w:space="0" w:color="999999"/>
+              <w:bottom w:val="single" w:sz="4" w:space="0" w:color="999999"/>
+              <w:right w:val="single" w:sz="4" w:space="0" w:color="999999"/>
+            </w:tcBorders>
+            <w:shd w:val="clear" w:color="auto" w:fill="D9D9D9"/>
+            <w:tcMar>
+              <w:top w:w="80" w:type="dxa"/>
+              <w:left w:w="100" w:type="dxa"/>
+              <w:bottom w:w="80" w:type="dxa"/>
+              <w:right w:w="100" w:type="dxa"/>
+            </w:tcMar>
+            <w:vAlign w:val="center"/>
+            <w:hideMark/>
+          </w:tcPr>
+          <w:p>
+            <w:pPr>
+              <w:pStyle w:val="ac"/>
+              <w:spacing w:before="183" w:line="309" w:lineRule="auto"/>
+              <w:ind w:right="163"/>
+            </w:pPr>
+            <w:r>
+              <w:rPr>
+                <w:b/>
+                <w:bCs/>
+              </w:rPr>
+              <w:t>Функция / метка</w:t>
+            </w:r>
+          </w:p>
+        </w:tc>
+        <w:tc>
+          <w:tcPr>
+            <w:tcW w:w="5801" w:type="dxa"/>
+            <w:tcBorders>
+              <w:top w:val="single" w:sz="4" w:space="0" w:color="999999"/>
+              <w:left w:val="single" w:sz="4" w:space="0" w:color="999999"/>
+              <w:bottom w:val="single" w:sz="4" w:space="0" w:color="999999"/>
+              <w:right w:val="single" w:sz="4" w:space="0" w:color="999999"/>
+            </w:tcBorders>
+            <w:shd w:val="clear" w:color="auto" w:fill="D9D9D9"/>
+            <w:tcMar>
+              <w:top w:w="80" w:type="dxa"/>
+              <w:left w:w="100" w:type="dxa"/>
+              <w:bottom w:w="80" w:type="dxa"/>
+              <w:right w:w="100" w:type="dxa"/>
+            </w:tcMar>
+            <w:vAlign w:val="center"/>
+            <w:hideMark/>
+          </w:tcPr>
+          <w:p>
+            <w:pPr>
+              <w:pStyle w:val="ac"/>
+              <w:spacing w:before="183" w:line="309" w:lineRule="auto"/>
+              <w:ind w:right="163"/>
+            </w:pPr>
+            <w:r>
+              <w:rPr>
+                <w:b/>
+                <w:bCs/>
+              </w:rPr>
+              <w:t>Описание</w:t>
+            </w:r>
+          </w:p>
+        </w:tc>
+      </w:tr>
+      <w:tr>
+        <w:tc>
+          <w:tcPr>
+            <w:tcW w:w="3225" w:type="dxa"/>
+            <w:tcBorders>
+              <w:top w:val="single" w:sz="4" w:space="0" w:color="999999"/>
+              <w:left w:val="single" w:sz="4" w:space="0" w:color="999999"/>
+              <w:bottom w:val="single" w:sz="4" w:space="0" w:color="999999"/>
+              <w:right w:val="single" w:sz="4" w:space="0" w:color="999999"/>
+            </w:tcBorders>
+            <w:tcMar>
+              <w:top w:w="60" w:type="dxa"/>
+              <w:left w:w="100" w:type="dxa"/>
+              <w:bottom w:w="60" w:type="dxa"/>
+              <w:right w:w="100" w:type="dxa"/>
+            </w:tcMar>
+            <w:vAlign w:val="center"/>
+            <w:hideMark/>
+          </w:tcPr>
+          <w:p>
+            <w:pPr>
+              <w:pStyle w:val="ac"/>
+              <w:spacing w:before="183" w:line="309" w:lineRule="auto"/>
+              <w:ind w:right="163"/>
+            </w:pPr>
+            <w:r>
+              <w:t>S</w:t>
+            </w:r>
+            <w:r>
+              <w:t>tart</w:t>
+            </w:r>
+          </w:p>
+        </w:tc>
+        <w:tc>
+          <w:tcPr>
+            <w:tcW w:w="5801" w:type="dxa"/>
+            <w:tcBorders>
+              <w:top w:val="single" w:sz="4" w:space="0" w:color="999999"/>
+              <w:left w:val="single" w:sz="4" w:space="0" w:color="999999"/>
+              <w:bottom w:val="single" w:sz="4" w:space="0" w:color="999999"/>
+              <w:right w:val="single" w:sz="4" w:space="0" w:color="999999"/>
+            </w:tcBorders>
+            <w:tcMar>
+              <w:top w:w="60" w:type="dxa"/>
+              <w:left w:w="100" w:type="dxa"/>
+              <w:bottom w:w="60" w:type="dxa"/>
+              <w:right w:w="100" w:type="dxa"/>
+            </w:tcMar>
+            <w:vAlign w:val="center"/>
+            <w:hideMark/>
+          </w:tcPr>
+          <w:p>
+            <w:pPr>
+              <w:pStyle w:val="ac"/>
+              <w:spacing w:before="183" w:line="309" w:lineRule="auto"/>
+              <w:ind w:right="163"/>
+            </w:pPr>
+            <w:r>
+              <w:t>Точка входа загрузчика. Настраивает DS, SS, SP; выводит приветствие, алфавит и инструкцию; передаёт управление в цикл ввода.</w:t>
+            </w:r>
+          </w:p>
+        </w:tc>
+      </w:tr>
+      <w:tr>
+        <w:tc>
+          <w:tcPr>
+            <w:tcW w:w="3225" w:type="dxa"/>
+            <w:tcBorders>
+              <w:top w:val="single" w:sz="4" w:space="0" w:color="999999"/>
+              <w:left w:val="single" w:sz="4" w:space="0" w:color="999999"/>
+              <w:bottom w:val="single" w:sz="4" w:space="0" w:color="999999"/>
+              <w:right w:val="single" w:sz="4" w:space="0" w:color="999999"/>
+            </w:tcBorders>
+            <w:tcMar>
+              <w:top w:w="60" w:type="dxa"/>
+              <w:left w:w="100" w:type="dxa"/>
+              <w:bottom w:w="60" w:type="dxa"/>
+              <w:right w:w="100" w:type="dxa"/>
+            </w:tcMar>
+            <w:vAlign w:val="center"/>
+            <w:hideMark/>
+          </w:tcPr>
+          <w:p>
+            <w:pPr>
+              <w:pStyle w:val="ac"/>
+              <w:spacing w:before="183" w:line="309" w:lineRule="auto"/>
+              <w:ind w:right="163"/>
+            </w:pPr>
+            <w:proofErr w:type="spellStart"/>
+            <w:r>
+              <w:t>input_symbol_loop</w:t>
+            </w:r>
+            <w:proofErr w:type="spellEnd"/>
+          </w:p>
+        </w:tc>
+        <w:tc>
+          <w:tcPr>
+            <w:tcW w:w="5801" w:type="dxa"/>
+            <w:tcBorders>
+              <w:top w:val="single" w:sz="4" w:space="0" w:color="999999"/>
+              <w:left w:val="single" w:sz="4" w:space="0" w:color="999999"/>
+              <w:bottom w:val="single" w:sz="4" w:space="0" w:color="999999"/>
+              <w:right w:val="single" w:sz="4" w:space="0" w:color="999999"/>
+            </w:tcBorders>
+            <w:tcMar>
+              <w:top w:w="60" w:type="dxa"/>
+              <w:left w:w="100" w:type="dxa"/>
+              <w:bottom w:w="60" w:type="dxa"/>
+              <w:right w:w="100" w:type="dxa"/>
+            </w:tcMar>
+            <w:vAlign w:val="center"/>
+            <w:hideMark/>
+          </w:tcPr>
+          <w:p>
+            <w:pPr>
+              <w:pStyle w:val="ac"/>
+              <w:spacing w:before="183" w:line="309" w:lineRule="auto"/>
+              <w:ind w:right="163"/>
+            </w:pPr>
+            <w:r>
+              <w:t xml:space="preserve">Главный цикл ввода. Считывает клавишу через </w:t>
+            </w:r>
+            <w:proofErr w:type="spellStart"/>
+            <w:r>
+              <w:t>int</w:t>
+            </w:r>
+            <w:proofErr w:type="spellEnd"/>
+            <w:r>
+              <w:t xml:space="preserve"> 16h, отличает Enter от буквы, приводит заглавные буквы к строчным, обновляет флаг выбора нужной буквы в массиве </w:t>
+            </w:r>
+            <w:proofErr w:type="spellStart"/>
+            <w:r>
+              <w:t>turn_symbol_array</w:t>
+            </w:r>
+            <w:proofErr w:type="spellEnd"/>
+            <w:r>
+              <w:t xml:space="preserve"> и вызывает перерисовку строки состояния.</w:t>
+            </w:r>
+          </w:p>
+        </w:tc>
+      </w:tr>
+      <w:tr>
+        <w:tc>
+          <w:tcPr>
+            <w:tcW w:w="3225" w:type="dxa"/>
+            <w:tcBorders>
+              <w:top w:val="single" w:sz="4" w:space="0" w:color="999999"/>
+              <w:left w:val="single" w:sz="4" w:space="0" w:color="999999"/>
+              <w:bottom w:val="single" w:sz="4" w:space="0" w:color="999999"/>
+              <w:right w:val="single" w:sz="4" w:space="0" w:color="999999"/>
+            </w:tcBorders>
+            <w:tcMar>
+              <w:top w:w="60" w:type="dxa"/>
+              <w:left w:w="100" w:type="dxa"/>
+              <w:bottom w:w="60" w:type="dxa"/>
+              <w:right w:w="100" w:type="dxa"/>
+            </w:tcMar>
+            <w:vAlign w:val="center"/>
+            <w:hideMark/>
+          </w:tcPr>
+          <w:p>
+            <w:pPr>
+              <w:pStyle w:val="ac"/>
+              <w:spacing w:before="183" w:line="309" w:lineRule="auto"/>
+              <w:ind w:right="163"/>
+            </w:pPr>
+            <w:proofErr w:type="spellStart"/>
+            <w:r>
+              <w:t>not_a_symbol</w:t>
+            </w:r>
+            <w:proofErr w:type="spellEnd"/>
+          </w:p>
+        </w:tc>
+        <w:tc>
+          <w:tcPr>
+            <w:tcW w:w="5801" w:type="dxa"/>
+            <w:tcBorders>
+              <w:top w:val="single" w:sz="4" w:space="0" w:color="999999"/>
+              <w:left w:val="single" w:sz="4" w:space="0" w:color="999999"/>
+              <w:bottom w:val="single" w:sz="4" w:space="0" w:color="999999"/>
+              <w:right w:val="single" w:sz="4" w:space="0" w:color="999999"/>
+            </w:tcBorders>
+            <w:tcMar>
+              <w:top w:w="60" w:type="dxa"/>
+              <w:left w:w="100" w:type="dxa"/>
+              <w:bottom w:w="60" w:type="dxa"/>
+              <w:right w:w="100" w:type="dxa"/>
+            </w:tcMar>
+            <w:vAlign w:val="center"/>
+            <w:hideMark/>
+          </w:tcPr>
+          <w:p>
+            <w:pPr>
+              <w:pStyle w:val="ac"/>
+              <w:spacing w:before="183" w:line="309" w:lineRule="auto"/>
+              <w:ind w:right="163"/>
+            </w:pPr>
+            <w:r>
+              <w:t xml:space="preserve">Обработчик недопустимого символа (не буква и не Enter). Выводит сообщение </w:t>
+            </w:r>
+            <w:proofErr w:type="spellStart"/>
+            <w:r>
+              <w:t>Wrong</w:t>
+            </w:r>
+            <w:proofErr w:type="spellEnd"/>
+            <w:r>
+              <w:t xml:space="preserve"> </w:t>
+            </w:r>
+            <w:proofErr w:type="spellStart"/>
+            <w:r>
+              <w:t>key</w:t>
+            </w:r>
+            <w:proofErr w:type="spellEnd"/>
+            <w:r>
+              <w:t xml:space="preserve"> и возвращает управление в </w:t>
+            </w:r>
+            <w:proofErr w:type="spellStart"/>
+            <w:r>
+              <w:t>input_symbol_loop</w:t>
+            </w:r>
+            <w:proofErr w:type="spellEnd"/>
+            <w:r>
+              <w:t>.</w:t>
+            </w:r>
+          </w:p>
+        </w:tc>
+      </w:tr>
+      <w:tr>
+        <w:tc>
+          <w:tcPr>
+            <w:tcW w:w="3225" w:type="dxa"/>
+            <w:tcBorders>
+              <w:top w:val="single" w:sz="4" w:space="0" w:color="999999"/>
+              <w:left w:val="single" w:sz="4" w:space="0" w:color="999999"/>
+              <w:bottom w:val="single" w:sz="4" w:space="0" w:color="999999"/>
+              <w:right w:val="single" w:sz="4" w:space="0" w:color="999999"/>
+            </w:tcBorders>
+            <w:tcMar>
+              <w:top w:w="60" w:type="dxa"/>
+              <w:left w:w="100" w:type="dxa"/>
+              <w:bottom w:w="60" w:type="dxa"/>
+              <w:right w:w="100" w:type="dxa"/>
+            </w:tcMar>
+            <w:vAlign w:val="center"/>
+            <w:hideMark/>
+          </w:tcPr>
+          <w:p>
+            <w:pPr>
+              <w:pStyle w:val="ac"/>
+              <w:spacing w:before="183" w:line="309" w:lineRule="auto"/>
+              <w:ind w:right="163"/>
+            </w:pPr>
+            <w:proofErr w:type="spellStart"/>
+            <w:r>
+              <w:t>update_selected_symbols</w:t>
+            </w:r>
+            <w:proofErr w:type="spellEnd"/>
+            <w:r>
+              <w:t xml:space="preserve"> *</w:t>
+            </w:r>
+          </w:p>
+        </w:tc>
+        <w:tc>
+          <w:tcPr>
+            <w:tcW w:w="5801" w:type="dxa"/>
+            <w:tcBorders>
+              <w:top w:val="single" w:sz="4" w:space="0" w:color="999999"/>
+              <w:left w:val="single" w:sz="4" w:space="0" w:color="999999"/>
+              <w:bottom w:val="single" w:sz="4" w:space="0" w:color="999999"/>
+              <w:right w:val="single" w:sz="4" w:space="0" w:color="999999"/>
+            </w:tcBorders>
+            <w:tcMar>
+              <w:top w:w="60" w:type="dxa"/>
+              <w:left w:w="100" w:type="dxa"/>
+              <w:bottom w:w="60" w:type="dxa"/>
+              <w:right w:w="100" w:type="dxa"/>
+            </w:tcMar>
+            <w:vAlign w:val="center"/>
+            <w:hideMark/>
+          </w:tcPr>
+          <w:p>
+            <w:pPr>
+              <w:pStyle w:val="ac"/>
+              <w:spacing w:before="183" w:line="309" w:lineRule="auto"/>
+              <w:ind w:right="163"/>
+            </w:pPr>
+            <w:r>
+              <w:t>Перерисовывает строку из 26 позиций: выбранные буквы печатает в зафиксированном регистре, невыбранные заменяет на «_».</w:t>
+            </w:r>
+          </w:p>
+        </w:tc>
+      </w:tr>
+      <w:tr>
+        <w:tc>
+          <w:tcPr>
+            <w:tcW w:w="3225" w:type="dxa"/>
+            <w:tcBorders>
+              <w:top w:val="single" w:sz="4" w:space="0" w:color="999999"/>
+              <w:left w:val="single" w:sz="4" w:space="0" w:color="999999"/>
+              <w:bottom w:val="single" w:sz="4" w:space="0" w:color="999999"/>
+              <w:right w:val="single" w:sz="4" w:space="0" w:color="999999"/>
+            </w:tcBorders>
+            <w:tcMar>
+              <w:top w:w="60" w:type="dxa"/>
+              <w:left w:w="100" w:type="dxa"/>
+              <w:bottom w:w="60" w:type="dxa"/>
+              <w:right w:w="100" w:type="dxa"/>
+            </w:tcMar>
+            <w:vAlign w:val="center"/>
+            <w:hideMark/>
+          </w:tcPr>
+          <w:p>
+            <w:pPr>
+              <w:pStyle w:val="ac"/>
+              <w:spacing w:before="183" w:line="309" w:lineRule="auto"/>
+              <w:ind w:right="163"/>
+            </w:pPr>
+            <w:proofErr w:type="spellStart"/>
+            <w:r>
+              <w:t>D</w:t>
+            </w:r>
+            <w:r>
+              <w:t>one</w:t>
+            </w:r>
+            <w:proofErr w:type="spellEnd"/>
+          </w:p>
+        </w:tc>
+        <w:tc>
+          <w:tcPr>
+            <w:tcW w:w="5801" w:type="dxa"/>
+            <w:tcBorders>
+              <w:top w:val="single" w:sz="4" w:space="0" w:color="999999"/>
+              <w:left w:val="single" w:sz="4" w:space="0" w:color="999999"/>
+              <w:bottom w:val="single" w:sz="4" w:space="0" w:color="999999"/>
+              <w:right w:val="single" w:sz="4" w:space="0" w:color="999999"/>
+            </w:tcBorders>
+            <w:tcMar>
+              <w:top w:w="60" w:type="dxa"/>
+              <w:left w:w="100" w:type="dxa"/>
+              <w:bottom w:w="60" w:type="dxa"/>
+              <w:right w:w="100" w:type="dxa"/>
+            </w:tcMar>
+            <w:vAlign w:val="center"/>
+            <w:hideMark/>
+          </w:tcPr>
+          <w:p>
+            <w:pPr>
+              <w:pStyle w:val="ac"/>
+              <w:spacing w:before="183" w:line="309" w:lineRule="auto"/>
+              <w:ind w:right="163"/>
+            </w:pPr>
+            <w:r>
+              <w:t xml:space="preserve">Завершение этапа выбора (по Enter). Копирует 26 флагов «выбрана / не выбрана» из </w:t>
+            </w:r>
+            <w:proofErr w:type="spellStart"/>
+            <w:r>
+              <w:t>turn_symbol_array</w:t>
+            </w:r>
+            <w:proofErr w:type="spellEnd"/>
+            <w:r>
+              <w:t xml:space="preserve"> в память 0x9000 и вызывает </w:t>
+            </w:r>
+            <w:proofErr w:type="spellStart"/>
+            <w:r>
+              <w:t>run_kernel</w:t>
+            </w:r>
+            <w:proofErr w:type="spellEnd"/>
+            <w:r>
+              <w:t>.</w:t>
+            </w:r>
+          </w:p>
+        </w:tc>
+      </w:tr>
+      <w:tr>
+        <w:tc>
+          <w:tcPr>
+            <w:tcW w:w="3225" w:type="dxa"/>
+            <w:tcBorders>
+              <w:top w:val="single" w:sz="4" w:space="0" w:color="999999"/>
+              <w:left w:val="single" w:sz="4" w:space="0" w:color="999999"/>
+              <w:bottom w:val="single" w:sz="4" w:space="0" w:color="999999"/>
+              <w:right w:val="single" w:sz="4" w:space="0" w:color="999999"/>
+            </w:tcBorders>
+            <w:tcMar>
+              <w:top w:w="60" w:type="dxa"/>
+              <w:left w:w="100" w:type="dxa"/>
+              <w:bottom w:w="60" w:type="dxa"/>
+              <w:right w:w="100" w:type="dxa"/>
+            </w:tcMar>
+            <w:vAlign w:val="center"/>
+            <w:hideMark/>
+          </w:tcPr>
+          <w:p>
+            <w:pPr>
+              <w:pStyle w:val="ac"/>
+              <w:spacing w:before="183" w:line="309" w:lineRule="auto"/>
+              <w:ind w:right="163"/>
+            </w:pPr>
+            <w:proofErr w:type="spellStart"/>
+            <w:r>
+              <w:t>run_kernel</w:t>
+            </w:r>
+            <w:proofErr w:type="spellEnd"/>
+          </w:p>
+        </w:tc>
+        <w:tc>
+          <w:tcPr>
+            <w:tcW w:w="5801" w:type="dxa"/>
+            <w:tcBorders>
+              <w:top w:val="single" w:sz="4" w:space="0" w:color="999999"/>
+              <w:left w:val="single" w:sz="4" w:space="0" w:color="999999"/>
+              <w:bottom w:val="single" w:sz="4" w:space="0" w:color="999999"/>
+              <w:right w:val="single" w:sz="4" w:space="0" w:color="999999"/>
+            </w:tcBorders>
+            <w:tcMar>
+              <w:top w:w="60" w:type="dxa"/>
+              <w:left w:w="100" w:type="dxa"/>
+              <w:bottom w:w="60" w:type="dxa"/>
+              <w:right w:w="100" w:type="dxa"/>
+            </w:tcMar>
+            <w:vAlign w:val="center"/>
+            <w:hideMark/>
+          </w:tcPr>
+          <w:p>
+            <w:pPr>
+              <w:pStyle w:val="ac"/>
+              <w:spacing w:before="183" w:line="309" w:lineRule="auto"/>
+              <w:ind w:right="163"/>
+            </w:pPr>
+            <w:r>
+              <w:t>Читает 44 сектора со второго диска (</w:t>
+            </w:r>
+            <w:proofErr w:type="spellStart"/>
+            <w:r>
+              <w:t>dl</w:t>
+            </w:r>
+            <w:proofErr w:type="spellEnd"/>
+            <w:r>
+              <w:t xml:space="preserve">=1) через </w:t>
+            </w:r>
+            <w:proofErr w:type="spellStart"/>
+            <w:r>
+              <w:t>int</w:t>
+            </w:r>
+            <w:proofErr w:type="spellEnd"/>
+            <w:r>
+              <w:t xml:space="preserve"> 13h в память 0x10000; при ошибке чтения передаёт управление в </w:t>
+            </w:r>
+            <w:proofErr w:type="spellStart"/>
+            <w:r>
+              <w:t>disk_error</w:t>
+            </w:r>
+            <w:proofErr w:type="spellEnd"/>
+            <w:r>
+              <w:t>.</w:t>
+            </w:r>
+          </w:p>
+        </w:tc>
+      </w:tr>
+      <w:tr>
+        <w:tc>
+          <w:tcPr>
+            <w:tcW w:w="3225" w:type="dxa"/>
+            <w:tcBorders>
+              <w:top w:val="single" w:sz="4" w:space="0" w:color="999999"/>
+              <w:left w:val="single" w:sz="4" w:space="0" w:color="999999"/>
+              <w:bottom w:val="single" w:sz="4" w:space="0" w:color="999999"/>
+              <w:right w:val="single" w:sz="4" w:space="0" w:color="999999"/>
+            </w:tcBorders>
+            <w:tcMar>
+              <w:top w:w="60" w:type="dxa"/>
+              <w:left w:w="100" w:type="dxa"/>
+              <w:bottom w:w="60" w:type="dxa"/>
+              <w:right w:w="100" w:type="dxa"/>
+            </w:tcMar>
+            <w:vAlign w:val="center"/>
+            <w:hideMark/>
+          </w:tcPr>
+          <w:p>
+            <w:pPr>
+              <w:pStyle w:val="ac"/>
+              <w:spacing w:before="183" w:line="309" w:lineRule="auto"/>
+              <w:ind w:right="163"/>
+            </w:pPr>
+            <w:proofErr w:type="spellStart"/>
+            <w:r>
+              <w:t>disk_error</w:t>
+            </w:r>
+            <w:proofErr w:type="spellEnd"/>
+          </w:p>
+        </w:tc>
+        <w:tc>
+          <w:tcPr>
+            <w:tcW w:w="5801" w:type="dxa"/>
+            <w:tcBorders>
+              <w:top w:val="single" w:sz="4" w:space="0" w:color="999999"/>
+              <w:left w:val="single" w:sz="4" w:space="0" w:color="999999"/>
+              <w:bottom w:val="single" w:sz="4" w:space="0" w:color="999999"/>
+              <w:right w:val="single" w:sz="4" w:space="0" w:color="999999"/>
+            </w:tcBorders>
+            <w:tcMar>
+              <w:top w:w="60" w:type="dxa"/>
+              <w:left w:w="100" w:type="dxa"/>
+              <w:bottom w:w="60" w:type="dxa"/>
+              <w:right w:w="100" w:type="dxa"/>
+            </w:tcMar>
+            <w:vAlign w:val="center"/>
+            <w:hideMark/>
+          </w:tcPr>
+          <w:p>
+            <w:pPr>
+              <w:pStyle w:val="ac"/>
+              <w:spacing w:before="183" w:line="309" w:lineRule="auto"/>
+              <w:ind w:right="163"/>
+            </w:pPr>
+            <w:r>
+              <w:t xml:space="preserve">Выводит сообщение Disk </w:t>
+            </w:r>
+            <w:proofErr w:type="spellStart"/>
+            <w:r>
+              <w:t>error</w:t>
+            </w:r>
+            <w:proofErr w:type="spellEnd"/>
+            <w:r>
+              <w:t xml:space="preserve"> и </w:t>
+            </w:r>
+            <w:r>
+              <w:lastRenderedPageBreak/>
+              <w:t>останавливает выполнение (</w:t>
+            </w:r>
+            <w:proofErr w:type="spellStart"/>
+            <w:r>
+              <w:t>jmp</w:t>
+            </w:r>
+            <w:proofErr w:type="spellEnd"/>
+            <w:r>
+              <w:t xml:space="preserve"> $).</w:t>
+            </w:r>
+          </w:p>
+        </w:tc>
+      </w:tr>
+      <w:tr>
+        <w:tc>
+          <w:tcPr>
+            <w:tcW w:w="3225" w:type="dxa"/>
+            <w:tcBorders>
+              <w:top w:val="single" w:sz="4" w:space="0" w:color="999999"/>
+              <w:left w:val="single" w:sz="4" w:space="0" w:color="999999"/>
+              <w:bottom w:val="single" w:sz="4" w:space="0" w:color="999999"/>
+              <w:right w:val="single" w:sz="4" w:space="0" w:color="999999"/>
+            </w:tcBorders>
+            <w:tcMar>
+              <w:top w:w="60" w:type="dxa"/>
+              <w:left w:w="100" w:type="dxa"/>
+              <w:bottom w:w="60" w:type="dxa"/>
+              <w:right w:w="100" w:type="dxa"/>
+            </w:tcMar>
+            <w:vAlign w:val="center"/>
+            <w:hideMark/>
+          </w:tcPr>
+          <w:p>
+            <w:pPr>
+              <w:pStyle w:val="ac"/>
+              <w:spacing w:before="183" w:line="309" w:lineRule="auto"/>
+              <w:ind w:right="163"/>
+            </w:pPr>
+            <w:proofErr w:type="spellStart"/>
+            <w:r>
+              <w:lastRenderedPageBreak/>
+              <w:t>turn_protect_mode</w:t>
+            </w:r>
+            <w:proofErr w:type="spellEnd"/>
+          </w:p>
+        </w:tc>
+        <w:tc>
+          <w:tcPr>
+            <w:tcW w:w="5801" w:type="dxa"/>
+            <w:tcBorders>
+              <w:top w:val="single" w:sz="4" w:space="0" w:color="999999"/>
+              <w:left w:val="single" w:sz="4" w:space="0" w:color="999999"/>
+              <w:bottom w:val="single" w:sz="4" w:space="0" w:color="999999"/>
+              <w:right w:val="single" w:sz="4" w:space="0" w:color="999999"/>
+            </w:tcBorders>
+            <w:tcMar>
+              <w:top w:w="60" w:type="dxa"/>
+              <w:left w:w="100" w:type="dxa"/>
+              <w:bottom w:w="60" w:type="dxa"/>
+              <w:right w:w="100" w:type="dxa"/>
+            </w:tcMar>
+            <w:vAlign w:val="center"/>
+            <w:hideMark/>
+          </w:tcPr>
+          <w:p>
+            <w:pPr>
+              <w:pStyle w:val="ac"/>
+              <w:spacing w:before="183" w:line="309" w:lineRule="auto"/>
+              <w:ind w:right="163"/>
+            </w:pPr>
+            <w:r>
+              <w:t>Отключает прерывания (</w:t>
+            </w:r>
+            <w:proofErr w:type="spellStart"/>
+            <w:r>
+              <w:t>cli</w:t>
+            </w:r>
+            <w:proofErr w:type="spellEnd"/>
+            <w:r>
+              <w:t>), загружает GDT (</w:t>
+            </w:r>
+            <w:proofErr w:type="spellStart"/>
+            <w:r>
+              <w:t>lgdt</w:t>
+            </w:r>
+            <w:proofErr w:type="spellEnd"/>
+            <w:r>
+              <w:t>), включает линию A20, устанавливает бит PE в CR0 и переходит на 32-битный код.</w:t>
+            </w:r>
+          </w:p>
+        </w:tc>
+      </w:tr>
+      <w:tr>
+        <w:tc>
+          <w:tcPr>
+            <w:tcW w:w="3225" w:type="dxa"/>
+            <w:tcBorders>
+              <w:top w:val="single" w:sz="4" w:space="0" w:color="999999"/>
+              <w:left w:val="single" w:sz="4" w:space="0" w:color="999999"/>
+              <w:bottom w:val="single" w:sz="4" w:space="0" w:color="999999"/>
+              <w:right w:val="single" w:sz="4" w:space="0" w:color="999999"/>
+            </w:tcBorders>
+            <w:tcMar>
+              <w:top w:w="60" w:type="dxa"/>
+              <w:left w:w="100" w:type="dxa"/>
+              <w:bottom w:w="60" w:type="dxa"/>
+              <w:right w:w="100" w:type="dxa"/>
+            </w:tcMar>
+            <w:vAlign w:val="center"/>
+            <w:hideMark/>
+          </w:tcPr>
+          <w:p>
+            <w:pPr>
+              <w:pStyle w:val="ac"/>
+              <w:spacing w:before="183" w:line="309" w:lineRule="auto"/>
+              <w:ind w:right="163"/>
+            </w:pPr>
+            <w:proofErr w:type="spellStart"/>
+            <w:r>
+              <w:t>protect_mode</w:t>
+            </w:r>
+            <w:proofErr w:type="spellEnd"/>
+          </w:p>
+        </w:tc>
+        <w:tc>
+          <w:tcPr>
+            <w:tcW w:w="5801" w:type="dxa"/>
+            <w:tcBorders>
+              <w:top w:val="single" w:sz="4" w:space="0" w:color="999999"/>
+              <w:left w:val="single" w:sz="4" w:space="0" w:color="999999"/>
+              <w:bottom w:val="single" w:sz="4" w:space="0" w:color="999999"/>
+              <w:right w:val="single" w:sz="4" w:space="0" w:color="999999"/>
+            </w:tcBorders>
+            <w:tcMar>
+              <w:top w:w="60" w:type="dxa"/>
+              <w:left w:w="100" w:type="dxa"/>
+              <w:bottom w:w="60" w:type="dxa"/>
+              <w:right w:w="100" w:type="dxa"/>
+            </w:tcMar>
+            <w:vAlign w:val="center"/>
+            <w:hideMark/>
+          </w:tcPr>
+          <w:p>
+            <w:pPr>
+              <w:pStyle w:val="ac"/>
+              <w:spacing w:before="183" w:line="309" w:lineRule="auto"/>
+              <w:ind w:right="163"/>
+            </w:pPr>
+            <w:r>
+              <w:t>32-битный код: настраивает сегменты данных и стека на плоскую модель, выставляет ESP, вызывает загруженное по адресу 0x10000 ядро.</w:t>
+            </w:r>
+          </w:p>
+        </w:tc>
+      </w:tr>
+      <w:tr>
+        <w:tc>
+          <w:tcPr>
+            <w:tcW w:w="3225" w:type="dxa"/>
+            <w:tcBorders>
+              <w:top w:val="single" w:sz="4" w:space="0" w:color="999999"/>
+              <w:left w:val="single" w:sz="4" w:space="0" w:color="999999"/>
+              <w:bottom w:val="single" w:sz="4" w:space="0" w:color="999999"/>
+              <w:right w:val="single" w:sz="4" w:space="0" w:color="999999"/>
+            </w:tcBorders>
+            <w:tcMar>
+              <w:top w:w="60" w:type="dxa"/>
+              <w:left w:w="100" w:type="dxa"/>
+              <w:bottom w:w="60" w:type="dxa"/>
+              <w:right w:w="100" w:type="dxa"/>
+            </w:tcMar>
+            <w:vAlign w:val="center"/>
+            <w:hideMark/>
+          </w:tcPr>
+          <w:p>
+            <w:pPr>
+              <w:pStyle w:val="ac"/>
+              <w:spacing w:before="183" w:line="309" w:lineRule="auto"/>
+              <w:ind w:right="163"/>
+            </w:pPr>
+            <w:proofErr w:type="spellStart"/>
+            <w:r>
+              <w:t>H</w:t>
+            </w:r>
+            <w:r>
+              <w:t>ang</w:t>
+            </w:r>
+            <w:proofErr w:type="spellEnd"/>
+          </w:p>
+        </w:tc>
+        <w:tc>
+          <w:tcPr>
+            <w:tcW w:w="5801" w:type="dxa"/>
+            <w:tcBorders>
+              <w:top w:val="single" w:sz="4" w:space="0" w:color="999999"/>
+              <w:left w:val="single" w:sz="4" w:space="0" w:color="999999"/>
+              <w:bottom w:val="single" w:sz="4" w:space="0" w:color="999999"/>
+              <w:right w:val="single" w:sz="4" w:space="0" w:color="999999"/>
+            </w:tcBorders>
+            <w:tcMar>
+              <w:top w:w="60" w:type="dxa"/>
+              <w:left w:w="100" w:type="dxa"/>
+              <w:bottom w:w="60" w:type="dxa"/>
+              <w:right w:w="100" w:type="dxa"/>
+            </w:tcMar>
+            <w:vAlign w:val="center"/>
+            <w:hideMark/>
+          </w:tcPr>
+          <w:p>
+            <w:pPr>
+              <w:pStyle w:val="ac"/>
+              <w:spacing w:before="183" w:line="309" w:lineRule="auto"/>
+              <w:ind w:right="163"/>
+            </w:pPr>
+            <w:r>
+              <w:t>Бесконечный цикл остановки процессора (</w:t>
+            </w:r>
+            <w:proofErr w:type="spellStart"/>
+            <w:r>
+              <w:t>hlt</w:t>
+            </w:r>
+            <w:proofErr w:type="spellEnd"/>
+            <w:r>
+              <w:t>), срабатывает, если ядро вернёт управление.</w:t>
+            </w:r>
+          </w:p>
+        </w:tc>
+      </w:tr>
+      <w:tr>
+        <w:tc>
+          <w:tcPr>
+            <w:tcW w:w="3225" w:type="dxa"/>
+            <w:tcBorders>
+              <w:top w:val="single" w:sz="4" w:space="0" w:color="999999"/>
+              <w:left w:val="single" w:sz="4" w:space="0" w:color="999999"/>
+              <w:bottom w:val="single" w:sz="4" w:space="0" w:color="999999"/>
+              <w:right w:val="single" w:sz="4" w:space="0" w:color="999999"/>
+            </w:tcBorders>
+            <w:tcMar>
+              <w:top w:w="60" w:type="dxa"/>
+              <w:left w:w="100" w:type="dxa"/>
+              <w:bottom w:w="60" w:type="dxa"/>
+              <w:right w:w="100" w:type="dxa"/>
+            </w:tcMar>
+            <w:vAlign w:val="center"/>
+            <w:hideMark/>
+          </w:tcPr>
+          <w:p>
+            <w:pPr>
+              <w:pStyle w:val="ac"/>
+              <w:spacing w:before="183" w:line="309" w:lineRule="auto"/>
+              <w:ind w:right="163"/>
+            </w:pPr>
+            <w:proofErr w:type="spellStart"/>
+            <w:r>
+              <w:t>turn_show_str</w:t>
+            </w:r>
+            <w:proofErr w:type="spellEnd"/>
+            <w:r>
+              <w:t xml:space="preserve"> *</w:t>
+            </w:r>
+          </w:p>
+        </w:tc>
+        <w:tc>
+          <w:tcPr>
+            <w:tcW w:w="5801" w:type="dxa"/>
+            <w:tcBorders>
+              <w:top w:val="single" w:sz="4" w:space="0" w:color="999999"/>
+              <w:left w:val="single" w:sz="4" w:space="0" w:color="999999"/>
+              <w:bottom w:val="single" w:sz="4" w:space="0" w:color="999999"/>
+              <w:right w:val="single" w:sz="4" w:space="0" w:color="999999"/>
+            </w:tcBorders>
+            <w:tcMar>
+              <w:top w:w="60" w:type="dxa"/>
+              <w:left w:w="100" w:type="dxa"/>
+              <w:bottom w:w="60" w:type="dxa"/>
+              <w:right w:w="100" w:type="dxa"/>
+            </w:tcMar>
+            <w:vAlign w:val="center"/>
+            <w:hideMark/>
+          </w:tcPr>
+          <w:p>
+            <w:pPr>
+              <w:pStyle w:val="ac"/>
+              <w:spacing w:before="183" w:line="309" w:lineRule="auto"/>
+              <w:ind w:right="163"/>
+            </w:pPr>
+            <w:r>
+              <w:t xml:space="preserve">Печатает ASCII-строку с нуль-терминатором по адресу </w:t>
+            </w:r>
+            <w:proofErr w:type="spellStart"/>
+            <w:r>
+              <w:t>bx</w:t>
+            </w:r>
+            <w:proofErr w:type="spellEnd"/>
+            <w:r>
+              <w:t xml:space="preserve"> через BIOS-телетайп (</w:t>
+            </w:r>
+            <w:proofErr w:type="spellStart"/>
+            <w:r>
+              <w:t>int</w:t>
+            </w:r>
+            <w:proofErr w:type="spellEnd"/>
+            <w:r>
+              <w:t xml:space="preserve"> 10h).</w:t>
+            </w:r>
+          </w:p>
+        </w:tc>
+      </w:tr>
+      <w:tr>
+        <w:tc>
+          <w:tcPr>
+            <w:tcW w:w="3225" w:type="dxa"/>
+            <w:tcBorders>
+              <w:top w:val="single" w:sz="4" w:space="0" w:color="999999"/>
+              <w:left w:val="single" w:sz="4" w:space="0" w:color="999999"/>
+              <w:bottom w:val="single" w:sz="4" w:space="0" w:color="999999"/>
+              <w:right w:val="single" w:sz="4" w:space="0" w:color="999999"/>
+            </w:tcBorders>
+            <w:tcMar>
+              <w:top w:w="60" w:type="dxa"/>
+              <w:left w:w="100" w:type="dxa"/>
+              <w:bottom w:w="60" w:type="dxa"/>
+              <w:right w:w="100" w:type="dxa"/>
+            </w:tcMar>
+            <w:vAlign w:val="center"/>
+            <w:hideMark/>
+          </w:tcPr>
+          <w:p>
+            <w:pPr>
+              <w:pStyle w:val="ac"/>
+              <w:spacing w:before="183" w:line="309" w:lineRule="auto"/>
+              <w:ind w:right="163"/>
+            </w:pPr>
+            <w:proofErr w:type="spellStart"/>
+            <w:r>
+              <w:t>newline</w:t>
+            </w:r>
+            <w:proofErr w:type="spellEnd"/>
+            <w:r>
+              <w:t xml:space="preserve"> *</w:t>
+            </w:r>
+          </w:p>
+        </w:tc>
+        <w:tc>
+          <w:tcPr>
+            <w:tcW w:w="5801" w:type="dxa"/>
+            <w:tcBorders>
+              <w:top w:val="single" w:sz="4" w:space="0" w:color="999999"/>
+              <w:left w:val="single" w:sz="4" w:space="0" w:color="999999"/>
+              <w:bottom w:val="single" w:sz="4" w:space="0" w:color="999999"/>
+              <w:right w:val="single" w:sz="4" w:space="0" w:color="999999"/>
+            </w:tcBorders>
+            <w:tcMar>
+              <w:top w:w="60" w:type="dxa"/>
+              <w:left w:w="100" w:type="dxa"/>
+              <w:bottom w:w="60" w:type="dxa"/>
+              <w:right w:w="100" w:type="dxa"/>
+            </w:tcMar>
+            <w:vAlign w:val="center"/>
+            <w:hideMark/>
+          </w:tcPr>
+          <w:p>
+            <w:pPr>
+              <w:pStyle w:val="ac"/>
+              <w:spacing w:before="183" w:line="309" w:lineRule="auto"/>
+              <w:ind w:right="163"/>
+            </w:pPr>
+            <w:r>
+              <w:t xml:space="preserve">Печатает CR+LF (перевод строки) через </w:t>
+            </w:r>
+            <w:proofErr w:type="spellStart"/>
+            <w:r>
+              <w:t>int</w:t>
+            </w:r>
+            <w:proofErr w:type="spellEnd"/>
+            <w:r>
+              <w:t xml:space="preserve"> 10h.</w:t>
+            </w:r>
+          </w:p>
+        </w:tc>
+      </w:tr>
+    </w:tbl>
     <w:p>
       <w:pPr>
         <w:pStyle w:val="ac"/>
         <w:spacing w:before="183" w:line="309" w:lineRule="auto"/>
         <w:ind w:right="163"/>
-      </w:pPr>
-      <w:r>
-        <w:lastRenderedPageBreak/>
-        <w:t xml:space="preserve">Далее необходимо сделать загрузчик, который запрашивает параметры. Для этого нужно выполнить: </w:t>
+        <w:jc w:val="center"/>
+      </w:pPr>
+      <w:r>
+        <w:t>Таблица 1 — Функции и метки загрузчика bootsect.asm</w:t>
       </w:r>
     </w:p>
     <w:p>
       <w:pPr>
         <w:pStyle w:val="ac"/>
-        <w:numPr>
-          <w:ilvl w:val="0"/>
-          <w:numId w:val="9"/>
-        </w:numPr>
-        <w:spacing w:line="309" w:lineRule="auto"/>
+        <w:spacing w:before="183" w:line="309" w:lineRule="auto"/>
         <w:ind w:right="163"/>
       </w:pPr>
       <w:r>
-        <w:t>Создать массив из 26 элементов</w:t>
-      </w:r>
-      <w:r>
-        <w:t>:</w:t>
+        <w:t>Загрузчик — это 512-байтный сектор, который BIOS считывает с загрузочного устройства и размещает по физическому адресу 0000:7C00h, после чего передаёт ему управление.</w:t>
       </w:r>
     </w:p>
     <w:p>
       <w:pPr>
         <w:pStyle w:val="ac"/>
-        <w:spacing w:line="309" w:lineRule="auto"/>
+        <w:spacing w:before="183" w:line="309" w:lineRule="auto"/>
         <w:ind w:right="163"/>
+      </w:pPr>
+      <w:r>
+        <w:t xml:space="preserve">Процесс загрузки ОС начинается с подачи питания на материнскую плату, затем происходит </w:t>
+      </w:r>
+      <w:r>
         <w:rPr>
           <w:lang w:val="en-US"/>
         </w:rPr>
-      </w:pPr>
-      <w:proofErr w:type="spellStart"/>
+        <w:t>POST</w:t>
+      </w:r>
+      <w:r>
+        <w:t xml:space="preserve"> </w:t>
+      </w:r>
+      <w:r>
+        <w:t>(</w:t>
+      </w:r>
       <w:r>
         <w:rPr>
           <w:lang w:val="en-US"/>
         </w:rPr>
-        <w:t>turn_symbol_array</w:t>
-      </w:r>
-      <w:proofErr w:type="spellEnd"/>
+        <w:t>Power</w:t>
+      </w:r>
+      <w:r>
+        <w:t>-</w:t>
+      </w:r>
       <w:r>
         <w:rPr>
           <w:lang w:val="en-US"/>
         </w:rPr>
-        <w:t xml:space="preserve">: times 26 </w:t>
-      </w:r>
-      <w:proofErr w:type="spellStart"/>
+        <w:t>on</w:t>
+      </w:r>
+      <w:r>
+        <w:t xml:space="preserve"> </w:t>
+      </w:r>
       <w:r>
         <w:rPr>
           <w:lang w:val="en-US"/>
         </w:rPr>
-        <w:t>db</w:t>
-      </w:r>
-      <w:proofErr w:type="spellEnd"/>
+        <w:t>self</w:t>
+      </w:r>
+      <w:r>
+        <w:t>-</w:t>
+      </w:r>
       <w:r>
         <w:rPr>
           <w:lang w:val="en-US"/>
         </w:rPr>
-        <w:t xml:space="preserve"> 0</w:t>
-      </w:r>
-    </w:p>
-    <w:p>
-      <w:pPr>
-        <w:pStyle w:val="ac"/>
-        <w:spacing w:line="309" w:lineRule="auto"/>
-        <w:ind w:right="163"/>
+        <w:t>test</w:t>
+      </w:r>
+      <w:r>
+        <w:t>)</w:t>
+      </w:r>
+      <w:r>
+        <w:t xml:space="preserve">, который выполняет самодиагностику процессора, ОЗУ, </w:t>
+      </w:r>
+      <w:r>
+        <w:t>базовых контроллеров</w:t>
+      </w:r>
+      <w:r>
+        <w:t xml:space="preserve">, путем подачи напряжения на них. </w:t>
+      </w:r>
+      <w:r>
+        <w:t xml:space="preserve">После </w:t>
+      </w:r>
+      <w:r>
         <w:rPr>
           <w:lang w:val="en-US"/>
         </w:rPr>
-      </w:pPr>
-    </w:p>
-    <w:p>
-      <w:pPr>
-        <w:pStyle w:val="ac"/>
-        <w:numPr>
-          <w:ilvl w:val="0"/>
-          <w:numId w:val="9"/>
-        </w:numPr>
-        <w:spacing w:line="309" w:lineRule="auto"/>
-        <w:ind w:right="163"/>
-      </w:pPr>
-      <w:r>
-        <w:t>Реализовать п</w:t>
-      </w:r>
-      <w:r>
-        <w:t>ечать строки</w:t>
-      </w:r>
-      <w:r>
-        <w:t>:</w:t>
-      </w:r>
-    </w:p>
-    <w:p>
-      <w:pPr>
-        <w:pStyle w:val="ac"/>
-        <w:spacing w:line="309" w:lineRule="auto"/>
-        <w:ind w:right="163"/>
-        <w:jc w:val="center"/>
+        <w:t>BIOS</w:t>
+      </w:r>
+      <w:r>
+        <w:t>/</w:t>
+      </w:r>
+      <w:r>
         <w:rPr>
           <w:lang w:val="en-US"/>
         </w:rPr>
-      </w:pPr>
-      <w:r>
-        <w:rPr>
-          <w:lang w:val="en-US"/>
-        </w:rPr>
+        <w:t>UEFI</w:t>
+      </w:r>
+      <w:r>
+        <w:t xml:space="preserve"> </w:t>
+      </w:r>
+      <w:r>
+        <w:t xml:space="preserve">ищут загрузочный код по вышеописанному адресу. Загрузчик настраивает аппаратную часть (в нашем случае, вместо этого настройка начальных параметров ядра, в виде используемых букв), ищет, загружает и передает управление ядру. </w:t>
+      </w:r>
+      <w:r>
+        <w:rPr>
+          <w:noProof/>
+        </w:rPr>
+        <w:lastRenderedPageBreak/>
         <w:drawing>
-          <wp:inline distT="0" distB="0" distL="0" distR="0" wp14:anchorId="31442690" wp14:editId="1E883243">
-            <wp:extent cx="2848373" cy="2962688"/>
-            <wp:effectExtent l="0" t="0" r="9525" b="0"/>
-            <wp:docPr id="3" name="Рисунок 3"/>
+          <wp:inline distT="0" distB="0" distL="0" distR="0" wp14:anchorId="111329EA" wp14:editId="0B86BD41">
+            <wp:extent cx="5932170" cy="6377305"/>
+            <wp:effectExtent l="0" t="0" r="0" b="4445"/>
+            <wp:docPr id="8" name="Рисунок 8"/>
             <wp:cNvGraphicFramePr>
               <a:graphicFrameLocks xmlns:a="http://schemas.openxmlformats.org/drawingml/2006/main" noChangeAspect="1"/>
             </wp:cNvGraphicFramePr>
@@ -1389,23 +2427,36 @@
               <a:graphicData uri="http://schemas.openxmlformats.org/drawingml/2006/picture">
                 <pic:pic xmlns:pic="http://schemas.openxmlformats.org/drawingml/2006/picture">
                   <pic:nvPicPr>
-                    <pic:cNvPr id="1" name=""/>
-                    <pic:cNvPicPr/>
+                    <pic:cNvPr id="0" name="Picture 2"/>
+                    <pic:cNvPicPr>
+                      <a:picLocks noChangeAspect="1" noChangeArrowheads="1"/>
+                    </pic:cNvPicPr>
                   </pic:nvPicPr>
                   <pic:blipFill>
-                    <a:blip r:embed="rId6"/>
+                    <a:blip r:embed="rId6" cstate="print">
+                      <a:extLst>
+                        <a:ext uri="{28A0092B-C50C-407E-A947-70E740481C1C}">
+                          <a14:useLocalDpi xmlns:a14="http://schemas.microsoft.com/office/drawing/2010/main" val="0"/>
+                        </a:ext>
+                      </a:extLst>
+                    </a:blip>
+                    <a:srcRect/>
                     <a:stretch>
                       <a:fillRect/>
                     </a:stretch>
                   </pic:blipFill>
-                  <pic:spPr>
+                  <pic:spPr bwMode="auto">
                     <a:xfrm>
                       <a:off x="0" y="0"/>
-                      <a:ext cx="2848373" cy="2962688"/>
+                      <a:ext cx="5932170" cy="6377305"/>
                     </a:xfrm>
                     <a:prstGeom prst="rect">
                       <a:avLst/>
                     </a:prstGeom>
+                    <a:noFill/>
+                    <a:ln>
+                      <a:noFill/>
+                    </a:ln>
                   </pic:spPr>
                 </pic:pic>
               </a:graphicData>
@@ -1417,122 +2468,40 @@
     <w:p>
       <w:pPr>
         <w:pStyle w:val="ac"/>
-        <w:spacing w:line="309" w:lineRule="auto"/>
+        <w:spacing w:before="183" w:line="309" w:lineRule="auto"/>
         <w:ind w:right="163"/>
         <w:jc w:val="center"/>
       </w:pPr>
       <w:r>
-        <w:t xml:space="preserve">Рисунок 2. Функция вывода строки на экран. </w:t>
+        <w:t xml:space="preserve">Рисунок 2. Блок-схема </w:t>
+      </w:r>
+      <w:r>
+        <w:t xml:space="preserve">алгоритма </w:t>
+      </w:r>
+      <w:r>
+        <w:t xml:space="preserve">загрузчика </w:t>
       </w:r>
     </w:p>
     <w:p>
       <w:pPr>
         <w:pStyle w:val="ac"/>
-        <w:spacing w:line="309" w:lineRule="auto"/>
+        <w:numPr>
+          <w:ilvl w:val="1"/>
+          <w:numId w:val="8"/>
+        </w:numPr>
+        <w:spacing w:before="183" w:line="309" w:lineRule="auto"/>
         <w:ind w:right="163"/>
-        <w:jc w:val="center"/>
-      </w:pPr>
-      <w:r>
-        <w:drawing>
-          <wp:inline distT="0" distB="0" distL="0" distR="0" wp14:anchorId="335D2FBF" wp14:editId="18FD8C74">
-            <wp:extent cx="2953162" cy="3905795"/>
-            <wp:effectExtent l="0" t="0" r="0" b="0"/>
-            <wp:docPr id="5" name="Рисунок 5"/>
-            <wp:cNvGraphicFramePr>
-              <a:graphicFrameLocks xmlns:a="http://schemas.openxmlformats.org/drawingml/2006/main" noChangeAspect="1"/>
-            </wp:cNvGraphicFramePr>
-            <a:graphic xmlns:a="http://schemas.openxmlformats.org/drawingml/2006/main">
-              <a:graphicData uri="http://schemas.openxmlformats.org/drawingml/2006/picture">
-                <pic:pic xmlns:pic="http://schemas.openxmlformats.org/drawingml/2006/picture">
-                  <pic:nvPicPr>
-                    <pic:cNvPr id="1" name=""/>
-                    <pic:cNvPicPr/>
-                  </pic:nvPicPr>
-                  <pic:blipFill>
-                    <a:blip r:embed="rId7"/>
-                    <a:stretch>
-                      <a:fillRect/>
-                    </a:stretch>
-                  </pic:blipFill>
-                  <pic:spPr>
-                    <a:xfrm>
-                      <a:off x="0" y="0"/>
-                      <a:ext cx="2953162" cy="3905795"/>
-                    </a:xfrm>
-                    <a:prstGeom prst="rect">
-                      <a:avLst/>
-                    </a:prstGeom>
-                  </pic:spPr>
-                </pic:pic>
-              </a:graphicData>
-            </a:graphic>
-          </wp:inline>
-        </w:drawing>
-      </w:r>
-    </w:p>
-    <w:p>
-      <w:pPr>
-        <w:pStyle w:val="ac"/>
-        <w:spacing w:line="309" w:lineRule="auto"/>
-        <w:ind w:right="163"/>
-        <w:jc w:val="center"/>
-      </w:pPr>
-      <w:r>
-        <w:t>Рисунок 3. Вывод приветственных строк</w:t>
-      </w:r>
-    </w:p>
-    <w:p>
-      <w:pPr>
-        <w:pStyle w:val="ac"/>
-        <w:numPr>
-          <w:ilvl w:val="0"/>
-          <w:numId w:val="9"/>
-        </w:numPr>
-        <w:spacing w:line="309" w:lineRule="auto"/>
-        <w:ind w:right="163"/>
-      </w:pPr>
-      <w:r>
-        <w:lastRenderedPageBreak/>
-        <w:t>Реализовать считывание клавиш</w:t>
-      </w:r>
-      <w:r>
-        <w:t xml:space="preserve">: </w:t>
-      </w:r>
-    </w:p>
-    <w:p>
-      <w:pPr>
-        <w:pStyle w:val="ac"/>
-        <w:spacing w:line="309" w:lineRule="auto"/>
-        <w:ind w:right="163"/>
-      </w:pPr>
-    </w:p>
-    <w:p>
-      <w:pPr>
-        <w:pStyle w:val="ac"/>
-        <w:numPr>
-          <w:ilvl w:val="0"/>
-          <w:numId w:val="9"/>
-        </w:numPr>
-        <w:spacing w:line="309" w:lineRule="auto"/>
-        <w:ind w:right="163"/>
-      </w:pPr>
-      <w:r>
-        <w:t>Провер</w:t>
-      </w:r>
-      <w:r>
-        <w:t>ить</w:t>
-      </w:r>
-      <w:r>
-        <w:t xml:space="preserve"> букв</w:t>
-      </w:r>
-      <w:r>
-        <w:t>ы</w:t>
-      </w:r>
-      <w:r>
-        <w:t xml:space="preserve"> после нажат</w:t>
-      </w:r>
-      <w:r>
-        <w:t>ия</w:t>
+        <w:rPr>
+          <w:b/>
+          <w:bCs/>
+        </w:rPr>
+      </w:pPr>
+      <w:r>
+        <w:rPr>
+          <w:b/>
+          <w:bCs/>
+        </w:rPr>
+        <w:t>Ядро</w:t>
       </w:r>
     </w:p>
     <w:p>
@@ -1541,6 +2510,3088 @@
         <w:spacing w:before="183" w:line="309" w:lineRule="auto"/>
         <w:ind w:right="163"/>
       </w:pPr>
+      <w:r>
+        <w:t>Ядро операционной системы — это её центральная и фундаментальная часть, которая выступает в роли посредника между аппаратным обеспечением компьютера (процессором, памятью, устройствами ввода-вывода) и программным обеспечением (приложениями, службами). Оно управляет ресурсами и координирует работу всех компонентов системы, обеспечивая её стабильную и эффективную работу.</w:t>
+      </w:r>
+    </w:p>
+    <w:p>
+      <w:pPr>
+        <w:pStyle w:val="ac"/>
+        <w:spacing w:before="183" w:line="309" w:lineRule="auto"/>
+        <w:ind w:right="163"/>
+      </w:pPr>
+    </w:p>
+    <w:tbl>
+      <w:tblPr>
+        <w:tblW w:w="9026" w:type="dxa"/>
+        <w:tblBorders>
+          <w:top w:val="single" w:sz="4" w:space="0" w:color="BFBFBF"/>
+          <w:left w:val="single" w:sz="4" w:space="0" w:color="BFBFBF"/>
+          <w:bottom w:val="single" w:sz="4" w:space="0" w:color="BFBFBF"/>
+          <w:right w:val="single" w:sz="4" w:space="0" w:color="BFBFBF"/>
+          <w:insideH w:val="single" w:sz="4" w:space="0" w:color="BFBFBF"/>
+          <w:insideV w:val="single" w:sz="4" w:space="0" w:color="BFBFBF"/>
+        </w:tblBorders>
+        <w:tblCellMar>
+          <w:left w:w="10" w:type="dxa"/>
+          <w:right w:w="10" w:type="dxa"/>
+        </w:tblCellMar>
+        <w:tblLook w:val="04A0" w:firstRow="1" w:lastRow="0" w:firstColumn="1" w:lastColumn="0" w:noHBand="0" w:noVBand="1"/>
+      </w:tblPr>
+      <w:tblGrid>
+        <w:gridCol w:w="3529"/>
+        <w:gridCol w:w="5497"/>
+      </w:tblGrid>
+      <w:tr>
+        <w:trPr>
+          <w:tblHeader/>
+        </w:trPr>
+        <w:tc>
+          <w:tcPr>
+            <w:tcW w:w="3529" w:type="dxa"/>
+            <w:tcBorders>
+              <w:top w:val="single" w:sz="4" w:space="0" w:color="BFBFBF"/>
+              <w:left w:val="single" w:sz="4" w:space="0" w:color="BFBFBF"/>
+              <w:bottom w:val="single" w:sz="4" w:space="0" w:color="BFBFBF"/>
+              <w:right w:val="single" w:sz="4" w:space="0" w:color="BFBFBF"/>
+            </w:tcBorders>
+            <w:shd w:val="clear" w:color="auto" w:fill="595959" w:themeFill="text1" w:themeFillTint="A6"/>
+            <w:tcMar>
+              <w:top w:w="100" w:type="dxa"/>
+              <w:left w:w="120" w:type="dxa"/>
+              <w:bottom w:w="100" w:type="dxa"/>
+              <w:right w:w="120" w:type="dxa"/>
+            </w:tcMar>
+            <w:vAlign w:val="center"/>
+            <w:hideMark/>
+          </w:tcPr>
+          <w:p>
+            <w:pPr>
+              <w:pStyle w:val="ac"/>
+              <w:spacing w:before="183" w:line="309" w:lineRule="auto"/>
+              <w:ind w:right="163"/>
+            </w:pPr>
+            <w:r>
+              <w:rPr>
+                <w:b/>
+                <w:bCs/>
+              </w:rPr>
+              <w:lastRenderedPageBreak/>
+              <w:t>Функция и аргументы</w:t>
+            </w:r>
+          </w:p>
+        </w:tc>
+        <w:tc>
+          <w:tcPr>
+            <w:tcW w:w="5497" w:type="dxa"/>
+            <w:tcBorders>
+              <w:top w:val="single" w:sz="4" w:space="0" w:color="BFBFBF"/>
+              <w:left w:val="single" w:sz="4" w:space="0" w:color="BFBFBF"/>
+              <w:bottom w:val="single" w:sz="4" w:space="0" w:color="BFBFBF"/>
+              <w:right w:val="single" w:sz="4" w:space="0" w:color="BFBFBF"/>
+            </w:tcBorders>
+            <w:shd w:val="clear" w:color="auto" w:fill="595959" w:themeFill="text1" w:themeFillTint="A6"/>
+            <w:tcMar>
+              <w:top w:w="100" w:type="dxa"/>
+              <w:left w:w="120" w:type="dxa"/>
+              <w:bottom w:w="100" w:type="dxa"/>
+              <w:right w:w="120" w:type="dxa"/>
+            </w:tcMar>
+            <w:vAlign w:val="center"/>
+            <w:hideMark/>
+          </w:tcPr>
+          <w:p>
+            <w:pPr>
+              <w:pStyle w:val="ac"/>
+              <w:spacing w:before="183" w:line="309" w:lineRule="auto"/>
+              <w:ind w:right="163"/>
+            </w:pPr>
+            <w:r>
+              <w:rPr>
+                <w:b/>
+                <w:bCs/>
+              </w:rPr>
+              <w:t>Описание</w:t>
+            </w:r>
+          </w:p>
+        </w:tc>
+      </w:tr>
+      <w:tr>
+        <w:tc>
+          <w:tcPr>
+            <w:tcW w:w="3529" w:type="dxa"/>
+            <w:tcBorders>
+              <w:top w:val="single" w:sz="4" w:space="0" w:color="BFBFBF"/>
+              <w:left w:val="single" w:sz="4" w:space="0" w:color="BFBFBF"/>
+              <w:bottom w:val="single" w:sz="4" w:space="0" w:color="BFBFBF"/>
+              <w:right w:val="single" w:sz="4" w:space="0" w:color="BFBFBF"/>
+            </w:tcBorders>
+            <w:tcMar>
+              <w:top w:w="100" w:type="dxa"/>
+              <w:left w:w="120" w:type="dxa"/>
+              <w:bottom w:w="100" w:type="dxa"/>
+              <w:right w:w="120" w:type="dxa"/>
+            </w:tcMar>
+            <w:vAlign w:val="center"/>
+            <w:hideMark/>
+          </w:tcPr>
+          <w:p>
+            <w:pPr>
+              <w:pStyle w:val="ac"/>
+              <w:spacing w:before="183" w:line="309" w:lineRule="auto"/>
+              <w:ind w:right="163"/>
+            </w:pPr>
+            <w:proofErr w:type="spellStart"/>
+            <w:r>
+              <w:t>find_array_</w:t>
+            </w:r>
+            <w:proofErr w:type="gramStart"/>
+            <w:r>
+              <w:t>size</w:t>
+            </w:r>
+            <w:proofErr w:type="spellEnd"/>
+            <w:r>
+              <w:t>(</w:t>
+            </w:r>
+            <w:proofErr w:type="gramEnd"/>
+            <w:r>
+              <w:t>)</w:t>
+            </w:r>
+          </w:p>
+        </w:tc>
+        <w:tc>
+          <w:tcPr>
+            <w:tcW w:w="5497" w:type="dxa"/>
+            <w:tcBorders>
+              <w:top w:val="single" w:sz="4" w:space="0" w:color="BFBFBF"/>
+              <w:left w:val="single" w:sz="4" w:space="0" w:color="BFBFBF"/>
+              <w:bottom w:val="single" w:sz="4" w:space="0" w:color="BFBFBF"/>
+              <w:right w:val="single" w:sz="4" w:space="0" w:color="BFBFBF"/>
+            </w:tcBorders>
+            <w:tcMar>
+              <w:top w:w="100" w:type="dxa"/>
+              <w:left w:w="120" w:type="dxa"/>
+              <w:bottom w:w="100" w:type="dxa"/>
+              <w:right w:w="120" w:type="dxa"/>
+            </w:tcMar>
+            <w:vAlign w:val="center"/>
+            <w:hideMark/>
+          </w:tcPr>
+          <w:p>
+            <w:pPr>
+              <w:pStyle w:val="ac"/>
+              <w:spacing w:before="183" w:line="309" w:lineRule="auto"/>
+              <w:ind w:right="163"/>
+            </w:pPr>
+            <w:r>
+              <w:t xml:space="preserve">Определяет количество элементов в массивах слов </w:t>
+            </w:r>
+            <w:proofErr w:type="spellStart"/>
+            <w:r>
+              <w:t>en_words</w:t>
+            </w:r>
+            <w:proofErr w:type="spellEnd"/>
+            <w:r>
+              <w:t xml:space="preserve"> и </w:t>
+            </w:r>
+            <w:proofErr w:type="spellStart"/>
+            <w:r>
+              <w:t>es_words</w:t>
+            </w:r>
+            <w:proofErr w:type="spellEnd"/>
+            <w:r>
+              <w:t xml:space="preserve">, сохраняя результат в </w:t>
+            </w:r>
+            <w:proofErr w:type="spellStart"/>
+            <w:r>
+              <w:t>array_size</w:t>
+            </w:r>
+            <w:proofErr w:type="spellEnd"/>
+            <w:r>
+              <w:t xml:space="preserve"> и array_size2.</w:t>
+            </w:r>
+          </w:p>
+        </w:tc>
+      </w:tr>
+      <w:tr>
+        <w:tc>
+          <w:tcPr>
+            <w:tcW w:w="3529" w:type="dxa"/>
+            <w:tcBorders>
+              <w:top w:val="single" w:sz="4" w:space="0" w:color="BFBFBF"/>
+              <w:left w:val="single" w:sz="4" w:space="0" w:color="BFBFBF"/>
+              <w:bottom w:val="single" w:sz="4" w:space="0" w:color="BFBFBF"/>
+              <w:right w:val="single" w:sz="4" w:space="0" w:color="BFBFBF"/>
+            </w:tcBorders>
+            <w:tcMar>
+              <w:top w:w="100" w:type="dxa"/>
+              <w:left w:w="120" w:type="dxa"/>
+              <w:bottom w:w="100" w:type="dxa"/>
+              <w:right w:w="120" w:type="dxa"/>
+            </w:tcMar>
+            <w:vAlign w:val="center"/>
+            <w:hideMark/>
+          </w:tcPr>
+          <w:p>
+            <w:pPr>
+              <w:pStyle w:val="ac"/>
+              <w:spacing w:before="183" w:line="309" w:lineRule="auto"/>
+              <w:ind w:right="163"/>
+            </w:pPr>
+            <w:proofErr w:type="spellStart"/>
+            <w:r>
+              <w:t>scroll_</w:t>
+            </w:r>
+            <w:proofErr w:type="gramStart"/>
+            <w:r>
+              <w:t>up</w:t>
+            </w:r>
+            <w:proofErr w:type="spellEnd"/>
+            <w:r>
+              <w:t>(</w:t>
+            </w:r>
+            <w:proofErr w:type="gramEnd"/>
+            <w:r>
+              <w:t>)</w:t>
+            </w:r>
+          </w:p>
+        </w:tc>
+        <w:tc>
+          <w:tcPr>
+            <w:tcW w:w="5497" w:type="dxa"/>
+            <w:tcBorders>
+              <w:top w:val="single" w:sz="4" w:space="0" w:color="BFBFBF"/>
+              <w:left w:val="single" w:sz="4" w:space="0" w:color="BFBFBF"/>
+              <w:bottom w:val="single" w:sz="4" w:space="0" w:color="BFBFBF"/>
+              <w:right w:val="single" w:sz="4" w:space="0" w:color="BFBFBF"/>
+            </w:tcBorders>
+            <w:tcMar>
+              <w:top w:w="100" w:type="dxa"/>
+              <w:left w:w="120" w:type="dxa"/>
+              <w:bottom w:w="100" w:type="dxa"/>
+              <w:right w:w="120" w:type="dxa"/>
+            </w:tcMar>
+            <w:vAlign w:val="center"/>
+            <w:hideMark/>
+          </w:tcPr>
+          <w:p>
+            <w:pPr>
+              <w:pStyle w:val="ac"/>
+              <w:spacing w:before="183" w:line="309" w:lineRule="auto"/>
+              <w:ind w:right="163"/>
+            </w:pPr>
+            <w:r>
+              <w:t>Прокручивает содержимое видеопамяти на одну строку вверх, очищая освободившуюся последнюю строку экрана.</w:t>
+            </w:r>
+          </w:p>
+        </w:tc>
+      </w:tr>
+      <w:tr>
+        <w:tc>
+          <w:tcPr>
+            <w:tcW w:w="3529" w:type="dxa"/>
+            <w:tcBorders>
+              <w:top w:val="single" w:sz="4" w:space="0" w:color="BFBFBF"/>
+              <w:left w:val="single" w:sz="4" w:space="0" w:color="BFBFBF"/>
+              <w:bottom w:val="single" w:sz="4" w:space="0" w:color="BFBFBF"/>
+              <w:right w:val="single" w:sz="4" w:space="0" w:color="BFBFBF"/>
+            </w:tcBorders>
+            <w:tcMar>
+              <w:top w:w="100" w:type="dxa"/>
+              <w:left w:w="120" w:type="dxa"/>
+              <w:bottom w:w="100" w:type="dxa"/>
+              <w:right w:w="120" w:type="dxa"/>
+            </w:tcMar>
+            <w:vAlign w:val="center"/>
+            <w:hideMark/>
+          </w:tcPr>
+          <w:p>
+            <w:pPr>
+              <w:pStyle w:val="ac"/>
+              <w:spacing w:before="183" w:line="309" w:lineRule="auto"/>
+              <w:ind w:right="163"/>
+              <w:rPr>
+                <w:lang w:val="en-US"/>
+              </w:rPr>
+            </w:pPr>
+            <w:proofErr w:type="spellStart"/>
+            <w:r>
+              <w:rPr>
+                <w:lang w:val="en-US"/>
+              </w:rPr>
+              <w:t>cursor_</w:t>
+            </w:r>
+            <w:proofErr w:type="gramStart"/>
+            <w:r>
+              <w:rPr>
+                <w:lang w:val="en-US"/>
+              </w:rPr>
+              <w:t>moveto</w:t>
+            </w:r>
+            <w:proofErr w:type="spellEnd"/>
+            <w:r>
+              <w:rPr>
+                <w:lang w:val="en-US"/>
+              </w:rPr>
+              <w:t>(</w:t>
+            </w:r>
+            <w:proofErr w:type="gramEnd"/>
+            <w:r>
+              <w:rPr>
+                <w:lang w:val="en-US"/>
+              </w:rPr>
+              <w:t xml:space="preserve">unsigned int </w:t>
+            </w:r>
+            <w:proofErr w:type="spellStart"/>
+            <w:r>
+              <w:rPr>
+                <w:lang w:val="en-US"/>
+              </w:rPr>
+              <w:t>strnum</w:t>
+            </w:r>
+            <w:proofErr w:type="spellEnd"/>
+            <w:r>
+              <w:rPr>
+                <w:lang w:val="en-US"/>
+              </w:rPr>
+              <w:t>, unsigned int pos)</w:t>
+            </w:r>
+          </w:p>
+        </w:tc>
+        <w:tc>
+          <w:tcPr>
+            <w:tcW w:w="5497" w:type="dxa"/>
+            <w:tcBorders>
+              <w:top w:val="single" w:sz="4" w:space="0" w:color="BFBFBF"/>
+              <w:left w:val="single" w:sz="4" w:space="0" w:color="BFBFBF"/>
+              <w:bottom w:val="single" w:sz="4" w:space="0" w:color="BFBFBF"/>
+              <w:right w:val="single" w:sz="4" w:space="0" w:color="BFBFBF"/>
+            </w:tcBorders>
+            <w:tcMar>
+              <w:top w:w="100" w:type="dxa"/>
+              <w:left w:w="120" w:type="dxa"/>
+              <w:bottom w:w="100" w:type="dxa"/>
+              <w:right w:w="120" w:type="dxa"/>
+            </w:tcMar>
+            <w:vAlign w:val="center"/>
+            <w:hideMark/>
+          </w:tcPr>
+          <w:p>
+            <w:pPr>
+              <w:pStyle w:val="ac"/>
+              <w:spacing w:before="183" w:line="309" w:lineRule="auto"/>
+              <w:ind w:right="163"/>
+            </w:pPr>
+            <w:r>
+              <w:t>Перемещает аппаратный текстовый курсор в заданную строку и позицию через порты контроллера видеокарты (0x3D4/0x3D5).</w:t>
+            </w:r>
+          </w:p>
+        </w:tc>
+      </w:tr>
+      <w:tr>
+        <w:tc>
+          <w:tcPr>
+            <w:tcW w:w="3529" w:type="dxa"/>
+            <w:tcBorders>
+              <w:top w:val="single" w:sz="4" w:space="0" w:color="BFBFBF"/>
+              <w:left w:val="single" w:sz="4" w:space="0" w:color="BFBFBF"/>
+              <w:bottom w:val="single" w:sz="4" w:space="0" w:color="BFBFBF"/>
+              <w:right w:val="single" w:sz="4" w:space="0" w:color="BFBFBF"/>
+            </w:tcBorders>
+            <w:tcMar>
+              <w:top w:w="100" w:type="dxa"/>
+              <w:left w:w="120" w:type="dxa"/>
+              <w:bottom w:w="100" w:type="dxa"/>
+              <w:right w:w="120" w:type="dxa"/>
+            </w:tcMar>
+            <w:vAlign w:val="center"/>
+            <w:hideMark/>
+          </w:tcPr>
+          <w:p>
+            <w:pPr>
+              <w:pStyle w:val="ac"/>
+              <w:spacing w:before="183" w:line="309" w:lineRule="auto"/>
+              <w:ind w:right="163"/>
+            </w:pPr>
+            <w:proofErr w:type="spellStart"/>
+            <w:r>
+              <w:t>update_</w:t>
+            </w:r>
+            <w:proofErr w:type="gramStart"/>
+            <w:r>
+              <w:t>cursor</w:t>
+            </w:r>
+            <w:proofErr w:type="spellEnd"/>
+            <w:r>
+              <w:t>(</w:t>
+            </w:r>
+            <w:proofErr w:type="gramEnd"/>
+            <w:r>
+              <w:t>)</w:t>
+            </w:r>
+          </w:p>
+        </w:tc>
+        <w:tc>
+          <w:tcPr>
+            <w:tcW w:w="5497" w:type="dxa"/>
+            <w:tcBorders>
+              <w:top w:val="single" w:sz="4" w:space="0" w:color="BFBFBF"/>
+              <w:left w:val="single" w:sz="4" w:space="0" w:color="BFBFBF"/>
+              <w:bottom w:val="single" w:sz="4" w:space="0" w:color="BFBFBF"/>
+              <w:right w:val="single" w:sz="4" w:space="0" w:color="BFBFBF"/>
+            </w:tcBorders>
+            <w:tcMar>
+              <w:top w:w="100" w:type="dxa"/>
+              <w:left w:w="120" w:type="dxa"/>
+              <w:bottom w:w="100" w:type="dxa"/>
+              <w:right w:w="120" w:type="dxa"/>
+            </w:tcMar>
+            <w:vAlign w:val="center"/>
+            <w:hideMark/>
+          </w:tcPr>
+          <w:p>
+            <w:pPr>
+              <w:pStyle w:val="ac"/>
+              <w:spacing w:before="183" w:line="309" w:lineRule="auto"/>
+              <w:ind w:right="163"/>
+            </w:pPr>
+            <w:r>
+              <w:t xml:space="preserve">Обновляет положение аппаратного курсора в соответствии с текущим значением переменной </w:t>
+            </w:r>
+            <w:proofErr w:type="spellStart"/>
+            <w:r>
+              <w:t>position</w:t>
+            </w:r>
+            <w:proofErr w:type="spellEnd"/>
+            <w:r>
+              <w:t>.</w:t>
+            </w:r>
+          </w:p>
+        </w:tc>
+      </w:tr>
+      <w:tr>
+        <w:tc>
+          <w:tcPr>
+            <w:tcW w:w="3529" w:type="dxa"/>
+            <w:tcBorders>
+              <w:top w:val="single" w:sz="4" w:space="0" w:color="BFBFBF"/>
+              <w:left w:val="single" w:sz="4" w:space="0" w:color="BFBFBF"/>
+              <w:bottom w:val="single" w:sz="4" w:space="0" w:color="BFBFBF"/>
+              <w:right w:val="single" w:sz="4" w:space="0" w:color="BFBFBF"/>
+            </w:tcBorders>
+            <w:tcMar>
+              <w:top w:w="100" w:type="dxa"/>
+              <w:left w:w="120" w:type="dxa"/>
+              <w:bottom w:w="100" w:type="dxa"/>
+              <w:right w:w="120" w:type="dxa"/>
+            </w:tcMar>
+            <w:vAlign w:val="center"/>
+            <w:hideMark/>
+          </w:tcPr>
+          <w:p>
+            <w:pPr>
+              <w:pStyle w:val="ac"/>
+              <w:spacing w:before="183" w:line="309" w:lineRule="auto"/>
+              <w:ind w:right="163"/>
+              <w:rPr>
+                <w:lang w:val="en-US"/>
+              </w:rPr>
+            </w:pPr>
+            <w:proofErr w:type="spellStart"/>
+            <w:r>
+              <w:rPr>
+                <w:lang w:val="en-US"/>
+              </w:rPr>
+              <w:t>str_</w:t>
+            </w:r>
+            <w:proofErr w:type="gramStart"/>
+            <w:r>
+              <w:rPr>
+                <w:lang w:val="en-US"/>
+              </w:rPr>
+              <w:t>str</w:t>
+            </w:r>
+            <w:proofErr w:type="spellEnd"/>
+            <w:r>
+              <w:rPr>
+                <w:lang w:val="en-US"/>
+              </w:rPr>
+              <w:t>(</w:t>
+            </w:r>
+            <w:proofErr w:type="gramEnd"/>
+            <w:r>
+              <w:rPr>
+                <w:lang w:val="en-US"/>
+              </w:rPr>
+              <w:t>const char* point)</w:t>
+            </w:r>
+          </w:p>
+        </w:tc>
+        <w:tc>
+          <w:tcPr>
+            <w:tcW w:w="5497" w:type="dxa"/>
+            <w:tcBorders>
+              <w:top w:val="single" w:sz="4" w:space="0" w:color="BFBFBF"/>
+              <w:left w:val="single" w:sz="4" w:space="0" w:color="BFBFBF"/>
+              <w:bottom w:val="single" w:sz="4" w:space="0" w:color="BFBFBF"/>
+              <w:right w:val="single" w:sz="4" w:space="0" w:color="BFBFBF"/>
+            </w:tcBorders>
+            <w:tcMar>
+              <w:top w:w="100" w:type="dxa"/>
+              <w:left w:w="120" w:type="dxa"/>
+              <w:bottom w:w="100" w:type="dxa"/>
+              <w:right w:w="120" w:type="dxa"/>
+            </w:tcMar>
+            <w:vAlign w:val="center"/>
+            <w:hideMark/>
+          </w:tcPr>
+          <w:p>
+            <w:pPr>
+              <w:pStyle w:val="ac"/>
+              <w:spacing w:before="183" w:line="309" w:lineRule="auto"/>
+              <w:ind w:right="163"/>
+            </w:pPr>
+            <w:r>
+              <w:t>Выводит строку символов в видеопамять (на экран) посимвольно, с прокруткой экрана при переполнении.</w:t>
+            </w:r>
+          </w:p>
+        </w:tc>
+      </w:tr>
+      <w:tr>
+        <w:tc>
+          <w:tcPr>
+            <w:tcW w:w="3529" w:type="dxa"/>
+            <w:tcBorders>
+              <w:top w:val="single" w:sz="4" w:space="0" w:color="BFBFBF"/>
+              <w:left w:val="single" w:sz="4" w:space="0" w:color="BFBFBF"/>
+              <w:bottom w:val="single" w:sz="4" w:space="0" w:color="BFBFBF"/>
+              <w:right w:val="single" w:sz="4" w:space="0" w:color="BFBFBF"/>
+            </w:tcBorders>
+            <w:tcMar>
+              <w:top w:w="100" w:type="dxa"/>
+              <w:left w:w="120" w:type="dxa"/>
+              <w:bottom w:w="100" w:type="dxa"/>
+              <w:right w:w="120" w:type="dxa"/>
+            </w:tcMar>
+            <w:vAlign w:val="center"/>
+            <w:hideMark/>
+          </w:tcPr>
+          <w:p>
+            <w:pPr>
+              <w:pStyle w:val="ac"/>
+              <w:spacing w:before="183" w:line="309" w:lineRule="auto"/>
+              <w:ind w:right="163"/>
+              <w:rPr>
+                <w:lang w:val="en-US"/>
+              </w:rPr>
+            </w:pPr>
+            <w:proofErr w:type="spellStart"/>
+            <w:r>
+              <w:rPr>
+                <w:lang w:val="en-US"/>
+              </w:rPr>
+              <w:t>str_</w:t>
+            </w:r>
+            <w:proofErr w:type="gramStart"/>
+            <w:r>
+              <w:rPr>
+                <w:lang w:val="en-US"/>
+              </w:rPr>
+              <w:t>check</w:t>
+            </w:r>
+            <w:proofErr w:type="spellEnd"/>
+            <w:r>
+              <w:rPr>
+                <w:lang w:val="en-US"/>
+              </w:rPr>
+              <w:t>(</w:t>
+            </w:r>
+            <w:proofErr w:type="gramEnd"/>
+            <w:r>
+              <w:rPr>
+                <w:lang w:val="en-US"/>
+              </w:rPr>
+              <w:t>const char* a, const char* b)</w:t>
+            </w:r>
+          </w:p>
+        </w:tc>
+        <w:tc>
+          <w:tcPr>
+            <w:tcW w:w="5497" w:type="dxa"/>
+            <w:tcBorders>
+              <w:top w:val="single" w:sz="4" w:space="0" w:color="BFBFBF"/>
+              <w:left w:val="single" w:sz="4" w:space="0" w:color="BFBFBF"/>
+              <w:bottom w:val="single" w:sz="4" w:space="0" w:color="BFBFBF"/>
+              <w:right w:val="single" w:sz="4" w:space="0" w:color="BFBFBF"/>
+            </w:tcBorders>
+            <w:tcMar>
+              <w:top w:w="100" w:type="dxa"/>
+              <w:left w:w="120" w:type="dxa"/>
+              <w:bottom w:w="100" w:type="dxa"/>
+              <w:right w:w="120" w:type="dxa"/>
+            </w:tcMar>
+            <w:vAlign w:val="center"/>
+            <w:hideMark/>
+          </w:tcPr>
+          <w:p>
+            <w:pPr>
+              <w:pStyle w:val="ac"/>
+              <w:spacing w:before="183" w:line="309" w:lineRule="auto"/>
+              <w:ind w:right="163"/>
+            </w:pPr>
+            <w:r>
+              <w:t>Сравнивает две строки на полное совпадение; возвращает 1, если строки равны, иначе 0.</w:t>
+            </w:r>
+          </w:p>
+        </w:tc>
+      </w:tr>
+      <w:tr>
+        <w:tc>
+          <w:tcPr>
+            <w:tcW w:w="3529" w:type="dxa"/>
+            <w:tcBorders>
+              <w:top w:val="single" w:sz="4" w:space="0" w:color="BFBFBF"/>
+              <w:left w:val="single" w:sz="4" w:space="0" w:color="BFBFBF"/>
+              <w:bottom w:val="single" w:sz="4" w:space="0" w:color="BFBFBF"/>
+              <w:right w:val="single" w:sz="4" w:space="0" w:color="BFBFBF"/>
+            </w:tcBorders>
+            <w:tcMar>
+              <w:top w:w="100" w:type="dxa"/>
+              <w:left w:w="120" w:type="dxa"/>
+              <w:bottom w:w="100" w:type="dxa"/>
+              <w:right w:w="120" w:type="dxa"/>
+            </w:tcMar>
+            <w:vAlign w:val="center"/>
+            <w:hideMark/>
+          </w:tcPr>
+          <w:p>
+            <w:pPr>
+              <w:pStyle w:val="ac"/>
+              <w:spacing w:before="183" w:line="309" w:lineRule="auto"/>
+              <w:ind w:right="163"/>
+              <w:rPr>
+                <w:lang w:val="en-US"/>
+              </w:rPr>
+            </w:pPr>
+            <w:proofErr w:type="spellStart"/>
+            <w:r>
+              <w:rPr>
+                <w:lang w:val="en-US"/>
+              </w:rPr>
+              <w:t>str_</w:t>
+            </w:r>
+            <w:proofErr w:type="gramStart"/>
+            <w:r>
+              <w:rPr>
+                <w:lang w:val="en-US"/>
+              </w:rPr>
+              <w:t>cmp</w:t>
+            </w:r>
+            <w:proofErr w:type="spellEnd"/>
+            <w:r>
+              <w:rPr>
+                <w:lang w:val="en-US"/>
+              </w:rPr>
+              <w:t>(</w:t>
+            </w:r>
+            <w:proofErr w:type="gramEnd"/>
+            <w:r>
+              <w:rPr>
+                <w:lang w:val="en-US"/>
+              </w:rPr>
+              <w:t>const char* a, const char* b)</w:t>
+            </w:r>
+          </w:p>
+        </w:tc>
+        <w:tc>
+          <w:tcPr>
+            <w:tcW w:w="5497" w:type="dxa"/>
+            <w:tcBorders>
+              <w:top w:val="single" w:sz="4" w:space="0" w:color="BFBFBF"/>
+              <w:left w:val="single" w:sz="4" w:space="0" w:color="BFBFBF"/>
+              <w:bottom w:val="single" w:sz="4" w:space="0" w:color="BFBFBF"/>
+              <w:right w:val="single" w:sz="4" w:space="0" w:color="BFBFBF"/>
+            </w:tcBorders>
+            <w:tcMar>
+              <w:top w:w="100" w:type="dxa"/>
+              <w:left w:w="120" w:type="dxa"/>
+              <w:bottom w:w="100" w:type="dxa"/>
+              <w:right w:w="120" w:type="dxa"/>
+            </w:tcMar>
+            <w:vAlign w:val="center"/>
+            <w:hideMark/>
+          </w:tcPr>
+          <w:p>
+            <w:pPr>
+              <w:pStyle w:val="ac"/>
+              <w:spacing w:before="183" w:line="309" w:lineRule="auto"/>
+              <w:ind w:right="163"/>
+            </w:pPr>
+            <w:r>
+              <w:t>Лексикографически сравнивает две строки; возвращает -1, 0 или 1.</w:t>
+            </w:r>
+          </w:p>
+        </w:tc>
+      </w:tr>
+      <w:tr>
+        <w:tc>
+          <w:tcPr>
+            <w:tcW w:w="3529" w:type="dxa"/>
+            <w:tcBorders>
+              <w:top w:val="single" w:sz="4" w:space="0" w:color="BFBFBF"/>
+              <w:left w:val="single" w:sz="4" w:space="0" w:color="BFBFBF"/>
+              <w:bottom w:val="single" w:sz="4" w:space="0" w:color="BFBFBF"/>
+              <w:right w:val="single" w:sz="4" w:space="0" w:color="BFBFBF"/>
+            </w:tcBorders>
+            <w:tcMar>
+              <w:top w:w="100" w:type="dxa"/>
+              <w:left w:w="120" w:type="dxa"/>
+              <w:bottom w:w="100" w:type="dxa"/>
+              <w:right w:w="120" w:type="dxa"/>
+            </w:tcMar>
+            <w:vAlign w:val="center"/>
+            <w:hideMark/>
+          </w:tcPr>
+          <w:p>
+            <w:pPr>
+              <w:pStyle w:val="ac"/>
+              <w:spacing w:before="183" w:line="309" w:lineRule="auto"/>
+              <w:ind w:right="163"/>
+            </w:pPr>
+            <w:proofErr w:type="spellStart"/>
+            <w:proofErr w:type="gramStart"/>
+            <w:r>
+              <w:t>backspace</w:t>
+            </w:r>
+            <w:proofErr w:type="spellEnd"/>
+            <w:r>
+              <w:t>(</w:t>
+            </w:r>
+            <w:proofErr w:type="gramEnd"/>
+            <w:r>
+              <w:t>)</w:t>
+            </w:r>
+          </w:p>
+        </w:tc>
+        <w:tc>
+          <w:tcPr>
+            <w:tcW w:w="5497" w:type="dxa"/>
+            <w:tcBorders>
+              <w:top w:val="single" w:sz="4" w:space="0" w:color="BFBFBF"/>
+              <w:left w:val="single" w:sz="4" w:space="0" w:color="BFBFBF"/>
+              <w:bottom w:val="single" w:sz="4" w:space="0" w:color="BFBFBF"/>
+              <w:right w:val="single" w:sz="4" w:space="0" w:color="BFBFBF"/>
+            </w:tcBorders>
+            <w:tcMar>
+              <w:top w:w="100" w:type="dxa"/>
+              <w:left w:w="120" w:type="dxa"/>
+              <w:bottom w:w="100" w:type="dxa"/>
+              <w:right w:w="120" w:type="dxa"/>
+            </w:tcMar>
+            <w:vAlign w:val="center"/>
+            <w:hideMark/>
+          </w:tcPr>
+          <w:p>
+            <w:pPr>
+              <w:pStyle w:val="ac"/>
+              <w:spacing w:before="183" w:line="309" w:lineRule="auto"/>
+              <w:ind w:right="163"/>
+            </w:pPr>
+            <w:r>
+              <w:t xml:space="preserve">Удаляет последний выведенный на экран символ и сдвигает курсор на одну </w:t>
+            </w:r>
+            <w:r>
+              <w:lastRenderedPageBreak/>
+              <w:t>позицию назад.</w:t>
+            </w:r>
+          </w:p>
+        </w:tc>
+      </w:tr>
+      <w:tr>
+        <w:tc>
+          <w:tcPr>
+            <w:tcW w:w="3529" w:type="dxa"/>
+            <w:tcBorders>
+              <w:top w:val="single" w:sz="4" w:space="0" w:color="BFBFBF"/>
+              <w:left w:val="single" w:sz="4" w:space="0" w:color="BFBFBF"/>
+              <w:bottom w:val="single" w:sz="4" w:space="0" w:color="BFBFBF"/>
+              <w:right w:val="single" w:sz="4" w:space="0" w:color="BFBFBF"/>
+            </w:tcBorders>
+            <w:tcMar>
+              <w:top w:w="100" w:type="dxa"/>
+              <w:left w:w="120" w:type="dxa"/>
+              <w:bottom w:w="100" w:type="dxa"/>
+              <w:right w:w="120" w:type="dxa"/>
+            </w:tcMar>
+            <w:vAlign w:val="center"/>
+            <w:hideMark/>
+          </w:tcPr>
+          <w:p>
+            <w:pPr>
+              <w:pStyle w:val="ac"/>
+              <w:spacing w:before="183" w:line="309" w:lineRule="auto"/>
+              <w:ind w:right="163"/>
+            </w:pPr>
+            <w:proofErr w:type="spellStart"/>
+            <w:r>
+              <w:lastRenderedPageBreak/>
+              <w:t>scanf_</w:t>
+            </w:r>
+            <w:proofErr w:type="gramStart"/>
+            <w:r>
+              <w:t>S</w:t>
+            </w:r>
+            <w:proofErr w:type="spellEnd"/>
+            <w:r>
+              <w:t>(</w:t>
+            </w:r>
+            <w:proofErr w:type="gramEnd"/>
+            <w:r>
+              <w:t>)</w:t>
+            </w:r>
+          </w:p>
+        </w:tc>
+        <w:tc>
+          <w:tcPr>
+            <w:tcW w:w="5497" w:type="dxa"/>
+            <w:tcBorders>
+              <w:top w:val="single" w:sz="4" w:space="0" w:color="BFBFBF"/>
+              <w:left w:val="single" w:sz="4" w:space="0" w:color="BFBFBF"/>
+              <w:bottom w:val="single" w:sz="4" w:space="0" w:color="BFBFBF"/>
+              <w:right w:val="single" w:sz="4" w:space="0" w:color="BFBFBF"/>
+            </w:tcBorders>
+            <w:tcMar>
+              <w:top w:w="100" w:type="dxa"/>
+              <w:left w:w="120" w:type="dxa"/>
+              <w:bottom w:w="100" w:type="dxa"/>
+              <w:right w:w="120" w:type="dxa"/>
+            </w:tcMar>
+            <w:vAlign w:val="center"/>
+            <w:hideMark/>
+          </w:tcPr>
+          <w:p>
+            <w:pPr>
+              <w:pStyle w:val="ac"/>
+              <w:spacing w:before="183" w:line="309" w:lineRule="auto"/>
+              <w:ind w:right="163"/>
+            </w:pPr>
+            <w:r>
+              <w:t>Опрашивает контроллер клавиатуры (порты 0x60/0x64) и преобразует скан-код нажатой клавиши в соответствующий символ.</w:t>
+            </w:r>
+          </w:p>
+        </w:tc>
+      </w:tr>
+      <w:tr>
+        <w:tc>
+          <w:tcPr>
+            <w:tcW w:w="3529" w:type="dxa"/>
+            <w:tcBorders>
+              <w:top w:val="single" w:sz="4" w:space="0" w:color="BFBFBF"/>
+              <w:left w:val="single" w:sz="4" w:space="0" w:color="BFBFBF"/>
+              <w:bottom w:val="single" w:sz="4" w:space="0" w:color="BFBFBF"/>
+              <w:right w:val="single" w:sz="4" w:space="0" w:color="BFBFBF"/>
+            </w:tcBorders>
+            <w:tcMar>
+              <w:top w:w="100" w:type="dxa"/>
+              <w:left w:w="120" w:type="dxa"/>
+              <w:bottom w:w="100" w:type="dxa"/>
+              <w:right w:w="120" w:type="dxa"/>
+            </w:tcMar>
+            <w:vAlign w:val="center"/>
+            <w:hideMark/>
+          </w:tcPr>
+          <w:p>
+            <w:pPr>
+              <w:pStyle w:val="ac"/>
+              <w:spacing w:before="183" w:line="309" w:lineRule="auto"/>
+              <w:ind w:right="163"/>
+              <w:rPr>
+                <w:lang w:val="en-US"/>
+              </w:rPr>
+            </w:pPr>
+            <w:proofErr w:type="spellStart"/>
+            <w:r>
+              <w:rPr>
+                <w:lang w:val="en-US"/>
+              </w:rPr>
+              <w:t>index_to_</w:t>
+            </w:r>
+            <w:proofErr w:type="gramStart"/>
+            <w:r>
+              <w:rPr>
+                <w:lang w:val="en-US"/>
+              </w:rPr>
+              <w:t>symbol</w:t>
+            </w:r>
+            <w:proofErr w:type="spellEnd"/>
+            <w:r>
+              <w:rPr>
+                <w:lang w:val="en-US"/>
+              </w:rPr>
+              <w:t>(</w:t>
+            </w:r>
+            <w:proofErr w:type="gramEnd"/>
+            <w:r>
+              <w:rPr>
+                <w:lang w:val="en-US"/>
+              </w:rPr>
+              <w:t>int index, int k)</w:t>
+            </w:r>
+          </w:p>
+        </w:tc>
+        <w:tc>
+          <w:tcPr>
+            <w:tcW w:w="5497" w:type="dxa"/>
+            <w:tcBorders>
+              <w:top w:val="single" w:sz="4" w:space="0" w:color="BFBFBF"/>
+              <w:left w:val="single" w:sz="4" w:space="0" w:color="BFBFBF"/>
+              <w:bottom w:val="single" w:sz="4" w:space="0" w:color="BFBFBF"/>
+              <w:right w:val="single" w:sz="4" w:space="0" w:color="BFBFBF"/>
+            </w:tcBorders>
+            <w:tcMar>
+              <w:top w:w="100" w:type="dxa"/>
+              <w:left w:w="120" w:type="dxa"/>
+              <w:bottom w:w="100" w:type="dxa"/>
+              <w:right w:w="120" w:type="dxa"/>
+            </w:tcMar>
+            <w:vAlign w:val="center"/>
+            <w:hideMark/>
+          </w:tcPr>
+          <w:p>
+            <w:pPr>
+              <w:pStyle w:val="ac"/>
+              <w:spacing w:before="183" w:line="309" w:lineRule="auto"/>
+              <w:ind w:right="163"/>
+            </w:pPr>
+            <w:r>
+              <w:t xml:space="preserve">Преобразует числовой индекс буквы (0–25) в символ и добавляет его в массив </w:t>
+            </w:r>
+            <w:proofErr w:type="spellStart"/>
+            <w:r>
+              <w:t>turn_symbols</w:t>
+            </w:r>
+            <w:proofErr w:type="spellEnd"/>
+            <w:r>
+              <w:t>.</w:t>
+            </w:r>
+          </w:p>
+        </w:tc>
+      </w:tr>
+      <w:tr>
+        <w:tc>
+          <w:tcPr>
+            <w:tcW w:w="3529" w:type="dxa"/>
+            <w:tcBorders>
+              <w:top w:val="single" w:sz="4" w:space="0" w:color="BFBFBF"/>
+              <w:left w:val="single" w:sz="4" w:space="0" w:color="BFBFBF"/>
+              <w:bottom w:val="single" w:sz="4" w:space="0" w:color="BFBFBF"/>
+              <w:right w:val="single" w:sz="4" w:space="0" w:color="BFBFBF"/>
+            </w:tcBorders>
+            <w:tcMar>
+              <w:top w:w="100" w:type="dxa"/>
+              <w:left w:w="120" w:type="dxa"/>
+              <w:bottom w:w="100" w:type="dxa"/>
+              <w:right w:w="120" w:type="dxa"/>
+            </w:tcMar>
+            <w:vAlign w:val="center"/>
+            <w:hideMark/>
+          </w:tcPr>
+          <w:p>
+            <w:pPr>
+              <w:pStyle w:val="ac"/>
+              <w:spacing w:before="183" w:line="309" w:lineRule="auto"/>
+              <w:ind w:right="163"/>
+            </w:pPr>
+            <w:proofErr w:type="spellStart"/>
+            <w:r>
+              <w:t>find_turn_</w:t>
+            </w:r>
+            <w:proofErr w:type="gramStart"/>
+            <w:r>
+              <w:t>symbols</w:t>
+            </w:r>
+            <w:proofErr w:type="spellEnd"/>
+            <w:r>
+              <w:t>(</w:t>
+            </w:r>
+            <w:proofErr w:type="gramEnd"/>
+            <w:r>
+              <w:t>)</w:t>
+            </w:r>
+          </w:p>
+        </w:tc>
+        <w:tc>
+          <w:tcPr>
+            <w:tcW w:w="5497" w:type="dxa"/>
+            <w:tcBorders>
+              <w:top w:val="single" w:sz="4" w:space="0" w:color="BFBFBF"/>
+              <w:left w:val="single" w:sz="4" w:space="0" w:color="BFBFBF"/>
+              <w:bottom w:val="single" w:sz="4" w:space="0" w:color="BFBFBF"/>
+              <w:right w:val="single" w:sz="4" w:space="0" w:color="BFBFBF"/>
+            </w:tcBorders>
+            <w:tcMar>
+              <w:top w:w="100" w:type="dxa"/>
+              <w:left w:w="120" w:type="dxa"/>
+              <w:bottom w:w="100" w:type="dxa"/>
+              <w:right w:w="120" w:type="dxa"/>
+            </w:tcMar>
+            <w:vAlign w:val="center"/>
+            <w:hideMark/>
+          </w:tcPr>
+          <w:p>
+            <w:pPr>
+              <w:pStyle w:val="ac"/>
+              <w:spacing w:before="183" w:line="309" w:lineRule="auto"/>
+              <w:ind w:right="163"/>
+            </w:pPr>
+            <w:r>
+              <w:t xml:space="preserve">Считывает массив </w:t>
+            </w:r>
+            <w:proofErr w:type="spellStart"/>
+            <w:r>
+              <w:t>boot_letters</w:t>
+            </w:r>
+            <w:proofErr w:type="spellEnd"/>
+            <w:r>
+              <w:t xml:space="preserve"> и формирует массив </w:t>
+            </w:r>
+            <w:proofErr w:type="spellStart"/>
+            <w:r>
+              <w:t>turn_symbols</w:t>
+            </w:r>
+            <w:proofErr w:type="spellEnd"/>
+            <w:r>
+              <w:t xml:space="preserve"> из букв, отмеченных как загруженные.</w:t>
+            </w:r>
+          </w:p>
+        </w:tc>
+      </w:tr>
+      <w:tr>
+        <w:tc>
+          <w:tcPr>
+            <w:tcW w:w="3529" w:type="dxa"/>
+            <w:tcBorders>
+              <w:top w:val="single" w:sz="4" w:space="0" w:color="BFBFBF"/>
+              <w:left w:val="single" w:sz="4" w:space="0" w:color="BFBFBF"/>
+              <w:bottom w:val="single" w:sz="4" w:space="0" w:color="BFBFBF"/>
+              <w:right w:val="single" w:sz="4" w:space="0" w:color="BFBFBF"/>
+            </w:tcBorders>
+            <w:tcMar>
+              <w:top w:w="100" w:type="dxa"/>
+              <w:left w:w="120" w:type="dxa"/>
+              <w:bottom w:w="100" w:type="dxa"/>
+              <w:right w:w="120" w:type="dxa"/>
+            </w:tcMar>
+            <w:vAlign w:val="center"/>
+            <w:hideMark/>
+          </w:tcPr>
+          <w:p>
+            <w:pPr>
+              <w:pStyle w:val="ac"/>
+              <w:spacing w:before="183" w:line="309" w:lineRule="auto"/>
+              <w:ind w:right="163"/>
+              <w:rPr>
+                <w:lang w:val="en-US"/>
+              </w:rPr>
+            </w:pPr>
+            <w:proofErr w:type="spellStart"/>
+            <w:r>
+              <w:rPr>
+                <w:lang w:val="en-US"/>
+              </w:rPr>
+              <w:t>letter_is_</w:t>
+            </w:r>
+            <w:proofErr w:type="gramStart"/>
+            <w:r>
+              <w:rPr>
+                <w:lang w:val="en-US"/>
+              </w:rPr>
+              <w:t>allowed</w:t>
+            </w:r>
+            <w:proofErr w:type="spellEnd"/>
+            <w:r>
+              <w:rPr>
+                <w:lang w:val="en-US"/>
+              </w:rPr>
+              <w:t>(</w:t>
+            </w:r>
+            <w:proofErr w:type="gramEnd"/>
+            <w:r>
+              <w:rPr>
+                <w:lang w:val="en-US"/>
+              </w:rPr>
+              <w:t>char c)</w:t>
+            </w:r>
+          </w:p>
+        </w:tc>
+        <w:tc>
+          <w:tcPr>
+            <w:tcW w:w="5497" w:type="dxa"/>
+            <w:tcBorders>
+              <w:top w:val="single" w:sz="4" w:space="0" w:color="BFBFBF"/>
+              <w:left w:val="single" w:sz="4" w:space="0" w:color="BFBFBF"/>
+              <w:bottom w:val="single" w:sz="4" w:space="0" w:color="BFBFBF"/>
+              <w:right w:val="single" w:sz="4" w:space="0" w:color="BFBFBF"/>
+            </w:tcBorders>
+            <w:tcMar>
+              <w:top w:w="100" w:type="dxa"/>
+              <w:left w:w="120" w:type="dxa"/>
+              <w:bottom w:w="100" w:type="dxa"/>
+              <w:right w:w="120" w:type="dxa"/>
+            </w:tcMar>
+            <w:vAlign w:val="center"/>
+            <w:hideMark/>
+          </w:tcPr>
+          <w:p>
+            <w:pPr>
+              <w:pStyle w:val="ac"/>
+              <w:spacing w:before="183" w:line="309" w:lineRule="auto"/>
+              <w:ind w:right="163"/>
+            </w:pPr>
+            <w:r>
+              <w:t xml:space="preserve">Проверяет, входит ли заданный символ в число разрешённых (загруженных) букв </w:t>
+            </w:r>
+            <w:proofErr w:type="spellStart"/>
+            <w:r>
+              <w:t>turn_symbols</w:t>
+            </w:r>
+            <w:proofErr w:type="spellEnd"/>
+            <w:r>
+              <w:t>.</w:t>
+            </w:r>
+          </w:p>
+        </w:tc>
+      </w:tr>
+      <w:tr>
+        <w:tc>
+          <w:tcPr>
+            <w:tcW w:w="3529" w:type="dxa"/>
+            <w:tcBorders>
+              <w:top w:val="single" w:sz="4" w:space="0" w:color="BFBFBF"/>
+              <w:left w:val="single" w:sz="4" w:space="0" w:color="BFBFBF"/>
+              <w:bottom w:val="single" w:sz="4" w:space="0" w:color="BFBFBF"/>
+              <w:right w:val="single" w:sz="4" w:space="0" w:color="BFBFBF"/>
+            </w:tcBorders>
+            <w:tcMar>
+              <w:top w:w="100" w:type="dxa"/>
+              <w:left w:w="120" w:type="dxa"/>
+              <w:bottom w:w="100" w:type="dxa"/>
+              <w:right w:w="120" w:type="dxa"/>
+            </w:tcMar>
+            <w:vAlign w:val="center"/>
+            <w:hideMark/>
+          </w:tcPr>
+          <w:p>
+            <w:pPr>
+              <w:pStyle w:val="ac"/>
+              <w:spacing w:before="183" w:line="309" w:lineRule="auto"/>
+              <w:ind w:right="163"/>
+            </w:pPr>
+            <w:proofErr w:type="spellStart"/>
+            <w:r>
+              <w:t>number_of_loaded_</w:t>
+            </w:r>
+            <w:proofErr w:type="gramStart"/>
+            <w:r>
+              <w:t>words</w:t>
+            </w:r>
+            <w:proofErr w:type="spellEnd"/>
+            <w:r>
+              <w:t>(</w:t>
+            </w:r>
+            <w:proofErr w:type="gramEnd"/>
+            <w:r>
+              <w:t>)</w:t>
+            </w:r>
+          </w:p>
+        </w:tc>
+        <w:tc>
+          <w:tcPr>
+            <w:tcW w:w="5497" w:type="dxa"/>
+            <w:tcBorders>
+              <w:top w:val="single" w:sz="4" w:space="0" w:color="BFBFBF"/>
+              <w:left w:val="single" w:sz="4" w:space="0" w:color="BFBFBF"/>
+              <w:bottom w:val="single" w:sz="4" w:space="0" w:color="BFBFBF"/>
+              <w:right w:val="single" w:sz="4" w:space="0" w:color="BFBFBF"/>
+            </w:tcBorders>
+            <w:tcMar>
+              <w:top w:w="100" w:type="dxa"/>
+              <w:left w:w="120" w:type="dxa"/>
+              <w:bottom w:w="100" w:type="dxa"/>
+              <w:right w:w="120" w:type="dxa"/>
+            </w:tcMar>
+            <w:vAlign w:val="center"/>
+            <w:hideMark/>
+          </w:tcPr>
+          <w:p>
+            <w:pPr>
+              <w:pStyle w:val="ac"/>
+              <w:spacing w:before="183" w:line="309" w:lineRule="auto"/>
+              <w:ind w:right="163"/>
+            </w:pPr>
+            <w:r>
+              <w:t>Подсчитывает общее количество слов словаря, начинающихся с любой из загруженных букв.</w:t>
+            </w:r>
+          </w:p>
+        </w:tc>
+      </w:tr>
+      <w:tr>
+        <w:tc>
+          <w:tcPr>
+            <w:tcW w:w="3529" w:type="dxa"/>
+            <w:tcBorders>
+              <w:top w:val="single" w:sz="4" w:space="0" w:color="BFBFBF"/>
+              <w:left w:val="single" w:sz="4" w:space="0" w:color="BFBFBF"/>
+              <w:bottom w:val="single" w:sz="4" w:space="0" w:color="BFBFBF"/>
+              <w:right w:val="single" w:sz="4" w:space="0" w:color="BFBFBF"/>
+            </w:tcBorders>
+            <w:tcMar>
+              <w:top w:w="100" w:type="dxa"/>
+              <w:left w:w="120" w:type="dxa"/>
+              <w:bottom w:w="100" w:type="dxa"/>
+              <w:right w:w="120" w:type="dxa"/>
+            </w:tcMar>
+            <w:vAlign w:val="center"/>
+            <w:hideMark/>
+          </w:tcPr>
+          <w:p>
+            <w:pPr>
+              <w:pStyle w:val="ac"/>
+              <w:spacing w:before="183" w:line="309" w:lineRule="auto"/>
+              <w:ind w:right="163"/>
+            </w:pPr>
+            <w:proofErr w:type="spellStart"/>
+            <w:r>
+              <w:t>put_</w:t>
+            </w:r>
+            <w:proofErr w:type="gramStart"/>
+            <w:r>
+              <w:t>point</w:t>
+            </w:r>
+            <w:proofErr w:type="spellEnd"/>
+            <w:r>
+              <w:t>(</w:t>
+            </w:r>
+            <w:proofErr w:type="spellStart"/>
+            <w:proofErr w:type="gramEnd"/>
+            <w:r>
+              <w:t>char</w:t>
+            </w:r>
+            <w:proofErr w:type="spellEnd"/>
+            <w:r>
+              <w:t xml:space="preserve"> </w:t>
+            </w:r>
+            <w:proofErr w:type="spellStart"/>
+            <w:r>
+              <w:t>point</w:t>
+            </w:r>
+            <w:proofErr w:type="spellEnd"/>
+            <w:r>
+              <w:t>)</w:t>
+            </w:r>
+          </w:p>
+        </w:tc>
+        <w:tc>
+          <w:tcPr>
+            <w:tcW w:w="5497" w:type="dxa"/>
+            <w:tcBorders>
+              <w:top w:val="single" w:sz="4" w:space="0" w:color="BFBFBF"/>
+              <w:left w:val="single" w:sz="4" w:space="0" w:color="BFBFBF"/>
+              <w:bottom w:val="single" w:sz="4" w:space="0" w:color="BFBFBF"/>
+              <w:right w:val="single" w:sz="4" w:space="0" w:color="BFBFBF"/>
+            </w:tcBorders>
+            <w:tcMar>
+              <w:top w:w="100" w:type="dxa"/>
+              <w:left w:w="120" w:type="dxa"/>
+              <w:bottom w:w="100" w:type="dxa"/>
+              <w:right w:w="120" w:type="dxa"/>
+            </w:tcMar>
+            <w:vAlign w:val="center"/>
+            <w:hideMark/>
+          </w:tcPr>
+          <w:p>
+            <w:pPr>
+              <w:pStyle w:val="ac"/>
+              <w:spacing w:before="183" w:line="309" w:lineRule="auto"/>
+              <w:ind w:right="163"/>
+            </w:pPr>
+            <w:r>
+              <w:t>Выводит один символ в текущую позицию курсора на экране.</w:t>
+            </w:r>
+          </w:p>
+        </w:tc>
+      </w:tr>
+      <w:tr>
+        <w:tc>
+          <w:tcPr>
+            <w:tcW w:w="3529" w:type="dxa"/>
+            <w:tcBorders>
+              <w:top w:val="single" w:sz="4" w:space="0" w:color="BFBFBF"/>
+              <w:left w:val="single" w:sz="4" w:space="0" w:color="BFBFBF"/>
+              <w:bottom w:val="single" w:sz="4" w:space="0" w:color="BFBFBF"/>
+              <w:right w:val="single" w:sz="4" w:space="0" w:color="BFBFBF"/>
+            </w:tcBorders>
+            <w:tcMar>
+              <w:top w:w="100" w:type="dxa"/>
+              <w:left w:w="120" w:type="dxa"/>
+              <w:bottom w:w="100" w:type="dxa"/>
+              <w:right w:w="120" w:type="dxa"/>
+            </w:tcMar>
+            <w:vAlign w:val="center"/>
+            <w:hideMark/>
+          </w:tcPr>
+          <w:p>
+            <w:pPr>
+              <w:pStyle w:val="ac"/>
+              <w:spacing w:before="183" w:line="309" w:lineRule="auto"/>
+              <w:ind w:right="163"/>
+            </w:pPr>
+            <w:proofErr w:type="spellStart"/>
+            <w:r>
+              <w:t>print_</w:t>
+            </w:r>
+            <w:proofErr w:type="gramStart"/>
+            <w:r>
+              <w:t>count</w:t>
+            </w:r>
+            <w:proofErr w:type="spellEnd"/>
+            <w:r>
+              <w:t>(</w:t>
+            </w:r>
+            <w:proofErr w:type="spellStart"/>
+            <w:proofErr w:type="gramEnd"/>
+            <w:r>
+              <w:t>int</w:t>
+            </w:r>
+            <w:proofErr w:type="spellEnd"/>
+            <w:r>
+              <w:t xml:space="preserve"> </w:t>
+            </w:r>
+            <w:proofErr w:type="spellStart"/>
+            <w:r>
+              <w:t>count</w:t>
+            </w:r>
+            <w:proofErr w:type="spellEnd"/>
+            <w:r>
+              <w:t>)</w:t>
+            </w:r>
+          </w:p>
+        </w:tc>
+        <w:tc>
+          <w:tcPr>
+            <w:tcW w:w="5497" w:type="dxa"/>
+            <w:tcBorders>
+              <w:top w:val="single" w:sz="4" w:space="0" w:color="BFBFBF"/>
+              <w:left w:val="single" w:sz="4" w:space="0" w:color="BFBFBF"/>
+              <w:bottom w:val="single" w:sz="4" w:space="0" w:color="BFBFBF"/>
+              <w:right w:val="single" w:sz="4" w:space="0" w:color="BFBFBF"/>
+            </w:tcBorders>
+            <w:tcMar>
+              <w:top w:w="100" w:type="dxa"/>
+              <w:left w:w="120" w:type="dxa"/>
+              <w:bottom w:w="100" w:type="dxa"/>
+              <w:right w:w="120" w:type="dxa"/>
+            </w:tcMar>
+            <w:vAlign w:val="center"/>
+            <w:hideMark/>
+          </w:tcPr>
+          <w:p>
+            <w:pPr>
+              <w:pStyle w:val="ac"/>
+              <w:spacing w:before="183" w:line="309" w:lineRule="auto"/>
+              <w:ind w:right="163"/>
+            </w:pPr>
+            <w:r>
+              <w:t>Преобразует целое число в последовательность цифр и выводит его на экран.</w:t>
+            </w:r>
+          </w:p>
+        </w:tc>
+      </w:tr>
+      <w:tr>
+        <w:tc>
+          <w:tcPr>
+            <w:tcW w:w="3529" w:type="dxa"/>
+            <w:tcBorders>
+              <w:top w:val="single" w:sz="4" w:space="0" w:color="BFBFBF"/>
+              <w:left w:val="single" w:sz="4" w:space="0" w:color="BFBFBF"/>
+              <w:bottom w:val="single" w:sz="4" w:space="0" w:color="BFBFBF"/>
+              <w:right w:val="single" w:sz="4" w:space="0" w:color="BFBFBF"/>
+            </w:tcBorders>
+            <w:tcMar>
+              <w:top w:w="100" w:type="dxa"/>
+              <w:left w:w="120" w:type="dxa"/>
+              <w:bottom w:w="100" w:type="dxa"/>
+              <w:right w:w="120" w:type="dxa"/>
+            </w:tcMar>
+            <w:vAlign w:val="center"/>
+            <w:hideMark/>
+          </w:tcPr>
+          <w:p>
+            <w:pPr>
+              <w:pStyle w:val="ac"/>
+              <w:spacing w:before="183" w:line="309" w:lineRule="auto"/>
+              <w:ind w:right="163"/>
+            </w:pPr>
+            <w:proofErr w:type="spellStart"/>
+            <w:r>
+              <w:t>back_</w:t>
+            </w:r>
+            <w:proofErr w:type="gramStart"/>
+            <w:r>
+              <w:t>n</w:t>
+            </w:r>
+            <w:proofErr w:type="spellEnd"/>
+            <w:r>
+              <w:t>(</w:t>
+            </w:r>
+            <w:proofErr w:type="gramEnd"/>
+            <w:r>
+              <w:t>)</w:t>
+            </w:r>
+          </w:p>
+        </w:tc>
+        <w:tc>
+          <w:tcPr>
+            <w:tcW w:w="5497" w:type="dxa"/>
+            <w:tcBorders>
+              <w:top w:val="single" w:sz="4" w:space="0" w:color="BFBFBF"/>
+              <w:left w:val="single" w:sz="4" w:space="0" w:color="BFBFBF"/>
+              <w:bottom w:val="single" w:sz="4" w:space="0" w:color="BFBFBF"/>
+              <w:right w:val="single" w:sz="4" w:space="0" w:color="BFBFBF"/>
+            </w:tcBorders>
+            <w:tcMar>
+              <w:top w:w="100" w:type="dxa"/>
+              <w:left w:w="120" w:type="dxa"/>
+              <w:bottom w:w="100" w:type="dxa"/>
+              <w:right w:w="120" w:type="dxa"/>
+            </w:tcMar>
+            <w:vAlign w:val="center"/>
+            <w:hideMark/>
+          </w:tcPr>
+          <w:p>
+            <w:pPr>
+              <w:pStyle w:val="ac"/>
+              <w:spacing w:before="183" w:line="309" w:lineRule="auto"/>
+              <w:ind w:right="163"/>
+            </w:pPr>
+            <w:r>
+              <w:t>Переводит курсор на начало следующей строки (аналог символа новой строки).</w:t>
+            </w:r>
+          </w:p>
+        </w:tc>
+      </w:tr>
+      <w:tr>
+        <w:tc>
+          <w:tcPr>
+            <w:tcW w:w="3529" w:type="dxa"/>
+            <w:tcBorders>
+              <w:top w:val="single" w:sz="4" w:space="0" w:color="BFBFBF"/>
+              <w:left w:val="single" w:sz="4" w:space="0" w:color="BFBFBF"/>
+              <w:bottom w:val="single" w:sz="4" w:space="0" w:color="BFBFBF"/>
+              <w:right w:val="single" w:sz="4" w:space="0" w:color="BFBFBF"/>
+            </w:tcBorders>
+            <w:tcMar>
+              <w:top w:w="100" w:type="dxa"/>
+              <w:left w:w="120" w:type="dxa"/>
+              <w:bottom w:w="100" w:type="dxa"/>
+              <w:right w:w="120" w:type="dxa"/>
+            </w:tcMar>
+            <w:vAlign w:val="center"/>
+            <w:hideMark/>
+          </w:tcPr>
+          <w:p>
+            <w:pPr>
+              <w:pStyle w:val="ac"/>
+              <w:spacing w:before="183" w:line="309" w:lineRule="auto"/>
+              <w:ind w:right="163"/>
+            </w:pPr>
+            <w:proofErr w:type="spellStart"/>
+            <w:proofErr w:type="gramStart"/>
+            <w:r>
+              <w:lastRenderedPageBreak/>
+              <w:t>clear</w:t>
+            </w:r>
+            <w:proofErr w:type="spellEnd"/>
+            <w:r>
+              <w:t>(</w:t>
+            </w:r>
+            <w:proofErr w:type="gramEnd"/>
+            <w:r>
+              <w:t>)</w:t>
+            </w:r>
+          </w:p>
+        </w:tc>
+        <w:tc>
+          <w:tcPr>
+            <w:tcW w:w="5497" w:type="dxa"/>
+            <w:tcBorders>
+              <w:top w:val="single" w:sz="4" w:space="0" w:color="BFBFBF"/>
+              <w:left w:val="single" w:sz="4" w:space="0" w:color="BFBFBF"/>
+              <w:bottom w:val="single" w:sz="4" w:space="0" w:color="BFBFBF"/>
+              <w:right w:val="single" w:sz="4" w:space="0" w:color="BFBFBF"/>
+            </w:tcBorders>
+            <w:tcMar>
+              <w:top w:w="100" w:type="dxa"/>
+              <w:left w:w="120" w:type="dxa"/>
+              <w:bottom w:w="100" w:type="dxa"/>
+              <w:right w:w="120" w:type="dxa"/>
+            </w:tcMar>
+            <w:vAlign w:val="center"/>
+            <w:hideMark/>
+          </w:tcPr>
+          <w:p>
+            <w:pPr>
+              <w:pStyle w:val="ac"/>
+              <w:spacing w:before="183" w:line="309" w:lineRule="auto"/>
+              <w:ind w:right="163"/>
+            </w:pPr>
+            <w:r>
+              <w:t>Очищает весь экран (заполняет видеопамять пробелами) и сбрасывает позицию курсора в начало.</w:t>
+            </w:r>
+          </w:p>
+        </w:tc>
+      </w:tr>
+      <w:tr>
+        <w:tc>
+          <w:tcPr>
+            <w:tcW w:w="3529" w:type="dxa"/>
+            <w:tcBorders>
+              <w:top w:val="single" w:sz="4" w:space="0" w:color="BFBFBF"/>
+              <w:left w:val="single" w:sz="4" w:space="0" w:color="BFBFBF"/>
+              <w:bottom w:val="single" w:sz="4" w:space="0" w:color="BFBFBF"/>
+              <w:right w:val="single" w:sz="4" w:space="0" w:color="BFBFBF"/>
+            </w:tcBorders>
+            <w:tcMar>
+              <w:top w:w="100" w:type="dxa"/>
+              <w:left w:w="120" w:type="dxa"/>
+              <w:bottom w:w="100" w:type="dxa"/>
+              <w:right w:w="120" w:type="dxa"/>
+            </w:tcMar>
+            <w:vAlign w:val="center"/>
+            <w:hideMark/>
+          </w:tcPr>
+          <w:p>
+            <w:pPr>
+              <w:pStyle w:val="ac"/>
+              <w:spacing w:before="183" w:line="309" w:lineRule="auto"/>
+              <w:ind w:right="163"/>
+              <w:rPr>
+                <w:lang w:val="en-US"/>
+              </w:rPr>
+            </w:pPr>
+            <w:proofErr w:type="gramStart"/>
+            <w:r>
+              <w:rPr>
+                <w:lang w:val="en-US"/>
+              </w:rPr>
+              <w:t>info(</w:t>
+            </w:r>
+            <w:proofErr w:type="gramEnd"/>
+            <w:r>
+              <w:rPr>
+                <w:lang w:val="en-US"/>
+              </w:rPr>
+              <w:t xml:space="preserve">unsigned char* </w:t>
+            </w:r>
+            <w:proofErr w:type="spellStart"/>
+            <w:r>
+              <w:rPr>
+                <w:lang w:val="en-US"/>
+              </w:rPr>
+              <w:t>boot_letters</w:t>
+            </w:r>
+            <w:proofErr w:type="spellEnd"/>
+            <w:r>
+              <w:rPr>
+                <w:lang w:val="en-US"/>
+              </w:rPr>
+              <w:t>)</w:t>
+            </w:r>
+          </w:p>
+        </w:tc>
+        <w:tc>
+          <w:tcPr>
+            <w:tcW w:w="5497" w:type="dxa"/>
+            <w:tcBorders>
+              <w:top w:val="single" w:sz="4" w:space="0" w:color="BFBFBF"/>
+              <w:left w:val="single" w:sz="4" w:space="0" w:color="BFBFBF"/>
+              <w:bottom w:val="single" w:sz="4" w:space="0" w:color="BFBFBF"/>
+              <w:right w:val="single" w:sz="4" w:space="0" w:color="BFBFBF"/>
+            </w:tcBorders>
+            <w:tcMar>
+              <w:top w:w="100" w:type="dxa"/>
+              <w:left w:w="120" w:type="dxa"/>
+              <w:bottom w:w="100" w:type="dxa"/>
+              <w:right w:w="120" w:type="dxa"/>
+            </w:tcMar>
+            <w:vAlign w:val="center"/>
+            <w:hideMark/>
+          </w:tcPr>
+          <w:p>
+            <w:pPr>
+              <w:pStyle w:val="ac"/>
+              <w:spacing w:before="183" w:line="309" w:lineRule="auto"/>
+              <w:ind w:right="163"/>
+            </w:pPr>
+            <w:r>
+              <w:t>Выводит информацию об ОС (название, автор, загрузчик, ядро) и список выбранных при загрузке букв.</w:t>
+            </w:r>
+          </w:p>
+        </w:tc>
+      </w:tr>
+      <w:tr>
+        <w:tc>
+          <w:tcPr>
+            <w:tcW w:w="3529" w:type="dxa"/>
+            <w:tcBorders>
+              <w:top w:val="single" w:sz="4" w:space="0" w:color="BFBFBF"/>
+              <w:left w:val="single" w:sz="4" w:space="0" w:color="BFBFBF"/>
+              <w:bottom w:val="single" w:sz="4" w:space="0" w:color="BFBFBF"/>
+              <w:right w:val="single" w:sz="4" w:space="0" w:color="BFBFBF"/>
+            </w:tcBorders>
+            <w:tcMar>
+              <w:top w:w="100" w:type="dxa"/>
+              <w:left w:w="120" w:type="dxa"/>
+              <w:bottom w:w="100" w:type="dxa"/>
+              <w:right w:w="120" w:type="dxa"/>
+            </w:tcMar>
+            <w:vAlign w:val="center"/>
+            <w:hideMark/>
+          </w:tcPr>
+          <w:p>
+            <w:pPr>
+              <w:pStyle w:val="ac"/>
+              <w:spacing w:before="183" w:line="309" w:lineRule="auto"/>
+              <w:ind w:right="163"/>
+              <w:rPr>
+                <w:lang w:val="en-US"/>
+              </w:rPr>
+            </w:pPr>
+            <w:proofErr w:type="spellStart"/>
+            <w:r>
+              <w:rPr>
+                <w:lang w:val="en-US"/>
+              </w:rPr>
+              <w:t>proverka_loop_</w:t>
+            </w:r>
+            <w:proofErr w:type="gramStart"/>
+            <w:r>
+              <w:rPr>
+                <w:lang w:val="en-US"/>
+              </w:rPr>
+              <w:t>bool</w:t>
+            </w:r>
+            <w:proofErr w:type="spellEnd"/>
+            <w:r>
+              <w:rPr>
+                <w:lang w:val="en-US"/>
+              </w:rPr>
+              <w:t>(</w:t>
+            </w:r>
+            <w:proofErr w:type="gramEnd"/>
+            <w:r>
+              <w:rPr>
+                <w:lang w:val="en-US"/>
+              </w:rPr>
+              <w:t>char* name)</w:t>
+            </w:r>
+          </w:p>
+        </w:tc>
+        <w:tc>
+          <w:tcPr>
+            <w:tcW w:w="5497" w:type="dxa"/>
+            <w:tcBorders>
+              <w:top w:val="single" w:sz="4" w:space="0" w:color="BFBFBF"/>
+              <w:left w:val="single" w:sz="4" w:space="0" w:color="BFBFBF"/>
+              <w:bottom w:val="single" w:sz="4" w:space="0" w:color="BFBFBF"/>
+              <w:right w:val="single" w:sz="4" w:space="0" w:color="BFBFBF"/>
+            </w:tcBorders>
+            <w:tcMar>
+              <w:top w:w="100" w:type="dxa"/>
+              <w:left w:w="120" w:type="dxa"/>
+              <w:bottom w:w="100" w:type="dxa"/>
+              <w:right w:w="120" w:type="dxa"/>
+            </w:tcMar>
+            <w:vAlign w:val="center"/>
+            <w:hideMark/>
+          </w:tcPr>
+          <w:p>
+            <w:pPr>
+              <w:pStyle w:val="ac"/>
+              <w:spacing w:before="183" w:line="309" w:lineRule="auto"/>
+              <w:ind w:right="163"/>
+            </w:pPr>
+            <w:r>
+              <w:t>Проверяет, введена ли команда «</w:t>
+            </w:r>
+            <w:proofErr w:type="spellStart"/>
+            <w:r>
+              <w:t>stop</w:t>
+            </w:r>
+            <w:proofErr w:type="spellEnd"/>
+            <w:r>
+              <w:t>»; возвращает 0 для завершения главного цикла, иначе 1.</w:t>
+            </w:r>
+          </w:p>
+        </w:tc>
+      </w:tr>
+      <w:tr>
+        <w:tc>
+          <w:tcPr>
+            <w:tcW w:w="3529" w:type="dxa"/>
+            <w:tcBorders>
+              <w:top w:val="single" w:sz="4" w:space="0" w:color="BFBFBF"/>
+              <w:left w:val="single" w:sz="4" w:space="0" w:color="BFBFBF"/>
+              <w:bottom w:val="single" w:sz="4" w:space="0" w:color="BFBFBF"/>
+              <w:right w:val="single" w:sz="4" w:space="0" w:color="BFBFBF"/>
+            </w:tcBorders>
+            <w:tcMar>
+              <w:top w:w="100" w:type="dxa"/>
+              <w:left w:w="120" w:type="dxa"/>
+              <w:bottom w:w="100" w:type="dxa"/>
+              <w:right w:w="120" w:type="dxa"/>
+            </w:tcMar>
+            <w:vAlign w:val="center"/>
+            <w:hideMark/>
+          </w:tcPr>
+          <w:p>
+            <w:pPr>
+              <w:pStyle w:val="ac"/>
+              <w:spacing w:before="183" w:line="309" w:lineRule="auto"/>
+              <w:ind w:right="163"/>
+            </w:pPr>
+            <w:proofErr w:type="spellStart"/>
+            <w:r>
+              <w:t>strlen_</w:t>
+            </w:r>
+            <w:proofErr w:type="gramStart"/>
+            <w:r>
+              <w:t>s</w:t>
+            </w:r>
+            <w:proofErr w:type="spellEnd"/>
+            <w:r>
+              <w:t>(</w:t>
+            </w:r>
+            <w:proofErr w:type="spellStart"/>
+            <w:proofErr w:type="gramEnd"/>
+            <w:r>
+              <w:t>char</w:t>
+            </w:r>
+            <w:proofErr w:type="spellEnd"/>
+            <w:r>
+              <w:t xml:space="preserve">* </w:t>
+            </w:r>
+            <w:proofErr w:type="spellStart"/>
+            <w:r>
+              <w:t>name</w:t>
+            </w:r>
+            <w:proofErr w:type="spellEnd"/>
+            <w:r>
+              <w:t>)</w:t>
+            </w:r>
+          </w:p>
+        </w:tc>
+        <w:tc>
+          <w:tcPr>
+            <w:tcW w:w="5497" w:type="dxa"/>
+            <w:tcBorders>
+              <w:top w:val="single" w:sz="4" w:space="0" w:color="BFBFBF"/>
+              <w:left w:val="single" w:sz="4" w:space="0" w:color="BFBFBF"/>
+              <w:bottom w:val="single" w:sz="4" w:space="0" w:color="BFBFBF"/>
+              <w:right w:val="single" w:sz="4" w:space="0" w:color="BFBFBF"/>
+            </w:tcBorders>
+            <w:tcMar>
+              <w:top w:w="100" w:type="dxa"/>
+              <w:left w:w="120" w:type="dxa"/>
+              <w:bottom w:w="100" w:type="dxa"/>
+              <w:right w:w="120" w:type="dxa"/>
+            </w:tcMar>
+            <w:vAlign w:val="center"/>
+            <w:hideMark/>
+          </w:tcPr>
+          <w:p>
+            <w:pPr>
+              <w:pStyle w:val="ac"/>
+              <w:spacing w:before="183" w:line="309" w:lineRule="auto"/>
+              <w:ind w:right="163"/>
+            </w:pPr>
+            <w:r>
+              <w:t>Вычисляет длину строки (количество символов до завершающего нуля).</w:t>
+            </w:r>
+          </w:p>
+        </w:tc>
+      </w:tr>
+      <w:tr>
+        <w:tc>
+          <w:tcPr>
+            <w:tcW w:w="3529" w:type="dxa"/>
+            <w:tcBorders>
+              <w:top w:val="single" w:sz="4" w:space="0" w:color="BFBFBF"/>
+              <w:left w:val="single" w:sz="4" w:space="0" w:color="BFBFBF"/>
+              <w:bottom w:val="single" w:sz="4" w:space="0" w:color="BFBFBF"/>
+              <w:right w:val="single" w:sz="4" w:space="0" w:color="BFBFBF"/>
+            </w:tcBorders>
+            <w:tcMar>
+              <w:top w:w="100" w:type="dxa"/>
+              <w:left w:w="120" w:type="dxa"/>
+              <w:bottom w:w="100" w:type="dxa"/>
+              <w:right w:w="120" w:type="dxa"/>
+            </w:tcMar>
+            <w:vAlign w:val="center"/>
+            <w:hideMark/>
+          </w:tcPr>
+          <w:p>
+            <w:pPr>
+              <w:pStyle w:val="ac"/>
+              <w:spacing w:before="183" w:line="309" w:lineRule="auto"/>
+              <w:ind w:right="163"/>
+            </w:pPr>
+            <w:proofErr w:type="spellStart"/>
+            <w:proofErr w:type="gramStart"/>
+            <w:r>
+              <w:t>dictinfo</w:t>
+            </w:r>
+            <w:proofErr w:type="spellEnd"/>
+            <w:r>
+              <w:t>(</w:t>
+            </w:r>
+            <w:proofErr w:type="gramEnd"/>
+            <w:r>
+              <w:t>)</w:t>
+            </w:r>
+          </w:p>
+        </w:tc>
+        <w:tc>
+          <w:tcPr>
+            <w:tcW w:w="5497" w:type="dxa"/>
+            <w:tcBorders>
+              <w:top w:val="single" w:sz="4" w:space="0" w:color="BFBFBF"/>
+              <w:left w:val="single" w:sz="4" w:space="0" w:color="BFBFBF"/>
+              <w:bottom w:val="single" w:sz="4" w:space="0" w:color="BFBFBF"/>
+              <w:right w:val="single" w:sz="4" w:space="0" w:color="BFBFBF"/>
+            </w:tcBorders>
+            <w:tcMar>
+              <w:top w:w="100" w:type="dxa"/>
+              <w:left w:w="120" w:type="dxa"/>
+              <w:bottom w:w="100" w:type="dxa"/>
+              <w:right w:w="120" w:type="dxa"/>
+            </w:tcMar>
+            <w:vAlign w:val="center"/>
+            <w:hideMark/>
+          </w:tcPr>
+          <w:p>
+            <w:pPr>
+              <w:pStyle w:val="ac"/>
+              <w:spacing w:before="183" w:line="309" w:lineRule="auto"/>
+              <w:ind w:right="163"/>
+            </w:pPr>
+            <w:r>
+              <w:t>Выводит статистику словаря: общее число английских и испанских слов, а также число загруженных слов.</w:t>
+            </w:r>
+          </w:p>
+        </w:tc>
+      </w:tr>
+      <w:tr>
+        <w:tc>
+          <w:tcPr>
+            <w:tcW w:w="3529" w:type="dxa"/>
+            <w:tcBorders>
+              <w:top w:val="single" w:sz="4" w:space="0" w:color="BFBFBF"/>
+              <w:left w:val="single" w:sz="4" w:space="0" w:color="BFBFBF"/>
+              <w:bottom w:val="single" w:sz="4" w:space="0" w:color="BFBFBF"/>
+              <w:right w:val="single" w:sz="4" w:space="0" w:color="BFBFBF"/>
+            </w:tcBorders>
+            <w:tcMar>
+              <w:top w:w="100" w:type="dxa"/>
+              <w:left w:w="120" w:type="dxa"/>
+              <w:bottom w:w="100" w:type="dxa"/>
+              <w:right w:w="120" w:type="dxa"/>
+            </w:tcMar>
+            <w:vAlign w:val="center"/>
+            <w:hideMark/>
+          </w:tcPr>
+          <w:p>
+            <w:pPr>
+              <w:pStyle w:val="ac"/>
+              <w:spacing w:before="183" w:line="309" w:lineRule="auto"/>
+              <w:ind w:right="163"/>
+              <w:rPr>
+                <w:lang w:val="en-US"/>
+              </w:rPr>
+            </w:pPr>
+            <w:proofErr w:type="spellStart"/>
+            <w:r>
+              <w:rPr>
+                <w:lang w:val="en-US"/>
+              </w:rPr>
+              <w:t>starts_with_</w:t>
+            </w:r>
+            <w:proofErr w:type="gramStart"/>
+            <w:r>
+              <w:rPr>
+                <w:lang w:val="en-US"/>
+              </w:rPr>
+              <w:t>translate</w:t>
+            </w:r>
+            <w:proofErr w:type="spellEnd"/>
+            <w:r>
+              <w:rPr>
+                <w:lang w:val="en-US"/>
+              </w:rPr>
+              <w:t>(</w:t>
+            </w:r>
+            <w:proofErr w:type="gramEnd"/>
+            <w:r>
+              <w:rPr>
+                <w:lang w:val="en-US"/>
+              </w:rPr>
+              <w:t>char* first)</w:t>
+            </w:r>
+          </w:p>
+        </w:tc>
+        <w:tc>
+          <w:tcPr>
+            <w:tcW w:w="5497" w:type="dxa"/>
+            <w:tcBorders>
+              <w:top w:val="single" w:sz="4" w:space="0" w:color="BFBFBF"/>
+              <w:left w:val="single" w:sz="4" w:space="0" w:color="BFBFBF"/>
+              <w:bottom w:val="single" w:sz="4" w:space="0" w:color="BFBFBF"/>
+              <w:right w:val="single" w:sz="4" w:space="0" w:color="BFBFBF"/>
+            </w:tcBorders>
+            <w:tcMar>
+              <w:top w:w="100" w:type="dxa"/>
+              <w:left w:w="120" w:type="dxa"/>
+              <w:bottom w:w="100" w:type="dxa"/>
+              <w:right w:w="120" w:type="dxa"/>
+            </w:tcMar>
+            <w:vAlign w:val="center"/>
+            <w:hideMark/>
+          </w:tcPr>
+          <w:p>
+            <w:pPr>
+              <w:pStyle w:val="ac"/>
+              <w:spacing w:before="183" w:line="309" w:lineRule="auto"/>
+              <w:ind w:right="163"/>
+            </w:pPr>
+            <w:r>
+              <w:t>Проверяет, начинается ли введённая строка с команды «</w:t>
+            </w:r>
+            <w:proofErr w:type="spellStart"/>
+            <w:r>
+              <w:t>translate</w:t>
+            </w:r>
+            <w:proofErr w:type="spellEnd"/>
+            <w:r>
+              <w:t>».</w:t>
+            </w:r>
+          </w:p>
+        </w:tc>
+      </w:tr>
+      <w:tr>
+        <w:tc>
+          <w:tcPr>
+            <w:tcW w:w="3529" w:type="dxa"/>
+            <w:tcBorders>
+              <w:top w:val="single" w:sz="4" w:space="0" w:color="BFBFBF"/>
+              <w:left w:val="single" w:sz="4" w:space="0" w:color="BFBFBF"/>
+              <w:bottom w:val="single" w:sz="4" w:space="0" w:color="BFBFBF"/>
+              <w:right w:val="single" w:sz="4" w:space="0" w:color="BFBFBF"/>
+            </w:tcBorders>
+            <w:tcMar>
+              <w:top w:w="100" w:type="dxa"/>
+              <w:left w:w="120" w:type="dxa"/>
+              <w:bottom w:w="100" w:type="dxa"/>
+              <w:right w:w="120" w:type="dxa"/>
+            </w:tcMar>
+            <w:vAlign w:val="center"/>
+            <w:hideMark/>
+          </w:tcPr>
+          <w:p>
+            <w:pPr>
+              <w:pStyle w:val="ac"/>
+              <w:spacing w:before="183" w:line="309" w:lineRule="auto"/>
+              <w:ind w:right="163"/>
+            </w:pPr>
+            <w:proofErr w:type="spellStart"/>
+            <w:r>
+              <w:t>binary_</w:t>
+            </w:r>
+            <w:proofErr w:type="gramStart"/>
+            <w:r>
+              <w:t>search</w:t>
+            </w:r>
+            <w:proofErr w:type="spellEnd"/>
+            <w:r>
+              <w:t>(</w:t>
+            </w:r>
+            <w:proofErr w:type="spellStart"/>
+            <w:proofErr w:type="gramEnd"/>
+            <w:r>
+              <w:t>char</w:t>
+            </w:r>
+            <w:proofErr w:type="spellEnd"/>
+            <w:r>
+              <w:t xml:space="preserve">* </w:t>
+            </w:r>
+            <w:proofErr w:type="spellStart"/>
+            <w:r>
+              <w:t>word</w:t>
+            </w:r>
+            <w:proofErr w:type="spellEnd"/>
+            <w:r>
+              <w:t>)</w:t>
+            </w:r>
+          </w:p>
+        </w:tc>
+        <w:tc>
+          <w:tcPr>
+            <w:tcW w:w="5497" w:type="dxa"/>
+            <w:tcBorders>
+              <w:top w:val="single" w:sz="4" w:space="0" w:color="BFBFBF"/>
+              <w:left w:val="single" w:sz="4" w:space="0" w:color="BFBFBF"/>
+              <w:bottom w:val="single" w:sz="4" w:space="0" w:color="BFBFBF"/>
+              <w:right w:val="single" w:sz="4" w:space="0" w:color="BFBFBF"/>
+            </w:tcBorders>
+            <w:tcMar>
+              <w:top w:w="100" w:type="dxa"/>
+              <w:left w:w="120" w:type="dxa"/>
+              <w:bottom w:w="100" w:type="dxa"/>
+              <w:right w:w="120" w:type="dxa"/>
+            </w:tcMar>
+            <w:vAlign w:val="center"/>
+            <w:hideMark/>
+          </w:tcPr>
+          <w:p>
+            <w:pPr>
+              <w:pStyle w:val="ac"/>
+              <w:spacing w:before="183" w:line="309" w:lineRule="auto"/>
+              <w:ind w:right="163"/>
+            </w:pPr>
+            <w:r>
+              <w:t xml:space="preserve">Выполняет бинарный поиск заданного слова в отсортированном массиве </w:t>
+            </w:r>
+            <w:proofErr w:type="spellStart"/>
+            <w:r>
+              <w:t>en_words</w:t>
+            </w:r>
+            <w:proofErr w:type="spellEnd"/>
+            <w:r>
+              <w:t>; возвращает его индекс или -1.</w:t>
+            </w:r>
+          </w:p>
+        </w:tc>
+      </w:tr>
+      <w:tr>
+        <w:tc>
+          <w:tcPr>
+            <w:tcW w:w="3529" w:type="dxa"/>
+            <w:tcBorders>
+              <w:top w:val="single" w:sz="4" w:space="0" w:color="BFBFBF"/>
+              <w:left w:val="single" w:sz="4" w:space="0" w:color="BFBFBF"/>
+              <w:bottom w:val="single" w:sz="4" w:space="0" w:color="BFBFBF"/>
+              <w:right w:val="single" w:sz="4" w:space="0" w:color="BFBFBF"/>
+            </w:tcBorders>
+            <w:tcMar>
+              <w:top w:w="100" w:type="dxa"/>
+              <w:left w:w="120" w:type="dxa"/>
+              <w:bottom w:w="100" w:type="dxa"/>
+              <w:right w:w="120" w:type="dxa"/>
+            </w:tcMar>
+            <w:vAlign w:val="center"/>
+            <w:hideMark/>
+          </w:tcPr>
+          <w:p>
+            <w:pPr>
+              <w:pStyle w:val="ac"/>
+              <w:spacing w:before="183" w:line="309" w:lineRule="auto"/>
+              <w:ind w:right="163"/>
+            </w:pPr>
+            <w:proofErr w:type="spellStart"/>
+            <w:proofErr w:type="gramStart"/>
+            <w:r>
+              <w:t>translate</w:t>
+            </w:r>
+            <w:proofErr w:type="spellEnd"/>
+            <w:r>
+              <w:t>(</w:t>
+            </w:r>
+            <w:proofErr w:type="spellStart"/>
+            <w:proofErr w:type="gramEnd"/>
+            <w:r>
+              <w:t>char</w:t>
+            </w:r>
+            <w:proofErr w:type="spellEnd"/>
+            <w:r>
+              <w:t xml:space="preserve">* </w:t>
+            </w:r>
+            <w:proofErr w:type="spellStart"/>
+            <w:r>
+              <w:t>name</w:t>
+            </w:r>
+            <w:proofErr w:type="spellEnd"/>
+            <w:r>
+              <w:t>)</w:t>
+            </w:r>
+          </w:p>
+        </w:tc>
+        <w:tc>
+          <w:tcPr>
+            <w:tcW w:w="5497" w:type="dxa"/>
+            <w:tcBorders>
+              <w:top w:val="single" w:sz="4" w:space="0" w:color="BFBFBF"/>
+              <w:left w:val="single" w:sz="4" w:space="0" w:color="BFBFBF"/>
+              <w:bottom w:val="single" w:sz="4" w:space="0" w:color="BFBFBF"/>
+              <w:right w:val="single" w:sz="4" w:space="0" w:color="BFBFBF"/>
+            </w:tcBorders>
+            <w:tcMar>
+              <w:top w:w="100" w:type="dxa"/>
+              <w:left w:w="120" w:type="dxa"/>
+              <w:bottom w:w="100" w:type="dxa"/>
+              <w:right w:w="120" w:type="dxa"/>
+            </w:tcMar>
+            <w:vAlign w:val="center"/>
+            <w:hideMark/>
+          </w:tcPr>
+          <w:p>
+            <w:pPr>
+              <w:pStyle w:val="ac"/>
+              <w:spacing w:before="183" w:line="309" w:lineRule="auto"/>
+              <w:ind w:right="163"/>
+            </w:pPr>
+            <w:r>
+              <w:t>Извлекает слово из введённой команды, ищет его в словаре и выводит соответствующий перевод на испанский.</w:t>
+            </w:r>
+          </w:p>
+        </w:tc>
+      </w:tr>
+      <w:tr>
+        <w:tc>
+          <w:tcPr>
+            <w:tcW w:w="3529" w:type="dxa"/>
+            <w:tcBorders>
+              <w:top w:val="single" w:sz="4" w:space="0" w:color="BFBFBF"/>
+              <w:left w:val="single" w:sz="4" w:space="0" w:color="BFBFBF"/>
+              <w:bottom w:val="single" w:sz="4" w:space="0" w:color="BFBFBF"/>
+              <w:right w:val="single" w:sz="4" w:space="0" w:color="BFBFBF"/>
+            </w:tcBorders>
+            <w:tcMar>
+              <w:top w:w="100" w:type="dxa"/>
+              <w:left w:w="120" w:type="dxa"/>
+              <w:bottom w:w="100" w:type="dxa"/>
+              <w:right w:w="120" w:type="dxa"/>
+            </w:tcMar>
+            <w:vAlign w:val="center"/>
+            <w:hideMark/>
+          </w:tcPr>
+          <w:p>
+            <w:pPr>
+              <w:pStyle w:val="ac"/>
+              <w:spacing w:before="183" w:line="309" w:lineRule="auto"/>
+              <w:ind w:right="163"/>
+              <w:rPr>
+                <w:lang w:val="en-US"/>
+              </w:rPr>
+            </w:pPr>
+            <w:proofErr w:type="spellStart"/>
+            <w:r>
+              <w:rPr>
+                <w:lang w:val="en-US"/>
+              </w:rPr>
+              <w:t>starts_with_</w:t>
+            </w:r>
+            <w:proofErr w:type="gramStart"/>
+            <w:r>
+              <w:rPr>
+                <w:lang w:val="en-US"/>
+              </w:rPr>
+              <w:t>wordstat</w:t>
+            </w:r>
+            <w:proofErr w:type="spellEnd"/>
+            <w:r>
+              <w:rPr>
+                <w:lang w:val="en-US"/>
+              </w:rPr>
+              <w:t>(</w:t>
+            </w:r>
+            <w:proofErr w:type="gramEnd"/>
+            <w:r>
+              <w:rPr>
+                <w:lang w:val="en-US"/>
+              </w:rPr>
+              <w:t>char* first)</w:t>
+            </w:r>
+          </w:p>
+        </w:tc>
+        <w:tc>
+          <w:tcPr>
+            <w:tcW w:w="5497" w:type="dxa"/>
+            <w:tcBorders>
+              <w:top w:val="single" w:sz="4" w:space="0" w:color="BFBFBF"/>
+              <w:left w:val="single" w:sz="4" w:space="0" w:color="BFBFBF"/>
+              <w:bottom w:val="single" w:sz="4" w:space="0" w:color="BFBFBF"/>
+              <w:right w:val="single" w:sz="4" w:space="0" w:color="BFBFBF"/>
+            </w:tcBorders>
+            <w:tcMar>
+              <w:top w:w="100" w:type="dxa"/>
+              <w:left w:w="120" w:type="dxa"/>
+              <w:bottom w:w="100" w:type="dxa"/>
+              <w:right w:w="120" w:type="dxa"/>
+            </w:tcMar>
+            <w:vAlign w:val="center"/>
+            <w:hideMark/>
+          </w:tcPr>
+          <w:p>
+            <w:pPr>
+              <w:pStyle w:val="ac"/>
+              <w:spacing w:before="183" w:line="309" w:lineRule="auto"/>
+              <w:ind w:right="163"/>
+            </w:pPr>
+            <w:r>
+              <w:t>Проверяет, начинается ли введённая строка с команды «</w:t>
+            </w:r>
+            <w:proofErr w:type="spellStart"/>
+            <w:r>
+              <w:t>wordstat</w:t>
+            </w:r>
+            <w:proofErr w:type="spellEnd"/>
+            <w:r>
+              <w:t>».</w:t>
+            </w:r>
+          </w:p>
+        </w:tc>
+      </w:tr>
+      <w:tr>
+        <w:tc>
+          <w:tcPr>
+            <w:tcW w:w="3529" w:type="dxa"/>
+            <w:tcBorders>
+              <w:top w:val="single" w:sz="4" w:space="0" w:color="BFBFBF"/>
+              <w:left w:val="single" w:sz="4" w:space="0" w:color="BFBFBF"/>
+              <w:bottom w:val="single" w:sz="4" w:space="0" w:color="BFBFBF"/>
+              <w:right w:val="single" w:sz="4" w:space="0" w:color="BFBFBF"/>
+            </w:tcBorders>
+            <w:tcMar>
+              <w:top w:w="100" w:type="dxa"/>
+              <w:left w:w="120" w:type="dxa"/>
+              <w:bottom w:w="100" w:type="dxa"/>
+              <w:right w:w="120" w:type="dxa"/>
+            </w:tcMar>
+            <w:vAlign w:val="center"/>
+            <w:hideMark/>
+          </w:tcPr>
+          <w:p>
+            <w:pPr>
+              <w:pStyle w:val="ac"/>
+              <w:spacing w:before="183" w:line="309" w:lineRule="auto"/>
+              <w:ind w:right="163"/>
+            </w:pPr>
+            <w:proofErr w:type="spellStart"/>
+            <w:proofErr w:type="gramStart"/>
+            <w:r>
+              <w:lastRenderedPageBreak/>
+              <w:t>wordstat</w:t>
+            </w:r>
+            <w:proofErr w:type="spellEnd"/>
+            <w:r>
+              <w:t>(</w:t>
+            </w:r>
+            <w:proofErr w:type="spellStart"/>
+            <w:proofErr w:type="gramEnd"/>
+            <w:r>
+              <w:t>char</w:t>
+            </w:r>
+            <w:proofErr w:type="spellEnd"/>
+            <w:r>
+              <w:t xml:space="preserve">* </w:t>
+            </w:r>
+            <w:proofErr w:type="spellStart"/>
+            <w:r>
+              <w:t>name</w:t>
+            </w:r>
+            <w:proofErr w:type="spellEnd"/>
+            <w:r>
+              <w:t>)</w:t>
+            </w:r>
+          </w:p>
+        </w:tc>
+        <w:tc>
+          <w:tcPr>
+            <w:tcW w:w="5497" w:type="dxa"/>
+            <w:tcBorders>
+              <w:top w:val="single" w:sz="4" w:space="0" w:color="BFBFBF"/>
+              <w:left w:val="single" w:sz="4" w:space="0" w:color="BFBFBF"/>
+              <w:bottom w:val="single" w:sz="4" w:space="0" w:color="BFBFBF"/>
+              <w:right w:val="single" w:sz="4" w:space="0" w:color="BFBFBF"/>
+            </w:tcBorders>
+            <w:tcMar>
+              <w:top w:w="100" w:type="dxa"/>
+              <w:left w:w="120" w:type="dxa"/>
+              <w:bottom w:w="100" w:type="dxa"/>
+              <w:right w:w="120" w:type="dxa"/>
+            </w:tcMar>
+            <w:vAlign w:val="center"/>
+            <w:hideMark/>
+          </w:tcPr>
+          <w:p>
+            <w:pPr>
+              <w:pStyle w:val="ac"/>
+              <w:spacing w:before="183" w:line="309" w:lineRule="auto"/>
+              <w:ind w:right="163"/>
+            </w:pPr>
+            <w:r>
+              <w:t>Выводит количество слов словаря, начинающихся с заданной пользователем буквы.</w:t>
+            </w:r>
+          </w:p>
+        </w:tc>
+      </w:tr>
+      <w:tr>
+        <w:tc>
+          <w:tcPr>
+            <w:tcW w:w="3529" w:type="dxa"/>
+            <w:tcBorders>
+              <w:top w:val="single" w:sz="4" w:space="0" w:color="BFBFBF"/>
+              <w:left w:val="single" w:sz="4" w:space="0" w:color="BFBFBF"/>
+              <w:bottom w:val="single" w:sz="4" w:space="0" w:color="BFBFBF"/>
+              <w:right w:val="single" w:sz="4" w:space="0" w:color="BFBFBF"/>
+            </w:tcBorders>
+            <w:tcMar>
+              <w:top w:w="100" w:type="dxa"/>
+              <w:left w:w="120" w:type="dxa"/>
+              <w:bottom w:w="100" w:type="dxa"/>
+              <w:right w:w="120" w:type="dxa"/>
+            </w:tcMar>
+            <w:vAlign w:val="center"/>
+            <w:hideMark/>
+          </w:tcPr>
+          <w:p>
+            <w:pPr>
+              <w:pStyle w:val="ac"/>
+              <w:spacing w:before="183" w:line="309" w:lineRule="auto"/>
+              <w:ind w:right="163"/>
+            </w:pPr>
+            <w:proofErr w:type="spellStart"/>
+            <w:proofErr w:type="gramStart"/>
+            <w:r>
+              <w:t>shutdown</w:t>
+            </w:r>
+            <w:proofErr w:type="spellEnd"/>
+            <w:r>
+              <w:t>(</w:t>
+            </w:r>
+            <w:proofErr w:type="gramEnd"/>
+            <w:r>
+              <w:t>)</w:t>
+            </w:r>
+          </w:p>
+        </w:tc>
+        <w:tc>
+          <w:tcPr>
+            <w:tcW w:w="5497" w:type="dxa"/>
+            <w:tcBorders>
+              <w:top w:val="single" w:sz="4" w:space="0" w:color="BFBFBF"/>
+              <w:left w:val="single" w:sz="4" w:space="0" w:color="BFBFBF"/>
+              <w:bottom w:val="single" w:sz="4" w:space="0" w:color="BFBFBF"/>
+              <w:right w:val="single" w:sz="4" w:space="0" w:color="BFBFBF"/>
+            </w:tcBorders>
+            <w:tcMar>
+              <w:top w:w="100" w:type="dxa"/>
+              <w:left w:w="120" w:type="dxa"/>
+              <w:bottom w:w="100" w:type="dxa"/>
+              <w:right w:w="120" w:type="dxa"/>
+            </w:tcMar>
+            <w:vAlign w:val="center"/>
+            <w:hideMark/>
+          </w:tcPr>
+          <w:p>
+            <w:pPr>
+              <w:pStyle w:val="ac"/>
+              <w:spacing w:before="183" w:line="309" w:lineRule="auto"/>
+              <w:ind w:right="163"/>
+            </w:pPr>
+            <w:r>
+              <w:t>Выводит сообщение о выключении и отправляет ACPI-команду выключения компьютера (порт 0x604), затем останавливает процессор.</w:t>
+            </w:r>
+          </w:p>
+        </w:tc>
+      </w:tr>
+      <w:tr>
+        <w:tc>
+          <w:tcPr>
+            <w:tcW w:w="3529" w:type="dxa"/>
+            <w:tcBorders>
+              <w:top w:val="single" w:sz="4" w:space="0" w:color="BFBFBF"/>
+              <w:left w:val="single" w:sz="4" w:space="0" w:color="BFBFBF"/>
+              <w:bottom w:val="single" w:sz="4" w:space="0" w:color="BFBFBF"/>
+              <w:right w:val="single" w:sz="4" w:space="0" w:color="BFBFBF"/>
+            </w:tcBorders>
+            <w:tcMar>
+              <w:top w:w="100" w:type="dxa"/>
+              <w:left w:w="120" w:type="dxa"/>
+              <w:bottom w:w="100" w:type="dxa"/>
+              <w:right w:w="120" w:type="dxa"/>
+            </w:tcMar>
+            <w:vAlign w:val="center"/>
+            <w:hideMark/>
+          </w:tcPr>
+          <w:p>
+            <w:pPr>
+              <w:pStyle w:val="ac"/>
+              <w:spacing w:before="183" w:line="309" w:lineRule="auto"/>
+              <w:ind w:right="163"/>
+            </w:pPr>
+            <w:proofErr w:type="spellStart"/>
+            <w:r>
+              <w:t>timer_</w:t>
+            </w:r>
+            <w:proofErr w:type="gramStart"/>
+            <w:r>
+              <w:t>handler</w:t>
+            </w:r>
+            <w:proofErr w:type="spellEnd"/>
+            <w:r>
+              <w:t>(</w:t>
+            </w:r>
+            <w:proofErr w:type="gramEnd"/>
+            <w:r>
+              <w:t>)</w:t>
+            </w:r>
+          </w:p>
+        </w:tc>
+        <w:tc>
+          <w:tcPr>
+            <w:tcW w:w="5497" w:type="dxa"/>
+            <w:tcBorders>
+              <w:top w:val="single" w:sz="4" w:space="0" w:color="BFBFBF"/>
+              <w:left w:val="single" w:sz="4" w:space="0" w:color="BFBFBF"/>
+              <w:bottom w:val="single" w:sz="4" w:space="0" w:color="BFBFBF"/>
+              <w:right w:val="single" w:sz="4" w:space="0" w:color="BFBFBF"/>
+            </w:tcBorders>
+            <w:tcMar>
+              <w:top w:w="100" w:type="dxa"/>
+              <w:left w:w="120" w:type="dxa"/>
+              <w:bottom w:w="100" w:type="dxa"/>
+              <w:right w:w="120" w:type="dxa"/>
+            </w:tcMar>
+            <w:vAlign w:val="center"/>
+            <w:hideMark/>
+          </w:tcPr>
+          <w:p>
+            <w:pPr>
+              <w:pStyle w:val="ac"/>
+              <w:spacing w:before="183" w:line="309" w:lineRule="auto"/>
+              <w:ind w:right="163"/>
+            </w:pPr>
+            <w:r>
+              <w:t xml:space="preserve">Обработчик прерывания таймера: увеличивает счётчик тиков </w:t>
+            </w:r>
+            <w:proofErr w:type="spellStart"/>
+            <w:r>
+              <w:t>g_ticks</w:t>
+            </w:r>
+            <w:proofErr w:type="spellEnd"/>
+            <w:r>
+              <w:t xml:space="preserve"> и подтверждает прерывание контроллеру PIC.</w:t>
+            </w:r>
+          </w:p>
+        </w:tc>
+      </w:tr>
+      <w:tr>
+        <w:tc>
+          <w:tcPr>
+            <w:tcW w:w="3529" w:type="dxa"/>
+            <w:tcBorders>
+              <w:top w:val="single" w:sz="4" w:space="0" w:color="BFBFBF"/>
+              <w:left w:val="single" w:sz="4" w:space="0" w:color="BFBFBF"/>
+              <w:bottom w:val="single" w:sz="4" w:space="0" w:color="BFBFBF"/>
+              <w:right w:val="single" w:sz="4" w:space="0" w:color="BFBFBF"/>
+            </w:tcBorders>
+            <w:tcMar>
+              <w:top w:w="100" w:type="dxa"/>
+              <w:left w:w="120" w:type="dxa"/>
+              <w:bottom w:w="100" w:type="dxa"/>
+              <w:right w:w="120" w:type="dxa"/>
+            </w:tcMar>
+            <w:vAlign w:val="center"/>
+            <w:hideMark/>
+          </w:tcPr>
+          <w:p>
+            <w:pPr>
+              <w:pStyle w:val="ac"/>
+              <w:spacing w:before="183" w:line="309" w:lineRule="auto"/>
+              <w:ind w:right="163"/>
+            </w:pPr>
+            <w:proofErr w:type="spellStart"/>
+            <w:proofErr w:type="gramStart"/>
+            <w:r>
+              <w:t>lkg</w:t>
+            </w:r>
+            <w:proofErr w:type="spellEnd"/>
+            <w:r>
+              <w:t>(</w:t>
+            </w:r>
+            <w:proofErr w:type="spellStart"/>
+            <w:proofErr w:type="gramEnd"/>
+            <w:r>
+              <w:t>int</w:t>
+            </w:r>
+            <w:proofErr w:type="spellEnd"/>
+            <w:r>
+              <w:t xml:space="preserve"> </w:t>
+            </w:r>
+            <w:proofErr w:type="spellStart"/>
+            <w:r>
+              <w:t>count</w:t>
+            </w:r>
+            <w:proofErr w:type="spellEnd"/>
+            <w:r>
+              <w:t>)</w:t>
+            </w:r>
+          </w:p>
+        </w:tc>
+        <w:tc>
+          <w:tcPr>
+            <w:tcW w:w="5497" w:type="dxa"/>
+            <w:tcBorders>
+              <w:top w:val="single" w:sz="4" w:space="0" w:color="BFBFBF"/>
+              <w:left w:val="single" w:sz="4" w:space="0" w:color="BFBFBF"/>
+              <w:bottom w:val="single" w:sz="4" w:space="0" w:color="BFBFBF"/>
+              <w:right w:val="single" w:sz="4" w:space="0" w:color="BFBFBF"/>
+            </w:tcBorders>
+            <w:tcMar>
+              <w:top w:w="100" w:type="dxa"/>
+              <w:left w:w="120" w:type="dxa"/>
+              <w:bottom w:w="100" w:type="dxa"/>
+              <w:right w:w="120" w:type="dxa"/>
+            </w:tcMar>
+            <w:vAlign w:val="center"/>
+            <w:hideMark/>
+          </w:tcPr>
+          <w:p>
+            <w:pPr>
+              <w:pStyle w:val="ac"/>
+              <w:spacing w:before="183" w:line="309" w:lineRule="auto"/>
+              <w:ind w:right="163"/>
+            </w:pPr>
+            <w:r>
+              <w:t xml:space="preserve">Генерирует псевдослучайное число в диапазоне [0, </w:t>
+            </w:r>
+            <w:proofErr w:type="spellStart"/>
+            <w:r>
+              <w:t>count</w:t>
+            </w:r>
+            <w:proofErr w:type="spellEnd"/>
+            <w:r>
+              <w:t>) линейно-конгруэнтным методом, используя счётчик тиков как источник энтропии.</w:t>
+            </w:r>
+          </w:p>
+        </w:tc>
+      </w:tr>
+      <w:tr>
+        <w:tc>
+          <w:tcPr>
+            <w:tcW w:w="3529" w:type="dxa"/>
+            <w:tcBorders>
+              <w:top w:val="single" w:sz="4" w:space="0" w:color="BFBFBF"/>
+              <w:left w:val="single" w:sz="4" w:space="0" w:color="BFBFBF"/>
+              <w:bottom w:val="single" w:sz="4" w:space="0" w:color="BFBFBF"/>
+              <w:right w:val="single" w:sz="4" w:space="0" w:color="BFBFBF"/>
+            </w:tcBorders>
+            <w:tcMar>
+              <w:top w:w="100" w:type="dxa"/>
+              <w:left w:w="120" w:type="dxa"/>
+              <w:bottom w:w="100" w:type="dxa"/>
+              <w:right w:w="120" w:type="dxa"/>
+            </w:tcMar>
+            <w:vAlign w:val="center"/>
+            <w:hideMark/>
+          </w:tcPr>
+          <w:p>
+            <w:pPr>
+              <w:pStyle w:val="ac"/>
+              <w:spacing w:before="183" w:line="309" w:lineRule="auto"/>
+              <w:ind w:right="163"/>
+              <w:rPr>
+                <w:lang w:val="en-US"/>
+              </w:rPr>
+            </w:pPr>
+            <w:proofErr w:type="spellStart"/>
+            <w:r>
+              <w:rPr>
+                <w:lang w:val="en-US"/>
+              </w:rPr>
+              <w:t>starts_with_</w:t>
+            </w:r>
+            <w:proofErr w:type="gramStart"/>
+            <w:r>
+              <w:rPr>
+                <w:lang w:val="en-US"/>
+              </w:rPr>
+              <w:t>anyword</w:t>
+            </w:r>
+            <w:proofErr w:type="spellEnd"/>
+            <w:r>
+              <w:rPr>
+                <w:lang w:val="en-US"/>
+              </w:rPr>
+              <w:t>(</w:t>
+            </w:r>
+            <w:proofErr w:type="gramEnd"/>
+            <w:r>
+              <w:rPr>
+                <w:lang w:val="en-US"/>
+              </w:rPr>
+              <w:t>char* first)</w:t>
+            </w:r>
+          </w:p>
+        </w:tc>
+        <w:tc>
+          <w:tcPr>
+            <w:tcW w:w="5497" w:type="dxa"/>
+            <w:tcBorders>
+              <w:top w:val="single" w:sz="4" w:space="0" w:color="BFBFBF"/>
+              <w:left w:val="single" w:sz="4" w:space="0" w:color="BFBFBF"/>
+              <w:bottom w:val="single" w:sz="4" w:space="0" w:color="BFBFBF"/>
+              <w:right w:val="single" w:sz="4" w:space="0" w:color="BFBFBF"/>
+            </w:tcBorders>
+            <w:tcMar>
+              <w:top w:w="100" w:type="dxa"/>
+              <w:left w:w="120" w:type="dxa"/>
+              <w:bottom w:w="100" w:type="dxa"/>
+              <w:right w:w="120" w:type="dxa"/>
+            </w:tcMar>
+            <w:vAlign w:val="center"/>
+            <w:hideMark/>
+          </w:tcPr>
+          <w:p>
+            <w:pPr>
+              <w:pStyle w:val="ac"/>
+              <w:spacing w:before="183" w:line="309" w:lineRule="auto"/>
+              <w:ind w:right="163"/>
+            </w:pPr>
+            <w:r>
+              <w:t>Проверяет, начинается ли введённая строка с команды «</w:t>
+            </w:r>
+            <w:proofErr w:type="spellStart"/>
+            <w:r>
+              <w:t>anyword</w:t>
+            </w:r>
+            <w:proofErr w:type="spellEnd"/>
+            <w:r>
+              <w:t>».</w:t>
+            </w:r>
+          </w:p>
+        </w:tc>
+      </w:tr>
+      <w:tr>
+        <w:tc>
+          <w:tcPr>
+            <w:tcW w:w="3529" w:type="dxa"/>
+            <w:tcBorders>
+              <w:top w:val="single" w:sz="4" w:space="0" w:color="BFBFBF"/>
+              <w:left w:val="single" w:sz="4" w:space="0" w:color="BFBFBF"/>
+              <w:bottom w:val="single" w:sz="4" w:space="0" w:color="BFBFBF"/>
+              <w:right w:val="single" w:sz="4" w:space="0" w:color="BFBFBF"/>
+            </w:tcBorders>
+            <w:tcMar>
+              <w:top w:w="100" w:type="dxa"/>
+              <w:left w:w="120" w:type="dxa"/>
+              <w:bottom w:w="100" w:type="dxa"/>
+              <w:right w:w="120" w:type="dxa"/>
+            </w:tcMar>
+            <w:vAlign w:val="center"/>
+            <w:hideMark/>
+          </w:tcPr>
+          <w:p>
+            <w:pPr>
+              <w:pStyle w:val="ac"/>
+              <w:spacing w:before="183" w:line="309" w:lineRule="auto"/>
+              <w:ind w:right="163"/>
+            </w:pPr>
+            <w:proofErr w:type="spellStart"/>
+            <w:proofErr w:type="gramStart"/>
+            <w:r>
+              <w:t>anyword</w:t>
+            </w:r>
+            <w:proofErr w:type="spellEnd"/>
+            <w:r>
+              <w:t>(</w:t>
+            </w:r>
+            <w:proofErr w:type="spellStart"/>
+            <w:proofErr w:type="gramEnd"/>
+            <w:r>
+              <w:t>char</w:t>
+            </w:r>
+            <w:proofErr w:type="spellEnd"/>
+            <w:r>
+              <w:t xml:space="preserve">* </w:t>
+            </w:r>
+            <w:proofErr w:type="spellStart"/>
+            <w:r>
+              <w:t>name</w:t>
+            </w:r>
+            <w:proofErr w:type="spellEnd"/>
+            <w:r>
+              <w:t>)</w:t>
+            </w:r>
+          </w:p>
+        </w:tc>
+        <w:tc>
+          <w:tcPr>
+            <w:tcW w:w="5497" w:type="dxa"/>
+            <w:tcBorders>
+              <w:top w:val="single" w:sz="4" w:space="0" w:color="BFBFBF"/>
+              <w:left w:val="single" w:sz="4" w:space="0" w:color="BFBFBF"/>
+              <w:bottom w:val="single" w:sz="4" w:space="0" w:color="BFBFBF"/>
+              <w:right w:val="single" w:sz="4" w:space="0" w:color="BFBFBF"/>
+            </w:tcBorders>
+            <w:tcMar>
+              <w:top w:w="100" w:type="dxa"/>
+              <w:left w:w="120" w:type="dxa"/>
+              <w:bottom w:w="100" w:type="dxa"/>
+              <w:right w:w="120" w:type="dxa"/>
+            </w:tcMar>
+            <w:vAlign w:val="center"/>
+            <w:hideMark/>
+          </w:tcPr>
+          <w:p>
+            <w:pPr>
+              <w:pStyle w:val="ac"/>
+              <w:spacing w:before="183" w:line="309" w:lineRule="auto"/>
+              <w:ind w:right="163"/>
+            </w:pPr>
+            <w:r>
+              <w:t>Выводит случайное слово словаря (по заданной или случайной букве) вместе с переводом.</w:t>
+            </w:r>
+          </w:p>
+        </w:tc>
+      </w:tr>
+      <w:tr>
+        <w:tc>
+          <w:tcPr>
+            <w:tcW w:w="3529" w:type="dxa"/>
+            <w:tcBorders>
+              <w:top w:val="single" w:sz="4" w:space="0" w:color="BFBFBF"/>
+              <w:left w:val="single" w:sz="4" w:space="0" w:color="BFBFBF"/>
+              <w:bottom w:val="single" w:sz="4" w:space="0" w:color="BFBFBF"/>
+              <w:right w:val="single" w:sz="4" w:space="0" w:color="BFBFBF"/>
+            </w:tcBorders>
+            <w:tcMar>
+              <w:top w:w="100" w:type="dxa"/>
+              <w:left w:w="120" w:type="dxa"/>
+              <w:bottom w:w="100" w:type="dxa"/>
+              <w:right w:w="120" w:type="dxa"/>
+            </w:tcMar>
+            <w:vAlign w:val="center"/>
+            <w:hideMark/>
+          </w:tcPr>
+          <w:p>
+            <w:pPr>
+              <w:pStyle w:val="ac"/>
+              <w:spacing w:before="183" w:line="309" w:lineRule="auto"/>
+              <w:ind w:right="163"/>
+              <w:rPr>
+                <w:lang w:val="en-US"/>
+              </w:rPr>
+            </w:pPr>
+            <w:proofErr w:type="spellStart"/>
+            <w:r>
+              <w:rPr>
+                <w:lang w:val="en-US"/>
+              </w:rPr>
+              <w:t>inf_loop_</w:t>
+            </w:r>
+            <w:proofErr w:type="gramStart"/>
+            <w:r>
+              <w:rPr>
+                <w:lang w:val="en-US"/>
+              </w:rPr>
+              <w:t>str</w:t>
+            </w:r>
+            <w:proofErr w:type="spellEnd"/>
+            <w:r>
+              <w:rPr>
+                <w:lang w:val="en-US"/>
+              </w:rPr>
+              <w:t>(</w:t>
+            </w:r>
+            <w:proofErr w:type="gramEnd"/>
+            <w:r>
+              <w:rPr>
+                <w:lang w:val="en-US"/>
+              </w:rPr>
+              <w:t>char* name)</w:t>
+            </w:r>
+          </w:p>
+        </w:tc>
+        <w:tc>
+          <w:tcPr>
+            <w:tcW w:w="5497" w:type="dxa"/>
+            <w:tcBorders>
+              <w:top w:val="single" w:sz="4" w:space="0" w:color="BFBFBF"/>
+              <w:left w:val="single" w:sz="4" w:space="0" w:color="BFBFBF"/>
+              <w:bottom w:val="single" w:sz="4" w:space="0" w:color="BFBFBF"/>
+              <w:right w:val="single" w:sz="4" w:space="0" w:color="BFBFBF"/>
+            </w:tcBorders>
+            <w:tcMar>
+              <w:top w:w="100" w:type="dxa"/>
+              <w:left w:w="120" w:type="dxa"/>
+              <w:bottom w:w="100" w:type="dxa"/>
+              <w:right w:w="120" w:type="dxa"/>
+            </w:tcMar>
+            <w:vAlign w:val="center"/>
+            <w:hideMark/>
+          </w:tcPr>
+          <w:p>
+            <w:pPr>
+              <w:pStyle w:val="ac"/>
+              <w:spacing w:before="183" w:line="309" w:lineRule="auto"/>
+              <w:ind w:right="163"/>
+            </w:pPr>
+            <w:r>
+              <w:t xml:space="preserve">Считывает строку символов с клавиатуры посимвольно до нажатия Enter, обрабатывая </w:t>
+            </w:r>
+            <w:proofErr w:type="spellStart"/>
+            <w:r>
+              <w:t>Backspace</w:t>
+            </w:r>
+            <w:proofErr w:type="spellEnd"/>
+            <w:r>
+              <w:t>.</w:t>
+            </w:r>
+          </w:p>
+        </w:tc>
+      </w:tr>
+      <w:tr>
+        <w:tc>
+          <w:tcPr>
+            <w:tcW w:w="3529" w:type="dxa"/>
+            <w:tcBorders>
+              <w:top w:val="single" w:sz="4" w:space="0" w:color="BFBFBF"/>
+              <w:left w:val="single" w:sz="4" w:space="0" w:color="BFBFBF"/>
+              <w:bottom w:val="single" w:sz="4" w:space="0" w:color="BFBFBF"/>
+              <w:right w:val="single" w:sz="4" w:space="0" w:color="BFBFBF"/>
+            </w:tcBorders>
+            <w:tcMar>
+              <w:top w:w="100" w:type="dxa"/>
+              <w:left w:w="120" w:type="dxa"/>
+              <w:bottom w:w="100" w:type="dxa"/>
+              <w:right w:w="120" w:type="dxa"/>
+            </w:tcMar>
+            <w:vAlign w:val="center"/>
+            <w:hideMark/>
+          </w:tcPr>
+          <w:p>
+            <w:pPr>
+              <w:pStyle w:val="ac"/>
+              <w:spacing w:before="183" w:line="309" w:lineRule="auto"/>
+              <w:ind w:right="163"/>
+              <w:rPr>
+                <w:lang w:val="en-US"/>
+              </w:rPr>
+            </w:pPr>
+            <w:proofErr w:type="spellStart"/>
+            <w:proofErr w:type="gramStart"/>
+            <w:r>
+              <w:rPr>
+                <w:lang w:val="en-US"/>
+              </w:rPr>
+              <w:t>varity</w:t>
+            </w:r>
+            <w:proofErr w:type="spellEnd"/>
+            <w:r>
+              <w:rPr>
+                <w:lang w:val="en-US"/>
+              </w:rPr>
+              <w:t>(</w:t>
+            </w:r>
+            <w:proofErr w:type="gramEnd"/>
+            <w:r>
+              <w:rPr>
+                <w:lang w:val="en-US"/>
+              </w:rPr>
+              <w:t xml:space="preserve">char* name, unsigned char* </w:t>
+            </w:r>
+            <w:proofErr w:type="spellStart"/>
+            <w:r>
+              <w:rPr>
+                <w:lang w:val="en-US"/>
+              </w:rPr>
+              <w:lastRenderedPageBreak/>
+              <w:t>boot_letters</w:t>
+            </w:r>
+            <w:proofErr w:type="spellEnd"/>
+            <w:r>
+              <w:rPr>
+                <w:lang w:val="en-US"/>
+              </w:rPr>
+              <w:t>)</w:t>
+            </w:r>
+          </w:p>
+        </w:tc>
+        <w:tc>
+          <w:tcPr>
+            <w:tcW w:w="5497" w:type="dxa"/>
+            <w:tcBorders>
+              <w:top w:val="single" w:sz="4" w:space="0" w:color="BFBFBF"/>
+              <w:left w:val="single" w:sz="4" w:space="0" w:color="BFBFBF"/>
+              <w:bottom w:val="single" w:sz="4" w:space="0" w:color="BFBFBF"/>
+              <w:right w:val="single" w:sz="4" w:space="0" w:color="BFBFBF"/>
+            </w:tcBorders>
+            <w:tcMar>
+              <w:top w:w="100" w:type="dxa"/>
+              <w:left w:w="120" w:type="dxa"/>
+              <w:bottom w:w="100" w:type="dxa"/>
+              <w:right w:w="120" w:type="dxa"/>
+            </w:tcMar>
+            <w:vAlign w:val="center"/>
+            <w:hideMark/>
+          </w:tcPr>
+          <w:p>
+            <w:pPr>
+              <w:pStyle w:val="ac"/>
+              <w:spacing w:before="183" w:line="309" w:lineRule="auto"/>
+              <w:ind w:right="163"/>
+              <w:rPr>
+                <w:lang w:val="en-US"/>
+              </w:rPr>
+            </w:pPr>
+            <w:r>
+              <w:lastRenderedPageBreak/>
+              <w:t>Разбирает</w:t>
+            </w:r>
+            <w:r>
+              <w:rPr>
+                <w:lang w:val="en-US"/>
+              </w:rPr>
+              <w:t xml:space="preserve"> </w:t>
+            </w:r>
+            <w:r>
+              <w:t>введённую</w:t>
+            </w:r>
+            <w:r>
+              <w:rPr>
+                <w:lang w:val="en-US"/>
+              </w:rPr>
+              <w:t xml:space="preserve"> </w:t>
+            </w:r>
+            <w:r>
+              <w:t>команду</w:t>
+            </w:r>
+            <w:r>
+              <w:rPr>
+                <w:lang w:val="en-US"/>
+              </w:rPr>
+              <w:t xml:space="preserve"> </w:t>
+            </w:r>
+            <w:r>
+              <w:t>и</w:t>
+            </w:r>
+            <w:r>
+              <w:rPr>
+                <w:lang w:val="en-US"/>
+              </w:rPr>
+              <w:t xml:space="preserve"> </w:t>
+            </w:r>
+            <w:r>
+              <w:t>вызывает</w:t>
+            </w:r>
+            <w:r>
+              <w:rPr>
+                <w:lang w:val="en-US"/>
+              </w:rPr>
+              <w:t xml:space="preserve"> </w:t>
+            </w:r>
+            <w:r>
+              <w:t>соответствующую</w:t>
+            </w:r>
+            <w:r>
+              <w:rPr>
+                <w:lang w:val="en-US"/>
+              </w:rPr>
+              <w:t xml:space="preserve"> </w:t>
+            </w:r>
+            <w:r>
+              <w:t>функцию</w:t>
+            </w:r>
+            <w:r>
+              <w:rPr>
+                <w:lang w:val="en-US"/>
+              </w:rPr>
+              <w:t>-</w:t>
+            </w:r>
+            <w:r>
+              <w:t>обработчик</w:t>
+            </w:r>
+            <w:r>
+              <w:rPr>
+                <w:lang w:val="en-US"/>
+              </w:rPr>
+              <w:t xml:space="preserve"> </w:t>
+            </w:r>
+            <w:r>
+              <w:rPr>
+                <w:lang w:val="en-US"/>
+              </w:rPr>
+              <w:lastRenderedPageBreak/>
+              <w:t xml:space="preserve">(info, </w:t>
+            </w:r>
+            <w:proofErr w:type="spellStart"/>
+            <w:r>
+              <w:rPr>
+                <w:lang w:val="en-US"/>
+              </w:rPr>
+              <w:t>dictinfo</w:t>
+            </w:r>
+            <w:proofErr w:type="spellEnd"/>
+            <w:r>
+              <w:rPr>
+                <w:lang w:val="en-US"/>
+              </w:rPr>
+              <w:t xml:space="preserve">, translate, </w:t>
+            </w:r>
+            <w:proofErr w:type="spellStart"/>
+            <w:r>
+              <w:rPr>
+                <w:lang w:val="en-US"/>
+              </w:rPr>
+              <w:t>wordstat</w:t>
+            </w:r>
+            <w:proofErr w:type="spellEnd"/>
+            <w:r>
+              <w:rPr>
+                <w:lang w:val="en-US"/>
+              </w:rPr>
+              <w:t xml:space="preserve">, </w:t>
+            </w:r>
+            <w:proofErr w:type="spellStart"/>
+            <w:r>
+              <w:rPr>
+                <w:lang w:val="en-US"/>
+              </w:rPr>
+              <w:t>anyword</w:t>
+            </w:r>
+            <w:proofErr w:type="spellEnd"/>
+            <w:r>
+              <w:rPr>
+                <w:lang w:val="en-US"/>
+              </w:rPr>
+              <w:t>, shutdown).</w:t>
+            </w:r>
+          </w:p>
+        </w:tc>
+      </w:tr>
+    </w:tbl>
+    <w:p>
+      <w:pPr>
+        <w:pStyle w:val="ac"/>
+        <w:spacing w:before="183" w:line="309" w:lineRule="auto"/>
+        <w:ind w:right="163"/>
+        <w:jc w:val="center"/>
+      </w:pPr>
+      <w:r>
+        <w:lastRenderedPageBreak/>
+        <w:t>Таблица 2. Функции ядра и их описание</w:t>
+      </w:r>
     </w:p>
     <w:p>
       <w:pPr>
@@ -1896,9 +5947,9 @@
   </w:abstractNum>
   <w:abstractNum w:abstractNumId="3" w15:restartNumberingAfterBreak="0">
     <w:nsid w:val="478A37B1"/>
-    <w:multiLevelType w:val="hybridMultilevel"/>
-    <w:tmpl w:val="7AEAC6D0"/>
-    <w:lvl w:ilvl="0" w:tplc="0419000F">
+    <w:multiLevelType w:val="multilevel"/>
+    <w:tmpl w:val="A48048FC"/>
+    <w:lvl w:ilvl="0">
       <w:start w:val="1"/>
       <w:numFmt w:val="decimal"/>
       <w:lvlText w:val="%1."/>
@@ -1910,77 +5961,109 @@
         <w:rFonts w:hint="default"/>
       </w:rPr>
     </w:lvl>
-    <w:lvl w:ilvl="1" w:tplc="04190019" w:tentative="1">
-      <w:start w:val="1"/>
-      <w:numFmt w:val="lowerLetter"/>
-      <w:lvlText w:val="%2."/>
+    <w:lvl w:ilvl="1">
+      <w:start w:val="2"/>
+      <w:numFmt w:val="decimal"/>
+      <w:isLgl/>
+      <w:lvlText w:val="%1.%2."/>
       <w:lvlJc w:val="left"/>
       <w:pPr>
-        <w:ind w:left="1440" w:hanging="360"/>
-      </w:pPr>
-    </w:lvl>
-    <w:lvl w:ilvl="2" w:tplc="0419001B" w:tentative="1">
-      <w:start w:val="1"/>
-      <w:numFmt w:val="lowerRoman"/>
-      <w:lvlText w:val="%3."/>
-      <w:lvlJc w:val="right"/>
-      <w:pPr>
-        <w:ind w:left="2160" w:hanging="180"/>
-      </w:pPr>
-    </w:lvl>
-    <w:lvl w:ilvl="3" w:tplc="0419000F" w:tentative="1">
+        <w:ind w:left="1080" w:hanging="720"/>
+      </w:pPr>
+      <w:rPr>
+        <w:rFonts w:hint="default"/>
+      </w:rPr>
+    </w:lvl>
+    <w:lvl w:ilvl="2">
       <w:start w:val="1"/>
       <w:numFmt w:val="decimal"/>
-      <w:lvlText w:val="%4."/>
+      <w:isLgl/>
+      <w:lvlText w:val="%1.%2.%3."/>
       <w:lvlJc w:val="left"/>
       <w:pPr>
-        <w:ind w:left="2880" w:hanging="360"/>
-      </w:pPr>
-    </w:lvl>
-    <w:lvl w:ilvl="4" w:tplc="04190019" w:tentative="1">
-      <w:start w:val="1"/>
-      <w:numFmt w:val="lowerLetter"/>
-      <w:lvlText w:val="%5."/>
-      <w:lvlJc w:val="left"/>
-      <w:pPr>
-        <w:ind w:left="3600" w:hanging="360"/>
-      </w:pPr>
-    </w:lvl>
-    <w:lvl w:ilvl="5" w:tplc="0419001B" w:tentative="1">
-      <w:start w:val="1"/>
-      <w:numFmt w:val="lowerRoman"/>
-      <w:lvlText w:val="%6."/>
-      <w:lvlJc w:val="right"/>
-      <w:pPr>
-        <w:ind w:left="4320" w:hanging="180"/>
-      </w:pPr>
-    </w:lvl>
-    <w:lvl w:ilvl="6" w:tplc="0419000F" w:tentative="1">
+        <w:ind w:left="1080" w:hanging="720"/>
+      </w:pPr>
+      <w:rPr>
+        <w:rFonts w:hint="default"/>
+      </w:rPr>
+    </w:lvl>
+    <w:lvl w:ilvl="3">
       <w:start w:val="1"/>
       <w:numFmt w:val="decimal"/>
-      <w:lvlText w:val="%7."/>
+      <w:isLgl/>
+      <w:lvlText w:val="%1.%2.%3.%4."/>
       <w:lvlJc w:val="left"/>
       <w:pPr>
-        <w:ind w:left="5040" w:hanging="360"/>
-      </w:pPr>
-    </w:lvl>
-    <w:lvl w:ilvl="7" w:tplc="04190019" w:tentative="1">
+        <w:ind w:left="1440" w:hanging="1080"/>
+      </w:pPr>
+      <w:rPr>
+        <w:rFonts w:hint="default"/>
+      </w:rPr>
+    </w:lvl>
+    <w:lvl w:ilvl="4">
       <w:start w:val="1"/>
-      <w:numFmt w:val="lowerLetter"/>
-      <w:lvlText w:val="%8."/>
+      <w:numFmt w:val="decimal"/>
+      <w:isLgl/>
+      <w:lvlText w:val="%1.%2.%3.%4.%5."/>
       <w:lvlJc w:val="left"/>
       <w:pPr>
-        <w:ind w:left="5760" w:hanging="360"/>
-      </w:pPr>
-    </w:lvl>
-    <w:lvl w:ilvl="8" w:tplc="0419001B" w:tentative="1">
+        <w:ind w:left="1440" w:hanging="1080"/>
+      </w:pPr>
+      <w:rPr>
+        <w:rFonts w:hint="default"/>
+      </w:rPr>
+    </w:lvl>
+    <w:lvl w:ilvl="5">
       <w:start w:val="1"/>
-      <w:numFmt w:val="lowerRoman"/>
-      <w:lvlText w:val="%9."/>
-      <w:lvlJc w:val="right"/>
-      <w:pPr>
-        <w:ind w:left="6480" w:hanging="180"/>
-      </w:pPr>
+      <w:numFmt w:val="decimal"/>
+      <w:isLgl/>
+      <w:lvlText w:val="%1.%2.%3.%4.%5.%6."/>
+      <w:lvlJc w:val="left"/>
+      <w:pPr>
+        <w:ind w:left="1800" w:hanging="1440"/>
+      </w:pPr>
+      <w:rPr>
+        <w:rFonts w:hint="default"/>
+      </w:rPr>
+    </w:lvl>
+    <w:lvl w:ilvl="6">
+      <w:start w:val="1"/>
+      <w:numFmt w:val="decimal"/>
+      <w:isLgl/>
+      <w:lvlText w:val="%1.%2.%3.%4.%5.%6.%7."/>
+      <w:lvlJc w:val="left"/>
+      <w:pPr>
+        <w:ind w:left="2160" w:hanging="1800"/>
+      </w:pPr>
+      <w:rPr>
+        <w:rFonts w:hint="default"/>
+      </w:rPr>
+    </w:lvl>
+    <w:lvl w:ilvl="7">
+      <w:start w:val="1"/>
+      <w:numFmt w:val="decimal"/>
+      <w:isLgl/>
+      <w:lvlText w:val="%1.%2.%3.%4.%5.%6.%7.%8."/>
+      <w:lvlJc w:val="left"/>
+      <w:pPr>
+        <w:ind w:left="2160" w:hanging="1800"/>
+      </w:pPr>
+      <w:rPr>
+        <w:rFonts w:hint="default"/>
+      </w:rPr>
+    </w:lvl>
+    <w:lvl w:ilvl="8">
+      <w:start w:val="1"/>
+      <w:numFmt w:val="decimal"/>
+      <w:isLgl/>
+      <w:lvlText w:val="%1.%2.%3.%4.%5.%6.%7.%8.%9."/>
+      <w:lvlJc w:val="left"/>
+      <w:pPr>
+        <w:ind w:left="2520" w:hanging="2160"/>
+      </w:pPr>
+      <w:rPr>
+        <w:rFonts w:hint="default"/>
+      </w:rPr>
     </w:lvl>
   </w:abstractNum>
   <w:abstractNum w:abstractNumId="4" w15:restartNumberingAfterBreak="0">

</xml_diff>

<commit_message>
UPDATE: upadte отчет DATE: 2026-09-17 18:54:32
</commit_message>
<xml_diff>
--- a/Учеба 4 семестр/ОСИ/1 ЛАБ/Отчет.docx
+++ b/Учеба 4 семестр/ОСИ/1 ЛАБ/Отчет.docx
@@ -2643,19 +2643,11 @@
             </w:pPr>
             <w:proofErr w:type="spellStart"/>
             <w:r>
-              <w:t>find_array_</w:t>
-            </w:r>
-            <w:proofErr w:type="gramStart"/>
-            <w:r>
-              <w:t>size</w:t>
-            </w:r>
-            <w:proofErr w:type="spellEnd"/>
-            <w:r>
-              <w:t>(</w:t>
-            </w:r>
-            <w:proofErr w:type="gramEnd"/>
-            <w:r>
-              <w:t>)</w:t>
+              <w:t>find_array_size</w:t>
+            </w:r>
+            <w:proofErr w:type="spellEnd"/>
+            <w:r>
+              <w:t>()</w:t>
             </w:r>
           </w:p>
         </w:tc>
@@ -2740,19 +2732,11 @@
             </w:pPr>
             <w:proofErr w:type="spellStart"/>
             <w:r>
-              <w:t>scroll_</w:t>
-            </w:r>
-            <w:proofErr w:type="gramStart"/>
-            <w:r>
-              <w:t>up</w:t>
-            </w:r>
-            <w:proofErr w:type="spellEnd"/>
-            <w:r>
-              <w:t>(</w:t>
-            </w:r>
-            <w:proofErr w:type="gramEnd"/>
-            <w:r>
-              <w:t>)</w:t>
+              <w:t>scroll_up</w:t>
+            </w:r>
+            <w:proofErr w:type="spellEnd"/>
+            <w:r>
+              <w:t>()</w:t>
             </w:r>
           </w:p>
         </w:tc>
@@ -2819,28 +2803,14 @@
               <w:rPr>
                 <w:lang w:val="en-US"/>
               </w:rPr>
-              <w:t>cursor_</w:t>
-            </w:r>
-            <w:proofErr w:type="gramStart"/>
-            <w:r>
-              <w:rPr>
-                <w:lang w:val="en-US"/>
-              </w:rPr>
-              <w:t>moveto</w:t>
-            </w:r>
-            <w:proofErr w:type="spellEnd"/>
-            <w:r>
-              <w:rPr>
-                <w:lang w:val="en-US"/>
-              </w:rPr>
-              <w:t>(</w:t>
-            </w:r>
-            <w:proofErr w:type="gramEnd"/>
-            <w:r>
-              <w:rPr>
-                <w:lang w:val="en-US"/>
-              </w:rPr>
-              <w:t xml:space="preserve">unsigned int </w:t>
+              <w:t>cursor_moveto</w:t>
+            </w:r>
+            <w:proofErr w:type="spellEnd"/>
+            <w:r>
+              <w:rPr>
+                <w:lang w:val="en-US"/>
+              </w:rPr>
+              <w:t xml:space="preserve">(unsigned int </w:t>
             </w:r>
             <w:proofErr w:type="spellStart"/>
             <w:r>
@@ -2915,19 +2885,11 @@
             </w:pPr>
             <w:proofErr w:type="spellStart"/>
             <w:r>
-              <w:t>update_</w:t>
-            </w:r>
-            <w:proofErr w:type="gramStart"/>
-            <w:r>
-              <w:t>cursor</w:t>
-            </w:r>
-            <w:proofErr w:type="spellEnd"/>
-            <w:r>
-              <w:t>(</w:t>
-            </w:r>
-            <w:proofErr w:type="gramEnd"/>
-            <w:r>
-              <w:t>)</w:t>
+              <w:t>update_cursor</w:t>
+            </w:r>
+            <w:proofErr w:type="spellEnd"/>
+            <w:r>
+              <w:t>()</w:t>
             </w:r>
           </w:p>
         </w:tc>
@@ -3002,28 +2964,14 @@
               <w:rPr>
                 <w:lang w:val="en-US"/>
               </w:rPr>
-              <w:t>str_</w:t>
-            </w:r>
-            <w:proofErr w:type="gramStart"/>
-            <w:r>
-              <w:rPr>
-                <w:lang w:val="en-US"/>
-              </w:rPr>
-              <w:t>str</w:t>
-            </w:r>
-            <w:proofErr w:type="spellEnd"/>
-            <w:r>
-              <w:rPr>
-                <w:lang w:val="en-US"/>
-              </w:rPr>
-              <w:t>(</w:t>
-            </w:r>
-            <w:proofErr w:type="gramEnd"/>
-            <w:r>
-              <w:rPr>
-                <w:lang w:val="en-US"/>
-              </w:rPr>
-              <w:t>const char* point)</w:t>
+              <w:t>str_str</w:t>
+            </w:r>
+            <w:proofErr w:type="spellEnd"/>
+            <w:r>
+              <w:rPr>
+                <w:lang w:val="en-US"/>
+              </w:rPr>
+              <w:t>(const char* point)</w:t>
             </w:r>
           </w:p>
         </w:tc>
@@ -3090,28 +3038,14 @@
               <w:rPr>
                 <w:lang w:val="en-US"/>
               </w:rPr>
-              <w:t>str_</w:t>
-            </w:r>
-            <w:proofErr w:type="gramStart"/>
-            <w:r>
-              <w:rPr>
-                <w:lang w:val="en-US"/>
-              </w:rPr>
-              <w:t>check</w:t>
-            </w:r>
-            <w:proofErr w:type="spellEnd"/>
-            <w:r>
-              <w:rPr>
-                <w:lang w:val="en-US"/>
-              </w:rPr>
-              <w:t>(</w:t>
-            </w:r>
-            <w:proofErr w:type="gramEnd"/>
-            <w:r>
-              <w:rPr>
-                <w:lang w:val="en-US"/>
-              </w:rPr>
-              <w:t>const char* a, const char* b)</w:t>
+              <w:t>str_check</w:t>
+            </w:r>
+            <w:proofErr w:type="spellEnd"/>
+            <w:r>
+              <w:rPr>
+                <w:lang w:val="en-US"/>
+              </w:rPr>
+              <w:t>(const char* a, const char* b)</w:t>
             </w:r>
           </w:p>
         </w:tc>
@@ -3178,28 +3112,14 @@
               <w:rPr>
                 <w:lang w:val="en-US"/>
               </w:rPr>
-              <w:t>str_</w:t>
-            </w:r>
-            <w:proofErr w:type="gramStart"/>
-            <w:r>
-              <w:rPr>
-                <w:lang w:val="en-US"/>
-              </w:rPr>
-              <w:t>cmp</w:t>
-            </w:r>
-            <w:proofErr w:type="spellEnd"/>
-            <w:r>
-              <w:rPr>
-                <w:lang w:val="en-US"/>
-              </w:rPr>
-              <w:t>(</w:t>
-            </w:r>
-            <w:proofErr w:type="gramEnd"/>
-            <w:r>
-              <w:rPr>
-                <w:lang w:val="en-US"/>
-              </w:rPr>
-              <w:t>const char* a, const char* b)</w:t>
+              <w:t>str_cmp</w:t>
+            </w:r>
+            <w:proofErr w:type="spellEnd"/>
+            <w:r>
+              <w:rPr>
+                <w:lang w:val="en-US"/>
+              </w:rPr>
+              <w:t>(const char* a, const char* b)</w:t>
             </w:r>
           </w:p>
         </w:tc>
@@ -3259,17 +3179,12 @@
               <w:ind w:right="163"/>
             </w:pPr>
             <w:proofErr w:type="spellStart"/>
-            <w:proofErr w:type="gramStart"/>
             <w:r>
               <w:t>backspace</w:t>
             </w:r>
             <w:proofErr w:type="spellEnd"/>
             <w:r>
-              <w:t>(</w:t>
-            </w:r>
-            <w:proofErr w:type="gramEnd"/>
-            <w:r>
-              <w:t>)</w:t>
+              <w:t>()</w:t>
             </w:r>
           </w:p>
         </w:tc>
@@ -3335,19 +3250,11 @@
             <w:proofErr w:type="spellStart"/>
             <w:r>
               <w:lastRenderedPageBreak/>
-              <w:t>scanf_</w:t>
-            </w:r>
-            <w:proofErr w:type="gramStart"/>
-            <w:r>
-              <w:t>S</w:t>
-            </w:r>
-            <w:proofErr w:type="spellEnd"/>
-            <w:r>
-              <w:t>(</w:t>
-            </w:r>
-            <w:proofErr w:type="gramEnd"/>
-            <w:r>
-              <w:t>)</w:t>
+              <w:t>scanf_S</w:t>
+            </w:r>
+            <w:proofErr w:type="spellEnd"/>
+            <w:r>
+              <w:t>()</w:t>
             </w:r>
           </w:p>
         </w:tc>
@@ -3414,28 +3321,14 @@
               <w:rPr>
                 <w:lang w:val="en-US"/>
               </w:rPr>
-              <w:t>index_to_</w:t>
-            </w:r>
-            <w:proofErr w:type="gramStart"/>
-            <w:r>
-              <w:rPr>
-                <w:lang w:val="en-US"/>
-              </w:rPr>
-              <w:t>symbol</w:t>
-            </w:r>
-            <w:proofErr w:type="spellEnd"/>
-            <w:r>
-              <w:rPr>
-                <w:lang w:val="en-US"/>
-              </w:rPr>
-              <w:t>(</w:t>
-            </w:r>
-            <w:proofErr w:type="gramEnd"/>
-            <w:r>
-              <w:rPr>
-                <w:lang w:val="en-US"/>
-              </w:rPr>
-              <w:t>int index, int k)</w:t>
+              <w:t>index_to_symbol</w:t>
+            </w:r>
+            <w:proofErr w:type="spellEnd"/>
+            <w:r>
+              <w:rPr>
+                <w:lang w:val="en-US"/>
+              </w:rPr>
+              <w:t>(int index, int k)</w:t>
             </w:r>
           </w:p>
         </w:tc>
@@ -3504,19 +3397,11 @@
             </w:pPr>
             <w:proofErr w:type="spellStart"/>
             <w:r>
-              <w:t>find_turn_</w:t>
-            </w:r>
-            <w:proofErr w:type="gramStart"/>
-            <w:r>
-              <w:t>symbols</w:t>
-            </w:r>
-            <w:proofErr w:type="spellEnd"/>
-            <w:r>
-              <w:t>(</w:t>
-            </w:r>
-            <w:proofErr w:type="gramEnd"/>
-            <w:r>
-              <w:t>)</w:t>
+              <w:t>find_turn_symbols</w:t>
+            </w:r>
+            <w:proofErr w:type="spellEnd"/>
+            <w:r>
+              <w:t>()</w:t>
             </w:r>
           </w:p>
         </w:tc>
@@ -3599,28 +3484,14 @@
               <w:rPr>
                 <w:lang w:val="en-US"/>
               </w:rPr>
-              <w:t>letter_is_</w:t>
-            </w:r>
-            <w:proofErr w:type="gramStart"/>
-            <w:r>
-              <w:rPr>
-                <w:lang w:val="en-US"/>
-              </w:rPr>
-              <w:t>allowed</w:t>
-            </w:r>
-            <w:proofErr w:type="spellEnd"/>
-            <w:r>
-              <w:rPr>
-                <w:lang w:val="en-US"/>
-              </w:rPr>
-              <w:t>(</w:t>
-            </w:r>
-            <w:proofErr w:type="gramEnd"/>
-            <w:r>
-              <w:rPr>
-                <w:lang w:val="en-US"/>
-              </w:rPr>
-              <w:t>char c)</w:t>
+              <w:t>letter_is_allowed</w:t>
+            </w:r>
+            <w:proofErr w:type="spellEnd"/>
+            <w:r>
+              <w:rPr>
+                <w:lang w:val="en-US"/>
+              </w:rPr>
+              <w:t>(char c)</w:t>
             </w:r>
           </w:p>
         </w:tc>
@@ -3689,19 +3560,11 @@
             </w:pPr>
             <w:proofErr w:type="spellStart"/>
             <w:r>
-              <w:t>number_of_loaded_</w:t>
-            </w:r>
-            <w:proofErr w:type="gramStart"/>
-            <w:r>
-              <w:t>words</w:t>
-            </w:r>
-            <w:proofErr w:type="spellEnd"/>
-            <w:r>
-              <w:t>(</w:t>
-            </w:r>
-            <w:proofErr w:type="gramEnd"/>
-            <w:r>
-              <w:t>)</w:t>
+              <w:t>number_of_loaded_words</w:t>
+            </w:r>
+            <w:proofErr w:type="spellEnd"/>
+            <w:r>
+              <w:t>()</w:t>
             </w:r>
           </w:p>
         </w:tc>
@@ -3762,18 +3625,13 @@
             </w:pPr>
             <w:proofErr w:type="spellStart"/>
             <w:r>
-              <w:t>put_</w:t>
-            </w:r>
-            <w:proofErr w:type="gramStart"/>
-            <w:r>
-              <w:t>point</w:t>
+              <w:t>put_point</w:t>
             </w:r>
             <w:proofErr w:type="spellEnd"/>
             <w:r>
               <w:t>(</w:t>
             </w:r>
             <w:proofErr w:type="spellStart"/>
-            <w:proofErr w:type="gramEnd"/>
             <w:r>
               <w:t>char</w:t>
             </w:r>
@@ -3848,18 +3706,13 @@
             </w:pPr>
             <w:proofErr w:type="spellStart"/>
             <w:r>
-              <w:t>print_</w:t>
-            </w:r>
-            <w:proofErr w:type="gramStart"/>
-            <w:r>
-              <w:t>count</w:t>
+              <w:t>print_count</w:t>
             </w:r>
             <w:proofErr w:type="spellEnd"/>
             <w:r>
               <w:t>(</w:t>
             </w:r>
             <w:proofErr w:type="spellStart"/>
-            <w:proofErr w:type="gramEnd"/>
             <w:r>
               <w:t>int</w:t>
             </w:r>
@@ -3934,19 +3787,11 @@
             </w:pPr>
             <w:proofErr w:type="spellStart"/>
             <w:r>
-              <w:t>back_</w:t>
-            </w:r>
-            <w:proofErr w:type="gramStart"/>
-            <w:r>
-              <w:t>n</w:t>
-            </w:r>
-            <w:proofErr w:type="spellEnd"/>
-            <w:r>
-              <w:t>(</w:t>
-            </w:r>
-            <w:proofErr w:type="gramEnd"/>
-            <w:r>
-              <w:t>)</w:t>
+              <w:t>back_n</w:t>
+            </w:r>
+            <w:proofErr w:type="spellEnd"/>
+            <w:r>
+              <w:t>()</w:t>
             </w:r>
           </w:p>
         </w:tc>
@@ -4006,18 +3851,13 @@
               <w:ind w:right="163"/>
             </w:pPr>
             <w:proofErr w:type="spellStart"/>
-            <w:proofErr w:type="gramStart"/>
             <w:r>
               <w:lastRenderedPageBreak/>
               <w:t>clear</w:t>
             </w:r>
             <w:proofErr w:type="spellEnd"/>
             <w:r>
-              <w:t>(</w:t>
-            </w:r>
-            <w:proofErr w:type="gramEnd"/>
-            <w:r>
-              <w:t>)</w:t>
+              <w:t>()</w:t>
             </w:r>
           </w:p>
         </w:tc>
@@ -4079,19 +3919,11 @@
                 <w:lang w:val="en-US"/>
               </w:rPr>
             </w:pPr>
-            <w:proofErr w:type="gramStart"/>
-            <w:r>
-              <w:rPr>
-                <w:lang w:val="en-US"/>
-              </w:rPr>
-              <w:t>info(</w:t>
-            </w:r>
-            <w:proofErr w:type="gramEnd"/>
-            <w:r>
-              <w:rPr>
-                <w:lang w:val="en-US"/>
-              </w:rPr>
-              <w:t xml:space="preserve">unsigned char* </w:t>
+            <w:r>
+              <w:rPr>
+                <w:lang w:val="en-US"/>
+              </w:rPr>
+              <w:t xml:space="preserve">info(unsigned char* </w:t>
             </w:r>
             <w:proofErr w:type="spellStart"/>
             <w:r>
@@ -4172,28 +4004,14 @@
               <w:rPr>
                 <w:lang w:val="en-US"/>
               </w:rPr>
-              <w:t>proverka_loop_</w:t>
-            </w:r>
-            <w:proofErr w:type="gramStart"/>
-            <w:r>
-              <w:rPr>
-                <w:lang w:val="en-US"/>
-              </w:rPr>
-              <w:t>bool</w:t>
-            </w:r>
-            <w:proofErr w:type="spellEnd"/>
-            <w:r>
-              <w:rPr>
-                <w:lang w:val="en-US"/>
-              </w:rPr>
-              <w:t>(</w:t>
-            </w:r>
-            <w:proofErr w:type="gramEnd"/>
-            <w:r>
-              <w:rPr>
-                <w:lang w:val="en-US"/>
-              </w:rPr>
-              <w:t>char* name)</w:t>
+              <w:t>proverka_loop_bool</w:t>
+            </w:r>
+            <w:proofErr w:type="spellEnd"/>
+            <w:r>
+              <w:rPr>
+                <w:lang w:val="en-US"/>
+              </w:rPr>
+              <w:t>(char* name)</w:t>
             </w:r>
           </w:p>
         </w:tc>
@@ -4262,18 +4080,13 @@
             </w:pPr>
             <w:proofErr w:type="spellStart"/>
             <w:r>
-              <w:t>strlen_</w:t>
-            </w:r>
-            <w:proofErr w:type="gramStart"/>
-            <w:r>
-              <w:t>s</w:t>
+              <w:t>strlen_s</w:t>
             </w:r>
             <w:proofErr w:type="spellEnd"/>
             <w:r>
               <w:t>(</w:t>
             </w:r>
             <w:proofErr w:type="spellStart"/>
-            <w:proofErr w:type="gramEnd"/>
             <w:r>
               <w:t>char</w:t>
             </w:r>
@@ -4347,17 +4160,12 @@
               <w:ind w:right="163"/>
             </w:pPr>
             <w:proofErr w:type="spellStart"/>
-            <w:proofErr w:type="gramStart"/>
             <w:r>
               <w:t>dictinfo</w:t>
             </w:r>
             <w:proofErr w:type="spellEnd"/>
             <w:r>
-              <w:t>(</w:t>
-            </w:r>
-            <w:proofErr w:type="gramEnd"/>
-            <w:r>
-              <w:t>)</w:t>
+              <w:t>()</w:t>
             </w:r>
           </w:p>
         </w:tc>
@@ -4424,28 +4232,14 @@
               <w:rPr>
                 <w:lang w:val="en-US"/>
               </w:rPr>
-              <w:t>starts_with_</w:t>
-            </w:r>
-            <w:proofErr w:type="gramStart"/>
-            <w:r>
-              <w:rPr>
-                <w:lang w:val="en-US"/>
-              </w:rPr>
-              <w:t>translate</w:t>
-            </w:r>
-            <w:proofErr w:type="spellEnd"/>
-            <w:r>
-              <w:rPr>
-                <w:lang w:val="en-US"/>
-              </w:rPr>
-              <w:t>(</w:t>
-            </w:r>
-            <w:proofErr w:type="gramEnd"/>
-            <w:r>
-              <w:rPr>
-                <w:lang w:val="en-US"/>
-              </w:rPr>
-              <w:t>char* first)</w:t>
+              <w:t>starts_with_translate</w:t>
+            </w:r>
+            <w:proofErr w:type="spellEnd"/>
+            <w:r>
+              <w:rPr>
+                <w:lang w:val="en-US"/>
+              </w:rPr>
+              <w:t>(char* first)</w:t>
             </w:r>
           </w:p>
         </w:tc>
@@ -4514,18 +4308,13 @@
             </w:pPr>
             <w:proofErr w:type="spellStart"/>
             <w:r>
-              <w:t>binary_</w:t>
-            </w:r>
-            <w:proofErr w:type="gramStart"/>
-            <w:r>
-              <w:t>search</w:t>
+              <w:t>binary_search</w:t>
             </w:r>
             <w:proofErr w:type="spellEnd"/>
             <w:r>
               <w:t>(</w:t>
             </w:r>
             <w:proofErr w:type="spellStart"/>
-            <w:proofErr w:type="gramEnd"/>
             <w:r>
               <w:t>char</w:t>
             </w:r>
@@ -4607,7 +4396,6 @@
               <w:ind w:right="163"/>
             </w:pPr>
             <w:proofErr w:type="spellStart"/>
-            <w:proofErr w:type="gramStart"/>
             <w:r>
               <w:t>translate</w:t>
             </w:r>
@@ -4616,7 +4404,6 @@
               <w:t>(</w:t>
             </w:r>
             <w:proofErr w:type="spellStart"/>
-            <w:proofErr w:type="gramEnd"/>
             <w:r>
               <w:t>char</w:t>
             </w:r>
@@ -4697,28 +4484,14 @@
               <w:rPr>
                 <w:lang w:val="en-US"/>
               </w:rPr>
-              <w:t>starts_with_</w:t>
-            </w:r>
-            <w:proofErr w:type="gramStart"/>
-            <w:r>
-              <w:rPr>
-                <w:lang w:val="en-US"/>
-              </w:rPr>
-              <w:t>wordstat</w:t>
-            </w:r>
-            <w:proofErr w:type="spellEnd"/>
-            <w:r>
-              <w:rPr>
-                <w:lang w:val="en-US"/>
-              </w:rPr>
-              <w:t>(</w:t>
-            </w:r>
-            <w:proofErr w:type="gramEnd"/>
-            <w:r>
-              <w:rPr>
-                <w:lang w:val="en-US"/>
-              </w:rPr>
-              <w:t>char* first)</w:t>
+              <w:t>starts_with_wordstat</w:t>
+            </w:r>
+            <w:proofErr w:type="spellEnd"/>
+            <w:r>
+              <w:rPr>
+                <w:lang w:val="en-US"/>
+              </w:rPr>
+              <w:t>(char* first)</w:t>
             </w:r>
           </w:p>
         </w:tc>
@@ -4786,7 +4559,6 @@
               <w:ind w:right="163"/>
             </w:pPr>
             <w:proofErr w:type="spellStart"/>
-            <w:proofErr w:type="gramStart"/>
             <w:r>
               <w:lastRenderedPageBreak/>
               <w:t>wordstat</w:t>
@@ -4796,7 +4568,6 @@
               <w:t>(</w:t>
             </w:r>
             <w:proofErr w:type="spellStart"/>
-            <w:proofErr w:type="gramEnd"/>
             <w:r>
               <w:t>char</w:t>
             </w:r>
@@ -4870,17 +4641,12 @@
               <w:ind w:right="163"/>
             </w:pPr>
             <w:proofErr w:type="spellStart"/>
-            <w:proofErr w:type="gramStart"/>
             <w:r>
               <w:t>shutdown</w:t>
             </w:r>
             <w:proofErr w:type="spellEnd"/>
             <w:r>
-              <w:t>(</w:t>
-            </w:r>
-            <w:proofErr w:type="gramEnd"/>
-            <w:r>
-              <w:t>)</w:t>
+              <w:t>()</w:t>
             </w:r>
           </w:p>
         </w:tc>
@@ -4941,19 +4707,11 @@
             </w:pPr>
             <w:proofErr w:type="spellStart"/>
             <w:r>
-              <w:t>timer_</w:t>
-            </w:r>
-            <w:proofErr w:type="gramStart"/>
-            <w:r>
-              <w:t>handler</w:t>
-            </w:r>
-            <w:proofErr w:type="spellEnd"/>
-            <w:r>
-              <w:t>(</w:t>
-            </w:r>
-            <w:proofErr w:type="gramEnd"/>
-            <w:r>
-              <w:t>)</w:t>
+              <w:t>timer_handler</w:t>
+            </w:r>
+            <w:proofErr w:type="spellEnd"/>
+            <w:r>
+              <w:t>()</w:t>
             </w:r>
           </w:p>
         </w:tc>
@@ -5021,7 +4779,6 @@
               <w:ind w:right="163"/>
             </w:pPr>
             <w:proofErr w:type="spellStart"/>
-            <w:proofErr w:type="gramStart"/>
             <w:r>
               <w:t>lkg</w:t>
             </w:r>
@@ -5030,7 +4787,6 @@
               <w:t>(</w:t>
             </w:r>
             <w:proofErr w:type="spellStart"/>
-            <w:proofErr w:type="gramEnd"/>
             <w:r>
               <w:t>int</w:t>
             </w:r>
@@ -5119,28 +4875,14 @@
               <w:rPr>
                 <w:lang w:val="en-US"/>
               </w:rPr>
-              <w:t>starts_with_</w:t>
-            </w:r>
-            <w:proofErr w:type="gramStart"/>
-            <w:r>
-              <w:rPr>
-                <w:lang w:val="en-US"/>
-              </w:rPr>
-              <w:t>anyword</w:t>
-            </w:r>
-            <w:proofErr w:type="spellEnd"/>
-            <w:r>
-              <w:rPr>
-                <w:lang w:val="en-US"/>
-              </w:rPr>
-              <w:t>(</w:t>
-            </w:r>
-            <w:proofErr w:type="gramEnd"/>
-            <w:r>
-              <w:rPr>
-                <w:lang w:val="en-US"/>
-              </w:rPr>
-              <w:t>char* first)</w:t>
+              <w:t>starts_with_anyword</w:t>
+            </w:r>
+            <w:proofErr w:type="spellEnd"/>
+            <w:r>
+              <w:rPr>
+                <w:lang w:val="en-US"/>
+              </w:rPr>
+              <w:t>(char* first)</w:t>
             </w:r>
           </w:p>
         </w:tc>
@@ -5208,7 +4950,6 @@
               <w:ind w:right="163"/>
             </w:pPr>
             <w:proofErr w:type="spellStart"/>
-            <w:proofErr w:type="gramStart"/>
             <w:r>
               <w:t>anyword</w:t>
             </w:r>
@@ -5217,7 +4958,6 @@
               <w:t>(</w:t>
             </w:r>
             <w:proofErr w:type="spellStart"/>
-            <w:proofErr w:type="gramEnd"/>
             <w:r>
               <w:t>char</w:t>
             </w:r>
@@ -5298,28 +5038,14 @@
               <w:rPr>
                 <w:lang w:val="en-US"/>
               </w:rPr>
-              <w:t>inf_loop_</w:t>
-            </w:r>
-            <w:proofErr w:type="gramStart"/>
-            <w:r>
-              <w:rPr>
-                <w:lang w:val="en-US"/>
-              </w:rPr>
-              <w:t>str</w:t>
-            </w:r>
-            <w:proofErr w:type="spellEnd"/>
-            <w:r>
-              <w:rPr>
-                <w:lang w:val="en-US"/>
-              </w:rPr>
-              <w:t>(</w:t>
-            </w:r>
-            <w:proofErr w:type="gramEnd"/>
-            <w:r>
-              <w:rPr>
-                <w:lang w:val="en-US"/>
-              </w:rPr>
-              <w:t>char* name)</w:t>
+              <w:t>inf_loop_str</w:t>
+            </w:r>
+            <w:proofErr w:type="spellEnd"/>
+            <w:r>
+              <w:rPr>
+                <w:lang w:val="en-US"/>
+              </w:rPr>
+              <w:t>(char* name)</w:t>
             </w:r>
           </w:p>
         </w:tc>
@@ -5390,7 +5116,6 @@
               </w:rPr>
             </w:pPr>
             <w:proofErr w:type="spellStart"/>
-            <w:proofErr w:type="gramStart"/>
             <w:r>
               <w:rPr>
                 <w:lang w:val="en-US"/>
@@ -5402,14 +5127,7 @@
               <w:rPr>
                 <w:lang w:val="en-US"/>
               </w:rPr>
-              <w:t>(</w:t>
-            </w:r>
-            <w:proofErr w:type="gramEnd"/>
-            <w:r>
-              <w:rPr>
-                <w:lang w:val="en-US"/>
-              </w:rPr>
-              <w:t xml:space="preserve">char* name, unsigned char* </w:t>
+              <w:t xml:space="preserve">(char* name, unsigned char* </w:t>
             </w:r>
             <w:proofErr w:type="spellStart"/>
             <w:r>
@@ -5596,9 +5314,855 @@
     <w:p>
       <w:pPr>
         <w:pStyle w:val="ac"/>
+        <w:numPr>
+          <w:ilvl w:val="1"/>
+          <w:numId w:val="8"/>
+        </w:numPr>
         <w:spacing w:before="183" w:line="309" w:lineRule="auto"/>
         <w:ind w:right="163"/>
-      </w:pPr>
+        <w:rPr>
+          <w:b/>
+          <w:bCs/>
+        </w:rPr>
+      </w:pPr>
+      <w:r>
+        <w:rPr>
+          <w:b/>
+          <w:bCs/>
+        </w:rPr>
+        <w:t>Тестирование</w:t>
+      </w:r>
+    </w:p>
+    <w:p>
+      <w:pPr>
+        <w:pStyle w:val="ac"/>
+        <w:spacing w:before="183" w:line="309" w:lineRule="auto"/>
+        <w:ind w:right="163"/>
+        <w:rPr>
+          <w:b/>
+          <w:bCs/>
+        </w:rPr>
+      </w:pPr>
+    </w:p>
+    <w:tbl>
+      <w:tblPr>
+        <w:tblStyle w:val="ae"/>
+        <w:tblW w:w="0" w:type="auto"/>
+        <w:tblInd w:w="360" w:type="dxa"/>
+        <w:tblLook w:val="04A0" w:firstRow="1" w:lastRow="0" w:firstColumn="1" w:lastColumn="0" w:noHBand="0" w:noVBand="1"/>
+      </w:tblPr>
+      <w:tblGrid>
+        <w:gridCol w:w="4498"/>
+        <w:gridCol w:w="4487"/>
+      </w:tblGrid>
+      <w:tr>
+        <w:tc>
+          <w:tcPr>
+            <w:tcW w:w="4672" w:type="dxa"/>
+          </w:tcPr>
+          <w:p>
+            <w:pPr>
+              <w:pStyle w:val="ac"/>
+              <w:spacing w:before="183" w:line="309" w:lineRule="auto"/>
+              <w:ind w:right="163"/>
+              <w:rPr>
+                <w:lang w:val="en-US"/>
+              </w:rPr>
+            </w:pPr>
+            <w:r>
+              <w:rPr>
+                <w:lang w:val="en-US"/>
+              </w:rPr>
+              <w:t>info</w:t>
+            </w:r>
+          </w:p>
+          <w:p>
+            <w:pPr>
+              <w:pStyle w:val="ac"/>
+              <w:spacing w:before="183" w:line="309" w:lineRule="auto"/>
+              <w:ind w:right="163"/>
+              <w:rPr>
+                <w:lang w:val="en-US"/>
+              </w:rPr>
+            </w:pPr>
+            <w:r>
+              <w:rPr>
+                <w:lang w:val="en-US"/>
+              </w:rPr>
+              <w:t>info</w:t>
+            </w:r>
+          </w:p>
+          <w:p>
+            <w:pPr>
+              <w:pStyle w:val="ac"/>
+              <w:spacing w:before="183" w:line="309" w:lineRule="auto"/>
+              <w:ind w:right="163"/>
+              <w:rPr>
+                <w:lang w:val="en-US"/>
+              </w:rPr>
+            </w:pPr>
+            <w:r>
+              <w:rPr>
+                <w:lang w:val="en-US"/>
+              </w:rPr>
+              <w:t>info</w:t>
+            </w:r>
+          </w:p>
+          <w:p>
+            <w:pPr>
+              <w:pStyle w:val="ac"/>
+              <w:spacing w:before="183" w:line="309" w:lineRule="auto"/>
+              <w:ind w:right="163"/>
+              <w:rPr>
+                <w:lang w:val="en-US"/>
+              </w:rPr>
+            </w:pPr>
+            <w:r>
+              <w:rPr>
+                <w:lang w:val="en-US"/>
+              </w:rPr>
+              <w:t>info</w:t>
+            </w:r>
+          </w:p>
+        </w:tc>
+        <w:tc>
+          <w:tcPr>
+            <w:tcW w:w="4673" w:type="dxa"/>
+          </w:tcPr>
+          <w:p>
+            <w:pPr>
+              <w:pStyle w:val="ac"/>
+              <w:spacing w:before="183" w:line="309" w:lineRule="auto"/>
+              <w:ind w:right="163"/>
+            </w:pPr>
+            <w:r>
+              <w:t>Прокрутка + нет ошибок</w:t>
+            </w:r>
+          </w:p>
+        </w:tc>
+      </w:tr>
+      <w:tr>
+        <w:tc>
+          <w:tcPr>
+            <w:tcW w:w="4672" w:type="dxa"/>
+          </w:tcPr>
+          <w:p>
+            <w:pPr>
+              <w:pStyle w:val="ac"/>
+              <w:spacing w:before="183" w:line="309" w:lineRule="auto"/>
+              <w:ind w:right="163"/>
+              <w:rPr>
+                <w:lang w:val="en-US"/>
+              </w:rPr>
+            </w:pPr>
+            <w:r>
+              <w:rPr>
+                <w:lang w:val="en-US"/>
+              </w:rPr>
+              <w:t xml:space="preserve">translate kid </w:t>
+            </w:r>
+          </w:p>
+        </w:tc>
+        <w:tc>
+          <w:tcPr>
+            <w:tcW w:w="4673" w:type="dxa"/>
+          </w:tcPr>
+          <w:p>
+            <w:pPr>
+              <w:pStyle w:val="ac"/>
+              <w:spacing w:before="183" w:line="309" w:lineRule="auto"/>
+              <w:ind w:right="163"/>
+            </w:pPr>
+            <w:proofErr w:type="spellStart"/>
+            <w:r>
+              <w:t>niño</w:t>
+            </w:r>
+            <w:proofErr w:type="spellEnd"/>
+          </w:p>
+        </w:tc>
+      </w:tr>
+      <w:tr>
+        <w:tc>
+          <w:tcPr>
+            <w:tcW w:w="4672" w:type="dxa"/>
+          </w:tcPr>
+          <w:p>
+            <w:pPr>
+              <w:pStyle w:val="ac"/>
+              <w:spacing w:before="183" w:line="309" w:lineRule="auto"/>
+              <w:ind w:right="163"/>
+              <w:rPr>
+                <w:lang w:val="en-US"/>
+              </w:rPr>
+            </w:pPr>
+            <w:r>
+              <w:t>В загрузчике</w:t>
+            </w:r>
+            <w:r>
+              <w:rPr>
+                <w:lang w:val="en-US"/>
+              </w:rPr>
+              <w:t>: 12597!@#$%</w:t>
+            </w:r>
+          </w:p>
+        </w:tc>
+        <w:tc>
+          <w:tcPr>
+            <w:tcW w:w="4673" w:type="dxa"/>
+          </w:tcPr>
+          <w:p>
+            <w:pPr>
+              <w:pStyle w:val="ac"/>
+              <w:spacing w:before="183" w:line="309" w:lineRule="auto"/>
+              <w:ind w:right="163"/>
+              <w:rPr>
+                <w:lang w:val="en-US"/>
+              </w:rPr>
+            </w:pPr>
+            <w:r>
+              <w:rPr>
+                <w:lang w:val="en-US"/>
+              </w:rPr>
+              <w:t>Wrong key</w:t>
+            </w:r>
+          </w:p>
+        </w:tc>
+      </w:tr>
+      <w:tr>
+        <w:tc>
+          <w:tcPr>
+            <w:tcW w:w="4672" w:type="dxa"/>
+          </w:tcPr>
+          <w:p>
+            <w:pPr>
+              <w:pStyle w:val="ac"/>
+              <w:spacing w:before="183" w:line="309" w:lineRule="auto"/>
+              <w:ind w:right="163"/>
+              <w:rPr>
+                <w:lang w:val="en-US"/>
+              </w:rPr>
+            </w:pPr>
+            <w:r>
+              <w:rPr>
+                <w:lang w:val="en-US"/>
+              </w:rPr>
+              <w:t>ab</w:t>
+            </w:r>
+          </w:p>
+        </w:tc>
+        <w:tc>
+          <w:tcPr>
+            <w:tcW w:w="4673" w:type="dxa"/>
+          </w:tcPr>
+          <w:p>
+            <w:pPr>
+              <w:pStyle w:val="ac"/>
+              <w:spacing w:before="183" w:line="309" w:lineRule="auto"/>
+              <w:ind w:right="163"/>
+              <w:rPr>
+                <w:lang w:val="en-US"/>
+              </w:rPr>
+            </w:pPr>
+            <w:r>
+              <w:rPr>
+                <w:lang w:val="en-US"/>
+              </w:rPr>
+              <w:t>Not found</w:t>
+            </w:r>
+          </w:p>
+        </w:tc>
+      </w:tr>
+      <w:tr>
+        <w:tc>
+          <w:tcPr>
+            <w:tcW w:w="4672" w:type="dxa"/>
+          </w:tcPr>
+          <w:p>
+            <w:pPr>
+              <w:pStyle w:val="ac"/>
+              <w:spacing w:before="183" w:line="309" w:lineRule="auto"/>
+              <w:ind w:right="163"/>
+              <w:rPr>
+                <w:lang w:val="en-US"/>
+              </w:rPr>
+            </w:pPr>
+            <w:r>
+              <w:rPr>
+                <w:lang w:val="en-US"/>
+              </w:rPr>
+              <w:t xml:space="preserve">Translate </w:t>
+            </w:r>
+            <w:proofErr w:type="spellStart"/>
+            <w:r>
+              <w:rPr>
+                <w:lang w:val="en-US"/>
+              </w:rPr>
+              <w:t>hellllo</w:t>
+            </w:r>
+            <w:proofErr w:type="spellEnd"/>
+          </w:p>
+        </w:tc>
+        <w:tc>
+          <w:tcPr>
+            <w:tcW w:w="4673" w:type="dxa"/>
+          </w:tcPr>
+          <w:p>
+            <w:pPr>
+              <w:pStyle w:val="ac"/>
+              <w:spacing w:before="183" w:line="309" w:lineRule="auto"/>
+              <w:ind w:right="163"/>
+              <w:rPr>
+                <w:lang w:val="en-US"/>
+              </w:rPr>
+            </w:pPr>
+            <w:r>
+              <w:rPr>
+                <w:lang w:val="en-US"/>
+              </w:rPr>
+              <w:t>Letter: ‘h’ is not loaded</w:t>
+            </w:r>
+          </w:p>
+        </w:tc>
+      </w:tr>
+      <w:tr>
+        <w:tc>
+          <w:tcPr>
+            <w:tcW w:w="4672" w:type="dxa"/>
+          </w:tcPr>
+          <w:p>
+            <w:pPr>
+              <w:pStyle w:val="ac"/>
+              <w:spacing w:before="183" w:line="309" w:lineRule="auto"/>
+              <w:ind w:right="163"/>
+              <w:rPr>
+                <w:lang w:val="en-US"/>
+              </w:rPr>
+            </w:pPr>
+            <w:proofErr w:type="spellStart"/>
+            <w:r>
+              <w:rPr>
+                <w:lang w:val="en-US"/>
+              </w:rPr>
+              <w:t>Wordstat</w:t>
+            </w:r>
+            <w:proofErr w:type="spellEnd"/>
+            <w:r>
+              <w:rPr>
+                <w:lang w:val="en-US"/>
+              </w:rPr>
+              <w:t xml:space="preserve"> h</w:t>
+            </w:r>
+          </w:p>
+        </w:tc>
+        <w:tc>
+          <w:tcPr>
+            <w:tcW w:w="4673" w:type="dxa"/>
+          </w:tcPr>
+          <w:p>
+            <w:pPr>
+              <w:pStyle w:val="ac"/>
+              <w:spacing w:before="183" w:line="309" w:lineRule="auto"/>
+              <w:ind w:right="163"/>
+              <w:rPr>
+                <w:b/>
+                <w:bCs/>
+                <w:lang w:val="en-US"/>
+              </w:rPr>
+            </w:pPr>
+            <w:r>
+              <w:rPr>
+                <w:lang w:val="en-US"/>
+              </w:rPr>
+              <w:t>Letter: ‘h’ is not loaded</w:t>
+            </w:r>
+          </w:p>
+        </w:tc>
+      </w:tr>
+      <w:tr>
+        <w:tc>
+          <w:tcPr>
+            <w:tcW w:w="4672" w:type="dxa"/>
+          </w:tcPr>
+          <w:p>
+            <w:pPr>
+              <w:pStyle w:val="ac"/>
+              <w:spacing w:before="183" w:line="309" w:lineRule="auto"/>
+              <w:ind w:right="163"/>
+              <w:rPr>
+                <w:lang w:val="en-US"/>
+              </w:rPr>
+            </w:pPr>
+            <w:proofErr w:type="spellStart"/>
+            <w:r>
+              <w:rPr>
+                <w:lang w:val="en-US"/>
+              </w:rPr>
+              <w:t>anyword</w:t>
+            </w:r>
+            <w:proofErr w:type="spellEnd"/>
+            <w:r>
+              <w:rPr>
+                <w:lang w:val="en-US"/>
+              </w:rPr>
+              <w:t xml:space="preserve"> h</w:t>
+            </w:r>
+          </w:p>
+        </w:tc>
+        <w:tc>
+          <w:tcPr>
+            <w:tcW w:w="4673" w:type="dxa"/>
+          </w:tcPr>
+          <w:p>
+            <w:pPr>
+              <w:pStyle w:val="ac"/>
+              <w:spacing w:before="183" w:line="309" w:lineRule="auto"/>
+              <w:ind w:right="163"/>
+              <w:rPr>
+                <w:lang w:val="en-US"/>
+              </w:rPr>
+            </w:pPr>
+            <w:r>
+              <w:rPr>
+                <w:lang w:val="en-US"/>
+              </w:rPr>
+              <w:t xml:space="preserve">Error: no words </w:t>
+            </w:r>
+          </w:p>
+        </w:tc>
+      </w:tr>
+      <w:tr>
+        <w:tc>
+          <w:tcPr>
+            <w:tcW w:w="4672" w:type="dxa"/>
+          </w:tcPr>
+          <w:p>
+            <w:pPr>
+              <w:pStyle w:val="ac"/>
+              <w:spacing w:before="183" w:line="309" w:lineRule="auto"/>
+              <w:ind w:right="163"/>
+              <w:rPr>
+                <w:lang w:val="en-US"/>
+              </w:rPr>
+            </w:pPr>
+            <w:proofErr w:type="spellStart"/>
+            <w:r>
+              <w:rPr>
+                <w:lang w:val="en-US"/>
+              </w:rPr>
+              <w:t>a</w:t>
+            </w:r>
+            <w:r>
+              <w:rPr>
+                <w:lang w:val="en-US"/>
+              </w:rPr>
+              <w:t>nyword</w:t>
+            </w:r>
+            <w:proofErr w:type="spellEnd"/>
+            <w:r>
+              <w:rPr>
+                <w:lang w:val="en-US"/>
+              </w:rPr>
+              <w:t xml:space="preserve"> b</w:t>
+            </w:r>
+          </w:p>
+        </w:tc>
+        <w:tc>
+          <w:tcPr>
+            <w:tcW w:w="4673" w:type="dxa"/>
+          </w:tcPr>
+          <w:p>
+            <w:pPr>
+              <w:pStyle w:val="ac"/>
+              <w:spacing w:before="183" w:line="309" w:lineRule="auto"/>
+              <w:ind w:right="163"/>
+              <w:rPr>
+                <w:lang w:val="en-US"/>
+              </w:rPr>
+            </w:pPr>
+            <w:proofErr w:type="spellStart"/>
+            <w:r>
+              <w:t>c</w:t>
+            </w:r>
+            <w:r>
+              <w:t>лучайное</w:t>
+            </w:r>
+            <w:proofErr w:type="spellEnd"/>
+            <w:r>
+              <w:t xml:space="preserve"> слово на </w:t>
+            </w:r>
+            <w:r>
+              <w:rPr>
+                <w:lang w:val="en-US"/>
+              </w:rPr>
+              <w:t>b</w:t>
+            </w:r>
+          </w:p>
+        </w:tc>
+      </w:tr>
+      <w:tr>
+        <w:tc>
+          <w:tcPr>
+            <w:tcW w:w="4672" w:type="dxa"/>
+          </w:tcPr>
+          <w:p>
+            <w:pPr>
+              <w:pStyle w:val="ac"/>
+              <w:spacing w:before="183" w:line="309" w:lineRule="auto"/>
+              <w:ind w:right="163"/>
+              <w:rPr>
+                <w:lang w:val="en-US"/>
+              </w:rPr>
+            </w:pPr>
+            <w:r>
+              <w:rPr>
+                <w:lang w:val="en-US"/>
+              </w:rPr>
+              <w:t>s</w:t>
+            </w:r>
+            <w:r>
+              <w:rPr>
+                <w:lang w:val="en-US"/>
+              </w:rPr>
+              <w:t xml:space="preserve">hutdown </w:t>
+            </w:r>
+            <w:proofErr w:type="spellStart"/>
+            <w:r>
+              <w:rPr>
+                <w:lang w:val="en-US"/>
+              </w:rPr>
+              <w:t>bbb</w:t>
+            </w:r>
+            <w:proofErr w:type="spellEnd"/>
+          </w:p>
+        </w:tc>
+        <w:tc>
+          <w:tcPr>
+            <w:tcW w:w="4673" w:type="dxa"/>
+          </w:tcPr>
+          <w:p>
+            <w:pPr>
+              <w:pStyle w:val="ac"/>
+              <w:spacing w:before="183" w:line="309" w:lineRule="auto"/>
+              <w:ind w:right="163"/>
+              <w:rPr>
+                <w:lang w:val="en-US"/>
+              </w:rPr>
+            </w:pPr>
+            <w:r>
+              <w:rPr>
+                <w:lang w:val="en-US"/>
+              </w:rPr>
+              <w:t>Not found</w:t>
+            </w:r>
+          </w:p>
+        </w:tc>
+      </w:tr>
+      <w:tr>
+        <w:tc>
+          <w:tcPr>
+            <w:tcW w:w="4672" w:type="dxa"/>
+          </w:tcPr>
+          <w:p>
+            <w:pPr>
+              <w:pStyle w:val="ac"/>
+              <w:spacing w:before="183" w:line="309" w:lineRule="auto"/>
+              <w:ind w:right="163"/>
+              <w:rPr>
+                <w:lang w:val="en-US"/>
+              </w:rPr>
+            </w:pPr>
+            <w:r>
+              <w:rPr>
+                <w:lang w:val="en-US"/>
+              </w:rPr>
+              <w:t>shutdown</w:t>
+            </w:r>
+          </w:p>
+        </w:tc>
+        <w:tc>
+          <w:tcPr>
+            <w:tcW w:w="4673" w:type="dxa"/>
+          </w:tcPr>
+          <w:p>
+            <w:pPr>
+              <w:pStyle w:val="ac"/>
+              <w:spacing w:before="183" w:line="309" w:lineRule="auto"/>
+              <w:ind w:right="163"/>
+            </w:pPr>
+            <w:r>
+              <w:t>выключение</w:t>
+            </w:r>
+          </w:p>
+        </w:tc>
+      </w:tr>
+      <w:tr>
+        <w:tc>
+          <w:tcPr>
+            <w:tcW w:w="4672" w:type="dxa"/>
+          </w:tcPr>
+          <w:p>
+            <w:pPr>
+              <w:pStyle w:val="ac"/>
+              <w:spacing w:before="183" w:line="309" w:lineRule="auto"/>
+              <w:ind w:right="163"/>
+            </w:pPr>
+            <w:r>
+              <w:t>п</w:t>
+            </w:r>
+            <w:r>
+              <w:t>ереполнение загрузчика</w:t>
+            </w:r>
+          </w:p>
+        </w:tc>
+        <w:tc>
+          <w:tcPr>
+            <w:tcW w:w="4673" w:type="dxa"/>
+          </w:tcPr>
+          <w:p>
+            <w:pPr>
+              <w:pStyle w:val="ac"/>
+              <w:spacing w:before="183" w:line="309" w:lineRule="auto"/>
+              <w:ind w:right="163"/>
+            </w:pPr>
+            <w:proofErr w:type="spellStart"/>
+            <w:r>
+              <w:t>скролл</w:t>
+            </w:r>
+            <w:proofErr w:type="spellEnd"/>
+          </w:p>
+        </w:tc>
+      </w:tr>
+      <w:tr>
+        <w:tc>
+          <w:tcPr>
+            <w:tcW w:w="4672" w:type="dxa"/>
+          </w:tcPr>
+          <w:p>
+            <w:pPr>
+              <w:pStyle w:val="ac"/>
+              <w:spacing w:before="183" w:line="309" w:lineRule="auto"/>
+              <w:ind w:right="163"/>
+            </w:pPr>
+            <w:r>
+              <w:t>переполнение ядра</w:t>
+            </w:r>
+          </w:p>
+        </w:tc>
+        <w:tc>
+          <w:tcPr>
+            <w:tcW w:w="4673" w:type="dxa"/>
+          </w:tcPr>
+          <w:p>
+            <w:pPr>
+              <w:pStyle w:val="ac"/>
+              <w:spacing w:before="183" w:line="309" w:lineRule="auto"/>
+              <w:ind w:right="163"/>
+            </w:pPr>
+            <w:proofErr w:type="spellStart"/>
+            <w:r>
+              <w:t>скролл</w:t>
+            </w:r>
+            <w:proofErr w:type="spellEnd"/>
+          </w:p>
+        </w:tc>
+      </w:tr>
+      <w:tr>
+        <w:tc>
+          <w:tcPr>
+            <w:tcW w:w="4672" w:type="dxa"/>
+          </w:tcPr>
+          <w:p>
+            <w:pPr>
+              <w:pStyle w:val="ac"/>
+              <w:spacing w:before="183" w:line="309" w:lineRule="auto"/>
+              <w:ind w:right="163"/>
+            </w:pPr>
+            <w:r>
+              <w:t xml:space="preserve">Нажатие </w:t>
+            </w:r>
+            <w:r>
+              <w:rPr>
+                <w:lang w:val="en-US"/>
+              </w:rPr>
+              <w:t xml:space="preserve">backspace </w:t>
+            </w:r>
+            <w:r>
+              <w:t>в ядре</w:t>
+            </w:r>
+          </w:p>
+        </w:tc>
+        <w:tc>
+          <w:tcPr>
+            <w:tcW w:w="4673" w:type="dxa"/>
+          </w:tcPr>
+          <w:p>
+            <w:pPr>
+              <w:pStyle w:val="ac"/>
+              <w:spacing w:before="183" w:line="309" w:lineRule="auto"/>
+              <w:ind w:right="163"/>
+            </w:pPr>
+            <w:r>
+              <w:t>Удаление символа</w:t>
+            </w:r>
+          </w:p>
+        </w:tc>
+      </w:tr>
+      <w:tr>
+        <w:tc>
+          <w:tcPr>
+            <w:tcW w:w="4672" w:type="dxa"/>
+          </w:tcPr>
+          <w:p>
+            <w:pPr>
+              <w:pStyle w:val="ac"/>
+              <w:spacing w:before="183" w:line="309" w:lineRule="auto"/>
+              <w:ind w:right="163"/>
+            </w:pPr>
+            <w:r>
+              <w:t xml:space="preserve">Нажатие </w:t>
+            </w:r>
+            <w:r>
+              <w:rPr>
+                <w:lang w:val="en-US"/>
+              </w:rPr>
+              <w:t xml:space="preserve">backspace </w:t>
+            </w:r>
+            <w:r>
+              <w:t>в загрузчике</w:t>
+            </w:r>
+          </w:p>
+        </w:tc>
+        <w:tc>
+          <w:tcPr>
+            <w:tcW w:w="4673" w:type="dxa"/>
+          </w:tcPr>
+          <w:p>
+            <w:pPr>
+              <w:pStyle w:val="ac"/>
+              <w:spacing w:before="183" w:line="309" w:lineRule="auto"/>
+              <w:ind w:right="163"/>
+              <w:rPr>
+                <w:lang w:val="en-US"/>
+              </w:rPr>
+            </w:pPr>
+            <w:r>
+              <w:rPr>
+                <w:lang w:val="en-US"/>
+              </w:rPr>
+              <w:t>Wrong key</w:t>
+            </w:r>
+          </w:p>
+        </w:tc>
+      </w:tr>
+      <w:tr>
+        <w:tc>
+          <w:tcPr>
+            <w:tcW w:w="4672" w:type="dxa"/>
+          </w:tcPr>
+          <w:p>
+            <w:pPr>
+              <w:pStyle w:val="ac"/>
+              <w:spacing w:before="183" w:line="309" w:lineRule="auto"/>
+              <w:ind w:right="163"/>
+              <w:rPr>
+                <w:lang w:val="en-US"/>
+              </w:rPr>
+            </w:pPr>
+            <w:r>
+              <w:rPr>
+                <w:lang w:val="en-US"/>
+              </w:rPr>
+              <w:t xml:space="preserve">Translate 1 </w:t>
+            </w:r>
+          </w:p>
+        </w:tc>
+        <w:tc>
+          <w:tcPr>
+            <w:tcW w:w="4673" w:type="dxa"/>
+          </w:tcPr>
+          <w:p>
+            <w:pPr>
+              <w:pStyle w:val="ac"/>
+              <w:spacing w:before="183" w:line="309" w:lineRule="auto"/>
+              <w:ind w:right="163"/>
+              <w:rPr>
+                <w:lang w:val="en-US"/>
+              </w:rPr>
+            </w:pPr>
+            <w:r>
+              <w:rPr>
+                <w:lang w:val="en-US"/>
+              </w:rPr>
+              <w:t>Letter ‘1’ is not loaded</w:t>
+            </w:r>
+          </w:p>
+        </w:tc>
+      </w:tr>
+    </w:tbl>
+    <w:p>
+      <w:pPr>
+        <w:pStyle w:val="ac"/>
+        <w:numPr>
+          <w:ilvl w:val="0"/>
+          <w:numId w:val="8"/>
+        </w:numPr>
+        <w:spacing w:before="183" w:line="309" w:lineRule="auto"/>
+        <w:ind w:right="163"/>
+        <w:rPr>
+          <w:b/>
+          <w:bCs/>
+          <w:sz w:val="32"/>
+          <w:szCs w:val="32"/>
+          <w:lang w:val="en-US"/>
+        </w:rPr>
+      </w:pPr>
+      <w:r>
+        <w:rPr>
+          <w:b/>
+          <w:bCs/>
+          <w:sz w:val="32"/>
+          <w:szCs w:val="32"/>
+        </w:rPr>
+        <w:lastRenderedPageBreak/>
+        <w:t xml:space="preserve">Вывод </w:t>
+      </w:r>
+    </w:p>
+    <w:p>
+      <w:pPr>
+        <w:pStyle w:val="ac"/>
+        <w:spacing w:before="183" w:line="309" w:lineRule="auto"/>
+        <w:ind w:right="163"/>
+        <w:rPr>
+          <w:bCs/>
+        </w:rPr>
+      </w:pPr>
+      <w:r>
+        <w:rPr>
+          <w:bCs/>
+        </w:rPr>
+        <w:t xml:space="preserve">В ходе работы был реализован загрузчик и ядро, согласно варианту. Операционная система </w:t>
+      </w:r>
+      <w:proofErr w:type="spellStart"/>
+      <w:r>
+        <w:rPr>
+          <w:bCs/>
+          <w:lang w:val="en-US"/>
+        </w:rPr>
+        <w:t>DictOS</w:t>
+      </w:r>
+      <w:proofErr w:type="spellEnd"/>
+      <w:r>
+        <w:rPr>
+          <w:bCs/>
+        </w:rPr>
+        <w:t xml:space="preserve"> </w:t>
+      </w:r>
+      <w:r>
+        <w:rPr>
+          <w:bCs/>
+        </w:rPr>
+        <w:t xml:space="preserve">полностью прошла тестирование. Необходимые функции были реализованы корректно. Составлена блок-схема загрузчика. </w:t>
+      </w:r>
     </w:p>
     <w:sectPr>
       <w:pgSz w:w="11906" w:h="16838"/>

</xml_diff>